<commit_message>
Remove extraneous GitHub mention from editor response callout in Point_by_Point_Response
</commit_message>
<xml_diff>
--- a/Point_by_Point_Response_to_Reviewers.docx
+++ b/Point_by_Point_Response_to_Reviewers.docx
@@ -173,16 +173,7 @@
                 <w:color w:val="000000"/>
                 <w:sz w:val="24"/>
               </w:rPr>
-              <w:t xml:space="preserve">Multilevel Determinants of Under-Five Child Undernutrition in Bangladesh: A Nationally Representative Cross-Sectional Study from the Bangladesh Demographic and </w:t>
-            </w:r>
-            <w:r>
-              <w:rPr>
-                <w:rFonts w:ascii="Times New Roman" w:hAnsi="Times New Roman"/>
-                <w:b/>
-                <w:color w:val="000000"/>
-                <w:sz w:val="24"/>
-              </w:rPr>
-              <w:t>Health Survey 2022</w:t>
+              <w:t>Multilevel Determinants of Under-Five Child Undernutrition in Bangladesh: A Nationally Representative Cross-Sectional Study from the Bangladesh Demographic and Health Survey 2022</w:t>
             </w:r>
           </w:p>
         </w:tc>
@@ -225,8 +216,9 @@
           <w:sz w:val="24"/>
           <w:szCs w:val="24"/>
         </w:rPr>
-        <w:t>We sincerely thank the Editorial Office and the three expert reviewers for their valuable feedback and constructive critiques on our manuscript (Manuscript ID: bmjph-2026-006</w:t>
+        <w:t xml:space="preserve">We sincerely thank the Editorial Office and the three expert reviewers for their valuable feedback and constructive critiques on our manuscript (Manuscript ID: bmjph-2026-006196), entitled “Multilevel Determinants of Under-Five Child Undernutrition in Bangladesh: A Nationally Representative Cross-Sectional Study from the Bangladesh Demographic and Health Survey 2022.” We have carefully considered all comments and executed a comprehensive revision to strengthen the manuscript's methodological rigor, analytical precision, and epidemiological interpretation. Detailed point-by-point responses, organized by reviewer and comment, </w:t>
       </w:r>
+      <w:proofErr w:type="gramStart"/>
       <w:r>
         <w:rPr>
           <w:rFonts w:ascii="Times New Roman" w:hAnsi="Times New Roman"/>
@@ -234,8 +226,9 @@
           <w:sz w:val="24"/>
           <w:szCs w:val="24"/>
         </w:rPr>
-        <w:t>196), entitled “Multilevel Determinants of Under-Five Child Undernutrition in Bangladesh: A Nationally Representative Cross-Sectional Study from the Bangladesh Demographic and Health Survey 2022.” We have carefully considered all comments and executed a co</w:t>
+        <w:t>are provided</w:t>
       </w:r>
+      <w:proofErr w:type="gramEnd"/>
       <w:r>
         <w:rPr>
           <w:rFonts w:ascii="Times New Roman" w:hAnsi="Times New Roman"/>
@@ -243,7 +236,7 @@
           <w:sz w:val="24"/>
           <w:szCs w:val="24"/>
         </w:rPr>
-        <w:t>mprehensive revision to strengthen the manuscript's methodological rigor, analytical precision, and epidemiological interpretation. Detailed point-by-point responses, organized by reviewer and comment, are provided in the tables below</w:t>
+        <w:t xml:space="preserve"> in the tables below</w:t>
       </w:r>
       <w:r>
         <w:rPr>
@@ -390,31 +383,61 @@
                 <w:szCs w:val="24"/>
               </w:rPr>
             </w:pPr>
-            <w:r/>
-            <w:r>
-              <w:rPr>
-                <w:rFonts w:ascii="Times New Roman" w:hAnsi="Times New Roman"/>
-                <w:b w:val="0"/>
-                <w:i w:val="0"/>
-                <w:color w:val="0070C0"/>
-                <w:sz w:val="24"/>
-              </w:rPr>
-              <w:t>We thank the Editor for this instruction. We have revised the manuscript title to explicitly incorporate the study design in strict compliance with BMJ Public Health formatting guidelines.</w:t>
+            <w:r>
+              <w:rPr>
+                <w:rFonts w:ascii="Times New Roman" w:hAnsi="Times New Roman"/>
+                <w:color w:val="0070C0"/>
+                <w:sz w:val="24"/>
+              </w:rPr>
+              <w:t xml:space="preserve">We thank the Editor for this instruction. We have revised the manuscript title </w:t>
+            </w:r>
+            <w:proofErr w:type="gramStart"/>
+            <w:r>
+              <w:rPr>
+                <w:rFonts w:ascii="Times New Roman" w:hAnsi="Times New Roman"/>
+                <w:color w:val="0070C0"/>
+                <w:sz w:val="24"/>
+              </w:rPr>
+              <w:t>to explicitly incorporate</w:t>
+            </w:r>
+            <w:proofErr w:type="gramEnd"/>
+            <w:r>
+              <w:rPr>
+                <w:rFonts w:ascii="Times New Roman" w:hAnsi="Times New Roman"/>
+                <w:color w:val="0070C0"/>
+                <w:sz w:val="24"/>
+              </w:rPr>
+              <w:t xml:space="preserve"> the study design in strict compliance with BMJ Public Health formatting guidelines.</w:t>
             </w:r>
           </w:p>
           <w:p>
-            <w:r>
-              <w:rPr>
-                <w:rFonts w:ascii="Times New Roman" w:hAnsi="Times New Roman"/>
-                <w:b w:val="0"/>
-                <w:i w:val="0"/>
-                <w:color w:val="0070C0"/>
-                <w:sz w:val="24"/>
-              </w:rPr>
-              <w:t>Revised Title: “Multilevel Determinants of Under-Five Child Undernutrition in Bangladesh: A Nationally Representative Cross-Sectional Study from the Bangladesh Demographic and Health Survey 2022.”</w:t>
-            </w:r>
+            <w:pPr>
+              <w:jc w:val="both"/>
+            </w:pPr>
+            <w:r>
+              <w:rPr>
+                <w:rFonts w:ascii="Times New Roman" w:hAnsi="Times New Roman"/>
+                <w:color w:val="0070C0"/>
+                <w:sz w:val="24"/>
+              </w:rPr>
+              <w:t xml:space="preserve">Revised Title: “Multilevel Determinants of Under-Five Child Undernutrition in Bangladesh: A Nationally Representative Cross-Sectional Study </w:t>
+            </w:r>
+            <w:r>
+              <w:rPr>
+                <w:rFonts w:ascii="Times New Roman" w:hAnsi="Times New Roman"/>
+                <w:color w:val="0070C0"/>
+                <w:sz w:val="24"/>
+              </w:rPr>
+              <w:t>from the Bangladesh Demographic and Health Survey 2022.”</w:t>
+            </w:r>
+            <w:bookmarkStart w:id="0" w:name="_GoBack"/>
+            <w:bookmarkEnd w:id="0"/>
           </w:p>
           <w:p>
+            <w:pPr>
+              <w:jc w:val="both"/>
+            </w:pPr>
+            <w:r/>
             <w:r>
               <w:rPr>
                 <w:rFonts w:ascii="Times New Roman" w:hAnsi="Times New Roman"/>
@@ -433,7 +456,7 @@
                 <w:color w:val="0070C0"/>
                 <w:sz w:val="24"/>
               </w:rPr>
-              <w:t>Title updated on Page 1, Lines 1–3; Abstract, Page 1, Lines 12–15; Manuscript Running Header; and GitHub repository.</w:t>
+              <w:t>Title updated on Page 1 (Lines 1–3), Abstract (Page 1, Lines 12–15), and Manuscript Running Header.</w:t>
             </w:r>
           </w:p>
         </w:tc>
@@ -493,8 +516,9 @@
                 <w:sz w:val="24"/>
                 <w:szCs w:val="24"/>
               </w:rPr>
-              <w:t xml:space="preserve">Please ensure you have indicated the </w:t>
-            </w:r>
+              <w:t xml:space="preserve">Please ensure you have indicated the page/line numbers of your manuscript where the relevant information </w:t>
+            </w:r>
+            <w:proofErr w:type="gramStart"/>
             <w:r>
               <w:rPr>
                 <w:rFonts w:ascii="Times New Roman" w:hAnsi="Times New Roman"/>
@@ -502,7 +526,17 @@
                 <w:sz w:val="24"/>
                 <w:szCs w:val="24"/>
               </w:rPr>
-              <w:t>page/line numbers of your manuscript where the relevant information can be found for all items from the STROBE checklist. Do not leave blanks and indicate any items that do not apply to your study design as 'Not Applicable'.</w:t>
+              <w:t>can be found</w:t>
+            </w:r>
+            <w:proofErr w:type="gramEnd"/>
+            <w:r>
+              <w:rPr>
+                <w:rFonts w:ascii="Times New Roman" w:hAnsi="Times New Roman"/>
+                <w:color w:val="000000"/>
+                <w:sz w:val="24"/>
+                <w:szCs w:val="24"/>
+              </w:rPr>
+              <w:t xml:space="preserve"> for all items from the STROBE checklist. Do not leave blanks and indicate any items that do not apply to your study design as 'Not Applicable'.</w:t>
             </w:r>
           </w:p>
         </w:tc>
@@ -545,28 +579,148 @@
                 <w:szCs w:val="24"/>
               </w:rPr>
             </w:pPr>
-            <w:r/>
-            <w:r>
-              <w:rPr>
-                <w:rFonts w:ascii="Times New Roman" w:hAnsi="Times New Roman"/>
-                <w:b w:val="0"/>
-                <w:i w:val="0"/>
-                <w:color w:val="0070C0"/>
-                <w:sz w:val="24"/>
-              </w:rPr>
-              <w:t>We have completed the official STROBE Statement checklist for cross-sectional studies in full. Every checklist item has been matched with exact section titles, page numbers, and continuous line numbers (Lines 1–617) from the revised marked manuscript. No items have been left blank, and non-applicable items (such as prospective trial registration or cohort follow-up) are clearly designated as 'Not Applicable' with methodological justifications.</w:t>
+            <w:r>
+              <w:rPr>
+                <w:rFonts w:ascii="Times New Roman" w:hAnsi="Times New Roman"/>
+                <w:color w:val="0070C0"/>
+                <w:sz w:val="24"/>
+              </w:rPr>
+              <w:t xml:space="preserve">We have completed the official STROBE Statement checklist for cross-sectional studies in full. Every checklist item </w:t>
+            </w:r>
+            <w:proofErr w:type="gramStart"/>
+            <w:r>
+              <w:rPr>
+                <w:rFonts w:ascii="Times New Roman" w:hAnsi="Times New Roman"/>
+                <w:color w:val="0070C0"/>
+                <w:sz w:val="24"/>
+              </w:rPr>
+              <w:t>has been matched</w:t>
+            </w:r>
+            <w:proofErr w:type="gramEnd"/>
+            <w:r>
+              <w:rPr>
+                <w:rFonts w:ascii="Times New Roman" w:hAnsi="Times New Roman"/>
+                <w:color w:val="0070C0"/>
+                <w:sz w:val="24"/>
+              </w:rPr>
+              <w:t xml:space="preserve"> with exact section titles, page numbers, and continuous line numbers (Lines 1–617) from the revised marked manuscript. No items </w:t>
+            </w:r>
+            <w:proofErr w:type="gramStart"/>
+            <w:r>
+              <w:rPr>
+                <w:rFonts w:ascii="Times New Roman" w:hAnsi="Times New Roman"/>
+                <w:color w:val="0070C0"/>
+                <w:sz w:val="24"/>
+              </w:rPr>
+              <w:t>have been left</w:t>
+            </w:r>
+            <w:proofErr w:type="gramEnd"/>
+            <w:r>
+              <w:rPr>
+                <w:rFonts w:ascii="Times New Roman" w:hAnsi="Times New Roman"/>
+                <w:color w:val="0070C0"/>
+                <w:sz w:val="24"/>
+              </w:rPr>
+              <w:t xml:space="preserve"> blank, and </w:t>
+            </w:r>
+            <w:r>
+              <w:rPr>
+                <w:rFonts w:ascii="Times New Roman" w:hAnsi="Times New Roman"/>
+                <w:color w:val="0070C0"/>
+                <w:sz w:val="24"/>
+              </w:rPr>
+              <w:lastRenderedPageBreak/>
+              <w:t>non-applicable items (such as prospective trial registration or cohort follow-up) are clearly designated as 'Not Applicable' with methodological justifications.</w:t>
             </w:r>
           </w:p>
           <w:p>
             <w:r>
               <w:rPr>
                 <w:rFonts w:ascii="Times New Roman" w:hAnsi="Times New Roman"/>
-                <w:b w:val="0"/>
-                <w:i w:val="0"/>
-                <w:color w:val="0070C0"/>
-                <w:sz w:val="24"/>
-              </w:rPr>
-              <w:t>1. von Elm E, Altman DG, Egger M, Pocock SJ, Gøtzsche PC, Vandenbroucke JP. The Strengthening the Reporting of Observational Studies in Epidemiology (STROBE) statement: Guidelines for reporting observational studies. The Lancet. 2007;370(9596):1453–1457.</w:t>
+                <w:color w:val="0070C0"/>
+                <w:sz w:val="24"/>
+              </w:rPr>
+              <w:t xml:space="preserve">1. von Elm E, Altman DG, Egger M, </w:t>
+            </w:r>
+            <w:proofErr w:type="spellStart"/>
+            <w:r>
+              <w:rPr>
+                <w:rFonts w:ascii="Times New Roman" w:hAnsi="Times New Roman"/>
+                <w:color w:val="0070C0"/>
+                <w:sz w:val="24"/>
+              </w:rPr>
+              <w:t>Pocock</w:t>
+            </w:r>
+            <w:proofErr w:type="spellEnd"/>
+            <w:r>
+              <w:rPr>
+                <w:rFonts w:ascii="Times New Roman" w:hAnsi="Times New Roman"/>
+                <w:color w:val="0070C0"/>
+                <w:sz w:val="24"/>
+              </w:rPr>
+              <w:t xml:space="preserve"> SJ, </w:t>
+            </w:r>
+            <w:proofErr w:type="spellStart"/>
+            <w:r>
+              <w:rPr>
+                <w:rFonts w:ascii="Times New Roman" w:hAnsi="Times New Roman"/>
+                <w:color w:val="0070C0"/>
+                <w:sz w:val="24"/>
+              </w:rPr>
+              <w:t>Gøtzsche</w:t>
+            </w:r>
+            <w:proofErr w:type="spellEnd"/>
+            <w:r>
+              <w:rPr>
+                <w:rFonts w:ascii="Times New Roman" w:hAnsi="Times New Roman"/>
+                <w:color w:val="0070C0"/>
+                <w:sz w:val="24"/>
+              </w:rPr>
+              <w:t xml:space="preserve"> PC</w:t>
+            </w:r>
+            <w:r>
+              <w:rPr>
+                <w:rFonts w:ascii="Times New Roman" w:hAnsi="Times New Roman"/>
+                <w:color w:val="0070C0"/>
+                <w:sz w:val="24"/>
+              </w:rPr>
+              <w:t xml:space="preserve">, </w:t>
+            </w:r>
+            <w:proofErr w:type="spellStart"/>
+            <w:r>
+              <w:rPr>
+                <w:rFonts w:ascii="Times New Roman" w:hAnsi="Times New Roman"/>
+                <w:color w:val="0070C0"/>
+                <w:sz w:val="24"/>
+              </w:rPr>
+              <w:t>Vandenbroucke</w:t>
+            </w:r>
+            <w:proofErr w:type="spellEnd"/>
+            <w:r>
+              <w:rPr>
+                <w:rFonts w:ascii="Times New Roman" w:hAnsi="Times New Roman"/>
+                <w:color w:val="0070C0"/>
+                <w:sz w:val="24"/>
+              </w:rPr>
+              <w:t xml:space="preserve"> JP. The Strengthening the Reporting of Observational Studies in Epidemiology (STROBE) statement: Guidelines for reporting observational studies. The Lancet. 2007</w:t>
+            </w:r>
+            <w:proofErr w:type="gramStart"/>
+            <w:r>
+              <w:rPr>
+                <w:rFonts w:ascii="Times New Roman" w:hAnsi="Times New Roman"/>
+                <w:color w:val="0070C0"/>
+                <w:sz w:val="24"/>
+              </w:rPr>
+              <w:t>;370</w:t>
+            </w:r>
+            <w:proofErr w:type="gramEnd"/>
+            <w:r>
+              <w:rPr>
+                <w:rFonts w:ascii="Times New Roman" w:hAnsi="Times New Roman"/>
+                <w:color w:val="0070C0"/>
+                <w:sz w:val="24"/>
+              </w:rPr>
+              <w:t>(9596):1453–1457.</w:t>
             </w:r>
           </w:p>
           <w:p>
@@ -583,12 +737,20 @@
             <w:r>
               <w:rPr>
                 <w:rFonts w:ascii="Times New Roman" w:hAnsi="Times New Roman"/>
-                <w:b w:val="0"/>
                 <w:i/>
                 <w:color w:val="0070C0"/>
                 <w:sz w:val="24"/>
               </w:rPr>
-              <w:t>Uploaded as a dedicated supplementary document: 'Supplementary File 1_STROBE_Checklist_Cross_Sectional.docx' (with continuous line numbers mapped across all 22 checklist items) and cited in Section 2.1 (Page 5, Lines 156–158).</w:t>
+              <w:t xml:space="preserve">Uploaded as a dedicated </w:t>
+            </w:r>
+            <w:r>
+              <w:rPr>
+                <w:rFonts w:ascii="Times New Roman" w:hAnsi="Times New Roman"/>
+                <w:i/>
+                <w:color w:val="0070C0"/>
+                <w:sz w:val="24"/>
+              </w:rPr>
+              <w:t>supplementary document: 'Supplementary File 1_STROBE_Checklist_Cross_Sectional.docx' (with continuous line numbers mapped across all 22 checklist items) and cited in Section 2.1 (Page 5, Lines 156–158).</w:t>
             </w:r>
           </w:p>
         </w:tc>
@@ -692,16 +854,49 @@
                 <w:szCs w:val="24"/>
               </w:rPr>
             </w:pPr>
-            <w:r/>
-            <w:r>
-              <w:rPr>
-                <w:rFonts w:ascii="Times New Roman" w:hAnsi="Times New Roman"/>
-                <w:b w:val="0"/>
-                <w:i w:val="0"/>
-                <w:color w:val="0070C0"/>
-                <w:sz w:val="24"/>
-              </w:rPr>
-              <w:t>We have expanded Section 2.1 ('Study Design, Sampling, and Analytical Sample') to detail the complete sample selection cascade. Specifically, we explicitly report that from the 8,784 live births occurring in the five years preceding the survey, 276 deceased children were excluded, and 4,421 children who were absent or not subsampled for anthropometry were excluded. The remaining children were screened for biological plausibility using WHO flags (|HAZ| ≤ 6, |WHZ| ≤ 5, |WAZ| ≤ 5), resulting in a verified, complete-case analytical sample of 4,087 children aged 0–59 months nested within 3,474 households across 670 community clusters. A formal STROBE participant selection flow diagram has also been added as Figure 2.</w:t>
+            <w:r>
+              <w:rPr>
+                <w:rFonts w:ascii="Times New Roman" w:hAnsi="Times New Roman"/>
+                <w:color w:val="0070C0"/>
+                <w:sz w:val="24"/>
+              </w:rPr>
+              <w:t xml:space="preserve">We have expanded Section 2.1 ('Study Design, Sampling, and Analytical Sample') to detail the complete sample selection cascade. Specifically, we explicitly report that from the 8,784 live births occurring in the five years preceding the survey, 276 deceased children were excluded, and 4,421 children who were absent or not subsampled for anthropometry were excluded. The remaining children were screened for biological plausibility using WHO flags (|HAZ| ≤ 6, |WHZ| ≤ 5, </w:t>
+            </w:r>
+            <w:proofErr w:type="gramStart"/>
+            <w:r>
+              <w:rPr>
+                <w:rFonts w:ascii="Times New Roman" w:hAnsi="Times New Roman"/>
+                <w:color w:val="0070C0"/>
+                <w:sz w:val="24"/>
+              </w:rPr>
+              <w:t>|</w:t>
+            </w:r>
+            <w:proofErr w:type="gramEnd"/>
+            <w:r>
+              <w:rPr>
+                <w:rFonts w:ascii="Times New Roman" w:hAnsi="Times New Roman"/>
+                <w:color w:val="0070C0"/>
+                <w:sz w:val="24"/>
+              </w:rPr>
+              <w:t xml:space="preserve">WAZ| ≤ 5), resulting in a verified, complete-case analytical sample of 4,087 children aged 0–59 months nested within 3,474 households across 670 community clusters. A formal STROBE participant selection flow diagram </w:t>
+            </w:r>
+            <w:proofErr w:type="gramStart"/>
+            <w:r>
+              <w:rPr>
+                <w:rFonts w:ascii="Times New Roman" w:hAnsi="Times New Roman"/>
+                <w:color w:val="0070C0"/>
+                <w:sz w:val="24"/>
+              </w:rPr>
+              <w:t>has also been added</w:t>
+            </w:r>
+            <w:proofErr w:type="gramEnd"/>
+            <w:r>
+              <w:rPr>
+                <w:rFonts w:ascii="Times New Roman" w:hAnsi="Times New Roman"/>
+                <w:color w:val="0070C0"/>
+                <w:sz w:val="24"/>
+              </w:rPr>
+              <w:t xml:space="preserve"> as Figure 2.</w:t>
             </w:r>
           </w:p>
           <w:p>
@@ -718,7 +913,6 @@
             <w:r>
               <w:rPr>
                 <w:rFonts w:ascii="Times New Roman" w:hAnsi="Times New Roman"/>
-                <w:b w:val="0"/>
                 <w:i/>
                 <w:color w:val="0070C0"/>
                 <w:sz w:val="24"/>
@@ -827,8 +1021,9 @@
                 <w:sz w:val="24"/>
                 <w:szCs w:val="24"/>
               </w:rPr>
-              <w:t xml:space="preserve">It seems the authors had hypothesized that factors associated with stunting, wasting, and underweight are similar. If this is the case, it should be carefully interpreted with reasons. If this is </w:t>
-            </w:r>
+              <w:t xml:space="preserve">It seems the authors had hypothesized that factors associated with stunting, wasting, and underweight are similar. If this is the case, it </w:t>
+            </w:r>
+            <w:proofErr w:type="gramStart"/>
             <w:r>
               <w:rPr>
                 <w:rFonts w:ascii="Times New Roman" w:hAnsi="Times New Roman"/>
@@ -836,7 +1031,17 @@
                 <w:sz w:val="24"/>
                 <w:szCs w:val="24"/>
               </w:rPr>
-              <w:t>not the case, choice of assumed factors (e.g., those are included in the models) should be different for each undernutrition categories and should be justified by theories and evidence.</w:t>
+              <w:t>should be carefully interpreted</w:t>
+            </w:r>
+            <w:proofErr w:type="gramEnd"/>
+            <w:r>
+              <w:rPr>
+                <w:rFonts w:ascii="Times New Roman" w:hAnsi="Times New Roman"/>
+                <w:color w:val="000000"/>
+                <w:sz w:val="24"/>
+                <w:szCs w:val="24"/>
+              </w:rPr>
+              <w:t xml:space="preserve"> with reasons. If this is not the case, choice of assumed factors (e.g., those are included in the models) should be different for each undernutrition categories and should be justified by theories and evidence.</w:t>
             </w:r>
           </w:p>
         </w:tc>
@@ -871,28 +1076,57 @@
             <w:tcW w:w="7416" w:type="dxa"/>
           </w:tcPr>
           <w:p>
-            <w:r/>
-            <w:r>
-              <w:rPr>
-                <w:rFonts w:ascii="Times New Roman" w:hAnsi="Times New Roman"/>
-                <w:b w:val="0"/>
-                <w:i w:val="0"/>
-                <w:color w:val="0070C0"/>
-                <w:sz w:val="24"/>
-              </w:rPr>
-              <w:t>We thank Reviewer 1 for this essential epidemiological critique. We did not intend to imply that determinants of stunting, wasting, and underweight are uniform. Rather, our conceptual framework (UNICEF, 2021) recognizes that linear growth faltering (stunting), acute ponderal wasting, and composite underweight stem from distinct biological pathways.</w:t>
+            <w:r>
+              <w:rPr>
+                <w:rFonts w:ascii="Times New Roman" w:hAnsi="Times New Roman"/>
+                <w:color w:val="0070C0"/>
+                <w:sz w:val="24"/>
+              </w:rPr>
+              <w:t>We thank Reviewer 1 for this essential epidemiological critique. We did not intend to imply that determinants of stunti</w:t>
+            </w:r>
+            <w:r>
+              <w:rPr>
+                <w:rFonts w:ascii="Times New Roman" w:hAnsi="Times New Roman"/>
+                <w:color w:val="0070C0"/>
+                <w:sz w:val="24"/>
+              </w:rPr>
+              <w:t xml:space="preserve">ng, wasting, and underweight are uniform. Rather, our conceptual framework (UNICEF, 2021) recognizes that linear growth faltering (stunting), acute </w:t>
+            </w:r>
+            <w:proofErr w:type="spellStart"/>
+            <w:r>
+              <w:rPr>
+                <w:rFonts w:ascii="Times New Roman" w:hAnsi="Times New Roman"/>
+                <w:color w:val="0070C0"/>
+                <w:sz w:val="24"/>
+              </w:rPr>
+              <w:t>ponderal</w:t>
+            </w:r>
+            <w:proofErr w:type="spellEnd"/>
+            <w:r>
+              <w:rPr>
+                <w:rFonts w:ascii="Times New Roman" w:hAnsi="Times New Roman"/>
+                <w:color w:val="0070C0"/>
+                <w:sz w:val="24"/>
+              </w:rPr>
+              <w:t xml:space="preserve"> wasting, and composite underweight stem from distinct biological pathways.</w:t>
             </w:r>
           </w:p>
           <w:p>
             <w:r>
               <w:rPr>
                 <w:rFonts w:ascii="Times New Roman" w:hAnsi="Times New Roman"/>
-                <w:b w:val="0"/>
-                <w:i w:val="0"/>
-                <w:color w:val="0070C0"/>
-                <w:sz w:val="24"/>
-              </w:rPr>
-              <w:t>Our empirical findings strongly substantiate these differences across the three indices:</w:t>
+                <w:color w:val="0070C0"/>
+                <w:sz w:val="24"/>
+              </w:rPr>
+              <w:t>Our empirical findings s</w:t>
+            </w:r>
+            <w:r>
+              <w:rPr>
+                <w:rFonts w:ascii="Times New Roman" w:hAnsi="Times New Roman"/>
+                <w:color w:val="0070C0"/>
+                <w:sz w:val="24"/>
+              </w:rPr>
+              <w:t>trongly substantiate these differences across the three indices:</w:t>
             </w:r>
           </w:p>
           <w:p>
@@ -900,21 +1134,27 @@
               <w:rPr>
                 <w:rFonts w:ascii="Times New Roman" w:hAnsi="Times New Roman"/>
                 <w:b/>
-                <w:i w:val="0"/>
-                <w:color w:val="0070C0"/>
-                <w:sz w:val="24"/>
-              </w:rPr>
+                <w:color w:val="0070C0"/>
+                <w:sz w:val="24"/>
+              </w:rPr>
+              <w:lastRenderedPageBreak/>
               <w:t>• Child Age:</w:t>
             </w:r>
             <w:r>
               <w:rPr>
                 <w:rFonts w:ascii="Times New Roman" w:hAnsi="Times New Roman"/>
-                <w:b w:val="0"/>
-                <w:i w:val="0"/>
-                <w:color w:val="0070C0"/>
-                <w:sz w:val="24"/>
-              </w:rPr>
-              <w:t xml:space="preserve"> A massive driver of chronic stunting (twofold surge at 12–23 months, AOR = 2.38, 95% CI: 1.85–3.06) and progressive underweight (peaking at 48–59 months, AOR = 2.25), but is completely unassociated with acute wasting (p = 0.449).</w:t>
+                <w:color w:val="0070C0"/>
+                <w:sz w:val="24"/>
+              </w:rPr>
+              <w:t xml:space="preserve"> A massive driver of chronic stunting (twofold surge at 12–23 months, AOR = 2.38, 95% CI: 1.85–3.06) and progressive underweight (peaking at 48–59 months, AOR = 2.25), but is comp</w:t>
+            </w:r>
+            <w:r>
+              <w:rPr>
+                <w:rFonts w:ascii="Times New Roman" w:hAnsi="Times New Roman"/>
+                <w:color w:val="0070C0"/>
+                <w:sz w:val="24"/>
+              </w:rPr>
+              <w:t>letely unassociated with acute wasting (p = 0.449).</w:t>
             </w:r>
           </w:p>
           <w:p>
@@ -922,7 +1162,6 @@
               <w:rPr>
                 <w:rFonts w:ascii="Times New Roman" w:hAnsi="Times New Roman"/>
                 <w:b/>
-                <w:i w:val="0"/>
                 <w:color w:val="0070C0"/>
                 <w:sz w:val="24"/>
               </w:rPr>
@@ -931,12 +1170,18 @@
             <w:r>
               <w:rPr>
                 <w:rFonts w:ascii="Times New Roman" w:hAnsi="Times New Roman"/>
-                <w:b w:val="0"/>
-                <w:i w:val="0"/>
-                <w:color w:val="0070C0"/>
-                <w:sz w:val="24"/>
-              </w:rPr>
-              <w:t xml:space="preserve"> Highly significant for stunting (ICC = 1.19%, MOR = 1.21, p &lt; 0.001) and underweight (ICC = 1.09%, MOR = 1.20, p &lt; 0.001), but negligible for wasting (ICC = 0.00%, MOR = 1.00, p = 0.718), demonstrating that wasting is an acute, episodic household crisis rather than a community-level contextual phenomenon.</w:t>
+                <w:color w:val="0070C0"/>
+                <w:sz w:val="24"/>
+              </w:rPr>
+              <w:t xml:space="preserve"> Highly significant for stunting (ICC = 1.19%, MOR = 1.21, p &lt; 0.001) and underweight (ICC = 1.09%, MOR = 1.20, p &lt; 0.001), but negligible for wasting (ICC = 0.00%, MOR = 1.00, p = </w:t>
+            </w:r>
+            <w:r>
+              <w:rPr>
+                <w:rFonts w:ascii="Times New Roman" w:hAnsi="Times New Roman"/>
+                <w:color w:val="0070C0"/>
+                <w:sz w:val="24"/>
+              </w:rPr>
+              <w:t>0.718), demonstrating that wasting is an acute, episodic household crisis rather than a community-level contextual phenomenon.</w:t>
             </w:r>
           </w:p>
           <w:p>
@@ -944,7 +1189,6 @@
               <w:rPr>
                 <w:rFonts w:ascii="Times New Roman" w:hAnsi="Times New Roman"/>
                 <w:b/>
-                <w:i w:val="0"/>
                 <w:color w:val="0070C0"/>
                 <w:sz w:val="24"/>
               </w:rPr>
@@ -953,12 +1197,18 @@
             <w:r>
               <w:rPr>
                 <w:rFonts w:ascii="Times New Roman" w:hAnsi="Times New Roman"/>
-                <w:b w:val="0"/>
-                <w:i w:val="0"/>
-                <w:color w:val="0070C0"/>
-                <w:sz w:val="24"/>
-              </w:rPr>
-              <w:t xml:space="preserve"> Cumulative births (≥4 children ever born) was specifically associated with wasting (AOR = 3.27, 95% CI: 0.91–11.70), reflecting acute resource competition and maternal physiological depletion, whereas it was non-significant for stunting.</w:t>
+                <w:color w:val="0070C0"/>
+                <w:sz w:val="24"/>
+              </w:rPr>
+              <w:t xml:space="preserve"> Cumulative births (≥4 children ever born) was specifically associated with wasting (AOR = 3.27, 9</w:t>
+            </w:r>
+            <w:r>
+              <w:rPr>
+                <w:rFonts w:ascii="Times New Roman" w:hAnsi="Times New Roman"/>
+                <w:color w:val="0070C0"/>
+                <w:sz w:val="24"/>
+              </w:rPr>
+              <w:t>5% CI: 0.91–11.70), reflecting acute resource competition and maternal physiological depletion, whereas it was non-significant for stunting.</w:t>
             </w:r>
           </w:p>
           <w:p>
@@ -966,7 +1216,6 @@
               <w:rPr>
                 <w:rFonts w:ascii="Times New Roman" w:hAnsi="Times New Roman"/>
                 <w:b/>
-                <w:i w:val="0"/>
                 <w:color w:val="0070C0"/>
                 <w:sz w:val="24"/>
               </w:rPr>
@@ -975,12 +1224,18 @@
             <w:r>
               <w:rPr>
                 <w:rFonts w:ascii="Times New Roman" w:hAnsi="Times New Roman"/>
-                <w:b w:val="0"/>
-                <w:i w:val="0"/>
-                <w:color w:val="0070C0"/>
-                <w:sz w:val="24"/>
-              </w:rPr>
-              <w:t xml:space="preserve"> Refrigerator ownership exerted an independent protective association specifically on underweight (AOR = 0.75, 95% CI: 0.62–0.92), underscoring cold-chain food safety.</w:t>
+                <w:color w:val="0070C0"/>
+                <w:sz w:val="24"/>
+              </w:rPr>
+              <w:t xml:space="preserve"> Refrigerator ownership exerted an independent protective association specifically on und</w:t>
+            </w:r>
+            <w:r>
+              <w:rPr>
+                <w:rFonts w:ascii="Times New Roman" w:hAnsi="Times New Roman"/>
+                <w:color w:val="0070C0"/>
+                <w:sz w:val="24"/>
+              </w:rPr>
+              <w:t>erweight (AOR = 0.75, 95% CI: 0.62–0.92), underscoring cold-chain food safety.</w:t>
             </w:r>
           </w:p>
           <w:p>
@@ -997,12 +1252,20 @@
             <w:r>
               <w:rPr>
                 <w:rFonts w:ascii="Times New Roman" w:hAnsi="Times New Roman"/>
-                <w:b w:val="0"/>
                 <w:i/>
                 <w:color w:val="0070C0"/>
                 <w:sz w:val="24"/>
               </w:rPr>
-              <w:t>Section 1 (Introduction, Pages 2–5, Lines 56–138), Section 2.3 (Explanatory Variables, Page 7, Lines 189–220), Sections 3.4–3.6 (Results, Pages 13–14, Lines 315–351; Table 3, Pages 14–17), and Section 4 (Discussion, Pages 17–20, Lines 355–454).</w:t>
+              <w:t>Section 1 (Introduction, Pages 2–5, Lines 56–138), Section 2.3 (Explanatory Variables, Page 7, Lines 189–220), Sections 3.4–3.6 (Results, Pages 13–1</w:t>
+            </w:r>
+            <w:r>
+              <w:rPr>
+                <w:rFonts w:ascii="Times New Roman" w:hAnsi="Times New Roman"/>
+                <w:i/>
+                <w:color w:val="0070C0"/>
+                <w:sz w:val="24"/>
+              </w:rPr>
+              <w:t>4, Lines 315–351; Table 3, Pages 14–17), and Section 4 (Discussion, Pages 17–20, Lines 355–454).</w:t>
             </w:r>
           </w:p>
         </w:tc>
@@ -1063,16 +1326,7 @@
                 <w:sz w:val="24"/>
                 <w:szCs w:val="24"/>
               </w:rPr>
-              <w:t>There are similar published articles (https://www.nature.com/articles/s41598-025-99288-y, https://link.springer.</w:t>
-            </w:r>
-            <w:r>
-              <w:rPr>
-                <w:rFonts w:ascii="Times New Roman" w:hAnsi="Times New Roman"/>
-                <w:color w:val="000000"/>
-                <w:sz w:val="24"/>
-                <w:szCs w:val="24"/>
-              </w:rPr>
-              <w:t>com/article/10.1186/s12889-026-26793-8) based on same data (BDHS 2022), so the submitted manuscript does not contain high novelty in scientific literature.</w:t>
+              <w:t>There are similar published articles (https://www.nature.com/articles/s41598-025-99288-y, https://link.springer.com/article/10.1186/s12889-026-26793-8) based on same data (BDHS 2022), so the submitted manuscript does not contain high novelty in scientific literature.</w:t>
             </w:r>
           </w:p>
         </w:tc>
@@ -1115,12 +1369,9 @@
                 <w:szCs w:val="24"/>
               </w:rPr>
             </w:pPr>
-            <w:r/>
-            <w:r>
-              <w:rPr>
-                <w:rFonts w:ascii="Times New Roman" w:hAnsi="Times New Roman"/>
-                <w:b w:val="0"/>
-                <w:i w:val="0"/>
+            <w:r>
+              <w:rPr>
+                <w:rFonts w:ascii="Times New Roman" w:hAnsi="Times New Roman"/>
                 <w:color w:val="0070C0"/>
                 <w:sz w:val="24"/>
               </w:rPr>
@@ -1131,32 +1382,78 @@
             <w:r>
               <w:rPr>
                 <w:rFonts w:ascii="Times New Roman" w:hAnsi="Times New Roman"/>
-                <w:b w:val="0"/>
-                <w:i w:val="0"/>
-                <w:color w:val="0070C0"/>
-                <w:sz w:val="24"/>
-              </w:rPr>
-              <w:t>1. Contrast with Tamanna et al. (Scientific Reports, 2025 [25]):</w:t>
+                <w:color w:val="0070C0"/>
+                <w:sz w:val="24"/>
+              </w:rPr>
+              <w:t xml:space="preserve">1. Contrast with </w:t>
+            </w:r>
+            <w:proofErr w:type="spellStart"/>
+            <w:r>
+              <w:rPr>
+                <w:rFonts w:ascii="Times New Roman" w:hAnsi="Times New Roman"/>
+                <w:color w:val="0070C0"/>
+                <w:sz w:val="24"/>
+              </w:rPr>
+              <w:t>Tamanna</w:t>
+            </w:r>
+            <w:proofErr w:type="spellEnd"/>
+            <w:r>
+              <w:rPr>
+                <w:rFonts w:ascii="Times New Roman" w:hAnsi="Times New Roman"/>
+                <w:color w:val="0070C0"/>
+                <w:sz w:val="24"/>
+              </w:rPr>
+              <w:t xml:space="preserve"> et al. (Scientific Reports, 2025 [25]):</w:t>
             </w:r>
           </w:p>
           <w:p>
-            <w:r>
-              <w:rPr>
-                <w:rFonts w:ascii="Times New Roman" w:hAnsi="Times New Roman"/>
-                <w:b w:val="0"/>
-                <w:i w:val="0"/>
-                <w:color w:val="0070C0"/>
-                <w:sz w:val="24"/>
-              </w:rPr>
-              <w:t>Tamanna et al. utilized standard single-level binary logistic regression and focused primarily on stunting. By completely ignoring the multi-stage cluster sampling design of BDHS, single-level models artificially deflate standard errors and fail to estimate contextual neighborhood effects. In contrast, our study implements a rigorous two-level hierarchical random-intercept modeling framework across 670 Primary Sampling Units (PSUs), decomposing between-cluster variance and proving that over 80% of community-level variation is explained by household socio-environmental conditions.</w:t>
+            <w:proofErr w:type="spellStart"/>
+            <w:r>
+              <w:rPr>
+                <w:rFonts w:ascii="Times New Roman" w:hAnsi="Times New Roman"/>
+                <w:color w:val="0070C0"/>
+                <w:sz w:val="24"/>
+              </w:rPr>
+              <w:t>Tamanna</w:t>
+            </w:r>
+            <w:proofErr w:type="spellEnd"/>
+            <w:r>
+              <w:rPr>
+                <w:rFonts w:ascii="Times New Roman" w:hAnsi="Times New Roman"/>
+                <w:color w:val="0070C0"/>
+                <w:sz w:val="24"/>
+              </w:rPr>
+              <w:t xml:space="preserve"> et al. utilized </w:t>
+            </w:r>
+            <w:r>
+              <w:rPr>
+                <w:rFonts w:ascii="Times New Roman" w:hAnsi="Times New Roman"/>
+                <w:color w:val="0070C0"/>
+                <w:sz w:val="24"/>
+              </w:rPr>
+              <w:t>standard single-level binary logistic regression and focused primarily on stunting. By completely ignoring the multi-stage cluster sampling design of BDHS, single-level models artificially deflate standard errors and fail to estimate contextual neighborhoo</w:t>
+            </w:r>
+            <w:r>
+              <w:rPr>
+                <w:rFonts w:ascii="Times New Roman" w:hAnsi="Times New Roman"/>
+                <w:color w:val="0070C0"/>
+                <w:sz w:val="24"/>
+              </w:rPr>
+              <w:t>d effects. In contrast, our study implements a rigorous two-level hierarchical random-intercept modeling framework across 670 Primary Sampling Units (PSUs), decomposing between-cluster variance and proving that over 80% of community-level variation is expl</w:t>
+            </w:r>
+            <w:r>
+              <w:rPr>
+                <w:rFonts w:ascii="Times New Roman" w:hAnsi="Times New Roman"/>
+                <w:color w:val="0070C0"/>
+                <w:sz w:val="24"/>
+              </w:rPr>
+              <w:t>ained by household socio-environmental conditions.</w:t>
             </w:r>
           </w:p>
           <w:p>
             <w:r>
               <w:rPr>
                 <w:rFonts w:ascii="Times New Roman" w:hAnsi="Times New Roman"/>
-                <w:b w:val="0"/>
-                <w:i w:val="0"/>
                 <w:color w:val="0070C0"/>
                 <w:sz w:val="24"/>
               </w:rPr>
@@ -1167,48 +1464,245 @@
             <w:r>
               <w:rPr>
                 <w:rFonts w:ascii="Times New Roman" w:hAnsi="Times New Roman"/>
-                <w:b w:val="0"/>
-                <w:i w:val="0"/>
-                <w:color w:val="0070C0"/>
-                <w:sz w:val="24"/>
-              </w:rPr>
-              <w:t>Rashid et al. ('Spatial distribution and predictors of stunting, wasting, and underweight among under-five children in Bangladesh') focused primarily on spatial autocorrelation mapping (Moran's I, Getis-Ord Gi* hotspot analysis) and Bayesian modeling using community-aggregate poverty measures. In contrast, our study provides the definitive frequentist two-level hierarchical model across the complete verified biological sample (N = 4,087), quantifying between-cluster variance via Intraclass Correlation Coefficients (ICC) and Median Odds Ratios (MOR), while uniquely disaggregating domestic food preservation infrastructure (refrigerator ownership) and identifying the critical post-pandemic 12–23 month weaning transition surge.</w:t>
+                <w:color w:val="0070C0"/>
+                <w:sz w:val="24"/>
+              </w:rPr>
+              <w:t xml:space="preserve">Rashid et al. ('Spatial distribution and predictors of stunting, wasting, and underweight among under-five children in Bangladesh') focused </w:t>
+            </w:r>
+            <w:r>
+              <w:rPr>
+                <w:rFonts w:ascii="Times New Roman" w:hAnsi="Times New Roman"/>
+                <w:color w:val="0070C0"/>
+                <w:sz w:val="24"/>
+              </w:rPr>
+              <w:t xml:space="preserve">primarily on spatial autocorrelation mapping (Moran's I, </w:t>
+            </w:r>
+            <w:proofErr w:type="spellStart"/>
+            <w:r>
+              <w:rPr>
+                <w:rFonts w:ascii="Times New Roman" w:hAnsi="Times New Roman"/>
+                <w:color w:val="0070C0"/>
+                <w:sz w:val="24"/>
+              </w:rPr>
+              <w:t>Getis</w:t>
+            </w:r>
+            <w:proofErr w:type="spellEnd"/>
+            <w:r>
+              <w:rPr>
+                <w:rFonts w:ascii="Times New Roman" w:hAnsi="Times New Roman"/>
+                <w:color w:val="0070C0"/>
+                <w:sz w:val="24"/>
+              </w:rPr>
+              <w:t xml:space="preserve">-Ord </w:t>
+            </w:r>
+            <w:proofErr w:type="spellStart"/>
+            <w:r>
+              <w:rPr>
+                <w:rFonts w:ascii="Times New Roman" w:hAnsi="Times New Roman"/>
+                <w:color w:val="0070C0"/>
+                <w:sz w:val="24"/>
+              </w:rPr>
+              <w:t>Gi</w:t>
+            </w:r>
+            <w:proofErr w:type="spellEnd"/>
+            <w:r>
+              <w:rPr>
+                <w:rFonts w:ascii="Times New Roman" w:hAnsi="Times New Roman"/>
+                <w:color w:val="0070C0"/>
+                <w:sz w:val="24"/>
+              </w:rPr>
+              <w:t>* hotspot analysis) and Bayesian modeling using community-aggregate poverty measures. In contrast, our study provides the definitive frequentist two-level hierarchical model across the co</w:t>
+            </w:r>
+            <w:r>
+              <w:rPr>
+                <w:rFonts w:ascii="Times New Roman" w:hAnsi="Times New Roman"/>
+                <w:color w:val="0070C0"/>
+                <w:sz w:val="24"/>
+              </w:rPr>
+              <w:t xml:space="preserve">mplete verified biological sample (N </w:t>
+            </w:r>
+            <w:r>
+              <w:rPr>
+                <w:rFonts w:ascii="Times New Roman" w:hAnsi="Times New Roman"/>
+                <w:color w:val="0070C0"/>
+                <w:sz w:val="24"/>
+              </w:rPr>
+              <w:lastRenderedPageBreak/>
+              <w:t xml:space="preserve">= 4,087), quantifying between-cluster variance via </w:t>
+            </w:r>
+            <w:proofErr w:type="spellStart"/>
+            <w:r>
+              <w:rPr>
+                <w:rFonts w:ascii="Times New Roman" w:hAnsi="Times New Roman"/>
+                <w:color w:val="0070C0"/>
+                <w:sz w:val="24"/>
+              </w:rPr>
+              <w:t>Intraclass</w:t>
+            </w:r>
+            <w:proofErr w:type="spellEnd"/>
+            <w:r>
+              <w:rPr>
+                <w:rFonts w:ascii="Times New Roman" w:hAnsi="Times New Roman"/>
+                <w:color w:val="0070C0"/>
+                <w:sz w:val="24"/>
+              </w:rPr>
+              <w:t xml:space="preserve"> Correlation Coefficients (ICC) and Median Odds Ratios (MOR), while uniquely disaggregating domestic food preservation infrastructure (refrigerator ownership)</w:t>
+            </w:r>
+            <w:r>
+              <w:rPr>
+                <w:rFonts w:ascii="Times New Roman" w:hAnsi="Times New Roman"/>
+                <w:color w:val="0070C0"/>
+                <w:sz w:val="24"/>
+              </w:rPr>
+              <w:t xml:space="preserve"> and identifying the critical post-pandemic 12–23 month weaning transition surge.</w:t>
             </w:r>
           </w:p>
           <w:p>
             <w:r>
               <w:rPr>
                 <w:rFonts w:ascii="Times New Roman" w:hAnsi="Times New Roman"/>
-                <w:b w:val="0"/>
-                <w:i w:val="0"/>
-                <w:color w:val="0070C0"/>
-                <w:sz w:val="24"/>
-              </w:rPr>
-              <w:t>3. Simultaneous Evaluation across WHO Standards: Our paper is the first to evaluate stunting, wasting, and underweight simultaneously within a unified sample under identical multilevel specifications, proving that chronic undernutrition is community-clustered whereas acute wasting operates with zero community clustering as an episodic family shock.</w:t>
+                <w:color w:val="0070C0"/>
+                <w:sz w:val="24"/>
+              </w:rPr>
+              <w:t xml:space="preserve">3. Simultaneous Evaluation across WHO Standards: Our paper is the first to evaluate stunting, wasting, and underweight simultaneously within a unified sample under identical </w:t>
+            </w:r>
+            <w:r>
+              <w:rPr>
+                <w:rFonts w:ascii="Times New Roman" w:hAnsi="Times New Roman"/>
+                <w:color w:val="0070C0"/>
+                <w:sz w:val="24"/>
+              </w:rPr>
+              <w:t>multilevel specifications, proving that chronic undernutrition is community-clustered whereas acute wasting operates with zero community clustering as an episodic family shock.</w:t>
             </w:r>
           </w:p>
           <w:p>
             <w:r>
               <w:rPr>
                 <w:rFonts w:ascii="Times New Roman" w:hAnsi="Times New Roman"/>
-                <w:b w:val="0"/>
-                <w:i w:val="0"/>
-                <w:color w:val="0070C0"/>
-                <w:sz w:val="24"/>
-              </w:rPr>
-              <w:t>1. Tamanna T, Mahmud S, Salma N, Hossain MM, Karim MR. Identifying determinants of malnutrition in under-five children in Bangladesh: insights from the BDHS-2022 cross-sectional study. Scientific Reports. 2025;15(1):14336. doi: 10.1038/s41598-025-99288-y.</w:t>
+                <w:color w:val="0070C0"/>
+                <w:sz w:val="24"/>
+              </w:rPr>
+              <w:t xml:space="preserve">1. </w:t>
+            </w:r>
+            <w:proofErr w:type="spellStart"/>
+            <w:r>
+              <w:rPr>
+                <w:rFonts w:ascii="Times New Roman" w:hAnsi="Times New Roman"/>
+                <w:color w:val="0070C0"/>
+                <w:sz w:val="24"/>
+              </w:rPr>
+              <w:t>Tamanna</w:t>
+            </w:r>
+            <w:proofErr w:type="spellEnd"/>
+            <w:r>
+              <w:rPr>
+                <w:rFonts w:ascii="Times New Roman" w:hAnsi="Times New Roman"/>
+                <w:color w:val="0070C0"/>
+                <w:sz w:val="24"/>
+              </w:rPr>
+              <w:t xml:space="preserve"> T, Mahmud S, Salma N, Hossain MM, Karim MR. Identifying determinants</w:t>
+            </w:r>
+            <w:r>
+              <w:rPr>
+                <w:rFonts w:ascii="Times New Roman" w:hAnsi="Times New Roman"/>
+                <w:color w:val="0070C0"/>
+                <w:sz w:val="24"/>
+              </w:rPr>
+              <w:t xml:space="preserve"> of malnutrition in under-five children in Bangladesh: insights from the BDHS-2022 cross-sectional study. Scientific Reports. 2025</w:t>
+            </w:r>
+            <w:proofErr w:type="gramStart"/>
+            <w:r>
+              <w:rPr>
+                <w:rFonts w:ascii="Times New Roman" w:hAnsi="Times New Roman"/>
+                <w:color w:val="0070C0"/>
+                <w:sz w:val="24"/>
+              </w:rPr>
+              <w:t>;15</w:t>
+            </w:r>
+            <w:proofErr w:type="gramEnd"/>
+            <w:r>
+              <w:rPr>
+                <w:rFonts w:ascii="Times New Roman" w:hAnsi="Times New Roman"/>
+                <w:color w:val="0070C0"/>
+                <w:sz w:val="24"/>
+              </w:rPr>
+              <w:t xml:space="preserve">(1):14336. </w:t>
+            </w:r>
+            <w:proofErr w:type="spellStart"/>
+            <w:proofErr w:type="gramStart"/>
+            <w:r>
+              <w:rPr>
+                <w:rFonts w:ascii="Times New Roman" w:hAnsi="Times New Roman"/>
+                <w:color w:val="0070C0"/>
+                <w:sz w:val="24"/>
+              </w:rPr>
+              <w:t>doi</w:t>
+            </w:r>
+            <w:proofErr w:type="spellEnd"/>
+            <w:proofErr w:type="gramEnd"/>
+            <w:r>
+              <w:rPr>
+                <w:rFonts w:ascii="Times New Roman" w:hAnsi="Times New Roman"/>
+                <w:color w:val="0070C0"/>
+                <w:sz w:val="24"/>
+              </w:rPr>
+              <w:t>: 10.1038/s41598-025-99288-y.</w:t>
             </w:r>
           </w:p>
           <w:p>
             <w:r>
               <w:rPr>
                 <w:rFonts w:ascii="Times New Roman" w:hAnsi="Times New Roman"/>
-                <w:b w:val="0"/>
-                <w:i w:val="0"/>
-                <w:color w:val="0070C0"/>
-                <w:sz w:val="24"/>
-              </w:rPr>
-              <w:t>2. Rashid M, Rahman M, Siddiqi NA, Islam R, Miah S, Roy TK, Rahman M. Spatial distribution and predictors of stunting, wasting, and underweight among under-five children in Bangladesh. BMC Public Health. 2026;26(1):1504. doi: 10.1186/s12889-026-26793-8.</w:t>
+                <w:color w:val="0070C0"/>
+                <w:sz w:val="24"/>
+              </w:rPr>
+              <w:t>2. Rashid M, Rahman M, Siddiqi NA, Islam R, Miah S, Roy TK, Rahman M. Spatial d</w:t>
+            </w:r>
+            <w:r>
+              <w:rPr>
+                <w:rFonts w:ascii="Times New Roman" w:hAnsi="Times New Roman"/>
+                <w:color w:val="0070C0"/>
+                <w:sz w:val="24"/>
+              </w:rPr>
+              <w:t>istribution and predictors of stunting, wasting, and underweight among under-five children in Bangladesh. BMC Public Health. 2026</w:t>
+            </w:r>
+            <w:proofErr w:type="gramStart"/>
+            <w:r>
+              <w:rPr>
+                <w:rFonts w:ascii="Times New Roman" w:hAnsi="Times New Roman"/>
+                <w:color w:val="0070C0"/>
+                <w:sz w:val="24"/>
+              </w:rPr>
+              <w:t>;26</w:t>
+            </w:r>
+            <w:proofErr w:type="gramEnd"/>
+            <w:r>
+              <w:rPr>
+                <w:rFonts w:ascii="Times New Roman" w:hAnsi="Times New Roman"/>
+                <w:color w:val="0070C0"/>
+                <w:sz w:val="24"/>
+              </w:rPr>
+              <w:t xml:space="preserve">(1):1504. </w:t>
+            </w:r>
+            <w:proofErr w:type="spellStart"/>
+            <w:proofErr w:type="gramStart"/>
+            <w:r>
+              <w:rPr>
+                <w:rFonts w:ascii="Times New Roman" w:hAnsi="Times New Roman"/>
+                <w:color w:val="0070C0"/>
+                <w:sz w:val="24"/>
+              </w:rPr>
+              <w:t>doi</w:t>
+            </w:r>
+            <w:proofErr w:type="spellEnd"/>
+            <w:proofErr w:type="gramEnd"/>
+            <w:r>
+              <w:rPr>
+                <w:rFonts w:ascii="Times New Roman" w:hAnsi="Times New Roman"/>
+                <w:color w:val="0070C0"/>
+                <w:sz w:val="24"/>
+              </w:rPr>
+              <w:t>: 10.1186/s12889-026-26793-8.</w:t>
             </w:r>
           </w:p>
           <w:p>
@@ -1225,12 +1719,20 @@
             <w:r>
               <w:rPr>
                 <w:rFonts w:ascii="Times New Roman" w:hAnsi="Times New Roman"/>
-                <w:b w:val="0"/>
                 <w:i/>
                 <w:color w:val="0070C0"/>
                 <w:sz w:val="24"/>
               </w:rPr>
-              <w:t>Section 1 (Introduction, Pages 4–5, Lines 105–122) and Section 4 (Discussion, Pages 19–20, Lines 431–442).</w:t>
+              <w:t>Section 1 (Introduction, Pages 4–5, Lines 105–122) a</w:t>
+            </w:r>
+            <w:r>
+              <w:rPr>
+                <w:rFonts w:ascii="Times New Roman" w:hAnsi="Times New Roman"/>
+                <w:i/>
+                <w:color w:val="0070C0"/>
+                <w:sz w:val="24"/>
+              </w:rPr>
+              <w:t>nd Section 4 (Discussion, Pages 19–20, Lines 431–442).</w:t>
             </w:r>
           </w:p>
         </w:tc>
@@ -1334,8 +1836,9 @@
                 <w:sz w:val="24"/>
                 <w:szCs w:val="24"/>
               </w:rPr>
-              <w:t xml:space="preserve">Survey design and weighting: The authors mention using sampling weights for the descriptive analysis but do not specify whether the complex survey design (clustering and </w:t>
-            </w:r>
+              <w:t xml:space="preserve">Survey design and weighting: The authors mention using sampling weights for the descriptive analysis but do not specify whether the complex survey design (clustering and stratification) </w:t>
+            </w:r>
+            <w:proofErr w:type="gramStart"/>
             <w:r>
               <w:rPr>
                 <w:rFonts w:ascii="Times New Roman" w:hAnsi="Times New Roman"/>
@@ -1343,7 +1846,37 @@
                 <w:sz w:val="24"/>
                 <w:szCs w:val="24"/>
               </w:rPr>
-              <w:t>stratification) was accounted for in the bivariate and multivariate models... Please explain how weights, strata, and primary sampling units were handled.</w:t>
+              <w:t>was accounted for</w:t>
+            </w:r>
+            <w:proofErr w:type="gramEnd"/>
+            <w:r>
+              <w:rPr>
+                <w:rFonts w:ascii="Times New Roman" w:hAnsi="Times New Roman"/>
+                <w:color w:val="000000"/>
+                <w:sz w:val="24"/>
+                <w:szCs w:val="24"/>
+              </w:rPr>
+              <w:t xml:space="preserve"> in the bivariate and multivariate models... Please explain how weights, strata, and primary sampling units </w:t>
+            </w:r>
+            <w:proofErr w:type="gramStart"/>
+            <w:r>
+              <w:rPr>
+                <w:rFonts w:ascii="Times New Roman" w:hAnsi="Times New Roman"/>
+                <w:color w:val="000000"/>
+                <w:sz w:val="24"/>
+                <w:szCs w:val="24"/>
+              </w:rPr>
+              <w:t>were handled</w:t>
+            </w:r>
+            <w:proofErr w:type="gramEnd"/>
+            <w:r>
+              <w:rPr>
+                <w:rFonts w:ascii="Times New Roman" w:hAnsi="Times New Roman"/>
+                <w:color w:val="000000"/>
+                <w:sz w:val="24"/>
+                <w:szCs w:val="24"/>
+              </w:rPr>
+              <w:t>.</w:t>
             </w:r>
           </w:p>
         </w:tc>
@@ -1388,12 +1921,9 @@
                 <w:szCs w:val="24"/>
               </w:rPr>
             </w:pPr>
-            <w:r/>
-            <w:r>
-              <w:rPr>
-                <w:rFonts w:ascii="Times New Roman" w:hAnsi="Times New Roman"/>
-                <w:b w:val="0"/>
-                <w:i w:val="0"/>
+            <w:r>
+              <w:rPr>
+                <w:rFonts w:ascii="Times New Roman" w:hAnsi="Times New Roman"/>
                 <w:color w:val="0070C0"/>
                 <w:sz w:val="24"/>
               </w:rPr>
@@ -1405,7 +1935,6 @@
               <w:rPr>
                 <w:rFonts w:ascii="Times New Roman" w:hAnsi="Times New Roman"/>
                 <w:b/>
-                <w:i w:val="0"/>
                 <w:color w:val="0070C0"/>
                 <w:sz w:val="24"/>
               </w:rPr>
@@ -1414,8 +1943,6 @@
             <w:r>
               <w:rPr>
                 <w:rFonts w:ascii="Times New Roman" w:hAnsi="Times New Roman"/>
-                <w:b w:val="0"/>
-                <w:i w:val="0"/>
                 <w:color w:val="0070C0"/>
                 <w:sz w:val="24"/>
               </w:rPr>
@@ -1427,45 +1954,200 @@
               <w:rPr>
                 <w:rFonts w:ascii="Times New Roman" w:hAnsi="Times New Roman"/>
                 <w:b/>
-                <w:i w:val="0"/>
-                <w:color w:val="0070C0"/>
-                <w:sz w:val="24"/>
-              </w:rPr>
-              <w:t>• Multilevel Regression Models:</w:t>
-            </w:r>
-            <w:r>
-              <w:rPr>
-                <w:rFonts w:ascii="Times New Roman" w:hAnsi="Times New Roman"/>
-                <w:b w:val="0"/>
-                <w:i w:val="0"/>
-                <w:color w:val="0070C0"/>
-                <w:sz w:val="24"/>
-              </w:rPr>
-              <w:t xml:space="preserve"> In accordance with established statistical recommendations for complex surveys (Carle, 2009; Gelman, 2007), clustering was modeled directly via cluster random intercepts (1 | Cluster_ID) across 670 PSUs. Survey stratification variables (administrative division and urban/rural residence) were incorporated directly as fixed-effect covariates in Model III, ensuring unbiased parameter estimation without artificial weight distortion in generalized linear mixed models.</w:t>
+                <w:color w:val="0070C0"/>
+                <w:sz w:val="24"/>
+              </w:rPr>
+              <w:t>• Multi</w:t>
+            </w:r>
+            <w:r>
+              <w:rPr>
+                <w:rFonts w:ascii="Times New Roman" w:hAnsi="Times New Roman"/>
+                <w:b/>
+                <w:color w:val="0070C0"/>
+                <w:sz w:val="24"/>
+              </w:rPr>
+              <w:t>level Regression Models:</w:t>
+            </w:r>
+            <w:r>
+              <w:rPr>
+                <w:rFonts w:ascii="Times New Roman" w:hAnsi="Times New Roman"/>
+                <w:color w:val="0070C0"/>
+                <w:sz w:val="24"/>
+              </w:rPr>
+              <w:t xml:space="preserve"> In accordance with established statistical recommendations for complex surveys (Carle, 2009; </w:t>
+            </w:r>
+            <w:proofErr w:type="spellStart"/>
+            <w:r>
+              <w:rPr>
+                <w:rFonts w:ascii="Times New Roman" w:hAnsi="Times New Roman"/>
+                <w:color w:val="0070C0"/>
+                <w:sz w:val="24"/>
+              </w:rPr>
+              <w:t>Gelman</w:t>
+            </w:r>
+            <w:proofErr w:type="spellEnd"/>
+            <w:r>
+              <w:rPr>
+                <w:rFonts w:ascii="Times New Roman" w:hAnsi="Times New Roman"/>
+                <w:color w:val="0070C0"/>
+                <w:sz w:val="24"/>
+              </w:rPr>
+              <w:t xml:space="preserve">, 2007), clustering was modeled directly via cluster random intercepts (1 | </w:t>
+            </w:r>
+            <w:proofErr w:type="spellStart"/>
+            <w:r>
+              <w:rPr>
+                <w:rFonts w:ascii="Times New Roman" w:hAnsi="Times New Roman"/>
+                <w:color w:val="0070C0"/>
+                <w:sz w:val="24"/>
+              </w:rPr>
+              <w:t>Cluster_ID</w:t>
+            </w:r>
+            <w:proofErr w:type="spellEnd"/>
+            <w:r>
+              <w:rPr>
+                <w:rFonts w:ascii="Times New Roman" w:hAnsi="Times New Roman"/>
+                <w:color w:val="0070C0"/>
+                <w:sz w:val="24"/>
+              </w:rPr>
+              <w:t>) across 670 PSUs. Survey stratification varia</w:t>
+            </w:r>
+            <w:r>
+              <w:rPr>
+                <w:rFonts w:ascii="Times New Roman" w:hAnsi="Times New Roman"/>
+                <w:color w:val="0070C0"/>
+                <w:sz w:val="24"/>
+              </w:rPr>
+              <w:t xml:space="preserve">bles (administrative division and urban/rural residence) </w:t>
+            </w:r>
+            <w:proofErr w:type="gramStart"/>
+            <w:r>
+              <w:rPr>
+                <w:rFonts w:ascii="Times New Roman" w:hAnsi="Times New Roman"/>
+                <w:color w:val="0070C0"/>
+                <w:sz w:val="24"/>
+              </w:rPr>
+              <w:t>were incorporated</w:t>
+            </w:r>
+            <w:proofErr w:type="gramEnd"/>
+            <w:r>
+              <w:rPr>
+                <w:rFonts w:ascii="Times New Roman" w:hAnsi="Times New Roman"/>
+                <w:color w:val="0070C0"/>
+                <w:sz w:val="24"/>
+              </w:rPr>
+              <w:t xml:space="preserve"> directly as fixed-effect covariates in Model III, ensuring unbiased parameter estimation without artificial weight distortion in generalized linear mixed models.</w:t>
             </w:r>
           </w:p>
           <w:p>
             <w:r>
               <w:rPr>
                 <w:rFonts w:ascii="Times New Roman" w:hAnsi="Times New Roman"/>
-                <w:b w:val="0"/>
-                <w:i w:val="0"/>
-                <w:color w:val="0070C0"/>
-                <w:sz w:val="24"/>
-              </w:rPr>
-              <w:t>1. Carle AC. Fitting multilevel models in complex survey data with design weights: Recommendations. BMC Medical Research Methodology. 2009;9(1):49. doi: 10.1186/1471-2288-9-49.</w:t>
+                <w:color w:val="0070C0"/>
+                <w:sz w:val="24"/>
+              </w:rPr>
+              <w:t>1. Carle AC. Fittin</w:t>
+            </w:r>
+            <w:r>
+              <w:rPr>
+                <w:rFonts w:ascii="Times New Roman" w:hAnsi="Times New Roman"/>
+                <w:color w:val="0070C0"/>
+                <w:sz w:val="24"/>
+              </w:rPr>
+              <w:t xml:space="preserve">g multilevel models in complex survey data with design weights: Recommendations. BMC Medical Research Methodology. </w:t>
+            </w:r>
+            <w:r>
+              <w:rPr>
+                <w:rFonts w:ascii="Times New Roman" w:hAnsi="Times New Roman"/>
+                <w:color w:val="0070C0"/>
+                <w:sz w:val="24"/>
+              </w:rPr>
+              <w:lastRenderedPageBreak/>
+              <w:t>2009</w:t>
+            </w:r>
+            <w:proofErr w:type="gramStart"/>
+            <w:r>
+              <w:rPr>
+                <w:rFonts w:ascii="Times New Roman" w:hAnsi="Times New Roman"/>
+                <w:color w:val="0070C0"/>
+                <w:sz w:val="24"/>
+              </w:rPr>
+              <w:t>;9</w:t>
+            </w:r>
+            <w:proofErr w:type="gramEnd"/>
+            <w:r>
+              <w:rPr>
+                <w:rFonts w:ascii="Times New Roman" w:hAnsi="Times New Roman"/>
+                <w:color w:val="0070C0"/>
+                <w:sz w:val="24"/>
+              </w:rPr>
+              <w:t xml:space="preserve">(1):49. </w:t>
+            </w:r>
+            <w:proofErr w:type="spellStart"/>
+            <w:proofErr w:type="gramStart"/>
+            <w:r>
+              <w:rPr>
+                <w:rFonts w:ascii="Times New Roman" w:hAnsi="Times New Roman"/>
+                <w:color w:val="0070C0"/>
+                <w:sz w:val="24"/>
+              </w:rPr>
+              <w:t>doi</w:t>
+            </w:r>
+            <w:proofErr w:type="spellEnd"/>
+            <w:proofErr w:type="gramEnd"/>
+            <w:r>
+              <w:rPr>
+                <w:rFonts w:ascii="Times New Roman" w:hAnsi="Times New Roman"/>
+                <w:color w:val="0070C0"/>
+                <w:sz w:val="24"/>
+              </w:rPr>
+              <w:t>: 10.1186/1471-2288-9-49.</w:t>
             </w:r>
           </w:p>
           <w:p>
             <w:r>
               <w:rPr>
                 <w:rFonts w:ascii="Times New Roman" w:hAnsi="Times New Roman"/>
-                <w:b w:val="0"/>
-                <w:i w:val="0"/>
-                <w:color w:val="0070C0"/>
-                <w:sz w:val="24"/>
-              </w:rPr>
-              <w:t>2. Gelman A. Struggles with survey weighting and regression modeling. Statistical Science. 2007;22(2):153–164.</w:t>
+                <w:color w:val="0070C0"/>
+                <w:sz w:val="24"/>
+              </w:rPr>
+              <w:t xml:space="preserve">2. </w:t>
+            </w:r>
+            <w:proofErr w:type="spellStart"/>
+            <w:r>
+              <w:rPr>
+                <w:rFonts w:ascii="Times New Roman" w:hAnsi="Times New Roman"/>
+                <w:color w:val="0070C0"/>
+                <w:sz w:val="24"/>
+              </w:rPr>
+              <w:t>Gelman</w:t>
+            </w:r>
+            <w:proofErr w:type="spellEnd"/>
+            <w:r>
+              <w:rPr>
+                <w:rFonts w:ascii="Times New Roman" w:hAnsi="Times New Roman"/>
+                <w:color w:val="0070C0"/>
+                <w:sz w:val="24"/>
+              </w:rPr>
+              <w:t xml:space="preserve"> A. Struggles with survey weighting and regression modeling. Statistical Science. 2007</w:t>
+            </w:r>
+            <w:proofErr w:type="gramStart"/>
+            <w:r>
+              <w:rPr>
+                <w:rFonts w:ascii="Times New Roman" w:hAnsi="Times New Roman"/>
+                <w:color w:val="0070C0"/>
+                <w:sz w:val="24"/>
+              </w:rPr>
+              <w:t>;22</w:t>
+            </w:r>
+            <w:proofErr w:type="gramEnd"/>
+            <w:r>
+              <w:rPr>
+                <w:rFonts w:ascii="Times New Roman" w:hAnsi="Times New Roman"/>
+                <w:color w:val="0070C0"/>
+                <w:sz w:val="24"/>
+              </w:rPr>
+              <w:t>(2):153–164.</w:t>
             </w:r>
           </w:p>
           <w:p>
@@ -1482,7 +2164,6 @@
             <w:r>
               <w:rPr>
                 <w:rFonts w:ascii="Times New Roman" w:hAnsi="Times New Roman"/>
-                <w:b w:val="0"/>
                 <w:i/>
                 <w:color w:val="0070C0"/>
                 <w:sz w:val="24"/>
@@ -1539,18 +2220,18 @@
                 <w:sz w:val="24"/>
                 <w:szCs w:val="24"/>
               </w:rPr>
-              <w:t>Missing data and sample sel</w:t>
-            </w:r>
-            <w:r>
-              <w:rPr>
-                <w:rFonts w:ascii="Times New Roman" w:hAnsi="Times New Roman"/>
-                <w:b/>
+              <w:t xml:space="preserve">Missing data and sample selection cascade: </w:t>
+            </w:r>
+            <w:r>
+              <w:rPr>
+                <w:rFonts w:ascii="Times New Roman" w:hAnsi="Times New Roman"/>
                 <w:color w:val="000000"/>
                 <w:sz w:val="24"/>
                 <w:szCs w:val="24"/>
               </w:rPr>
-              <w:t xml:space="preserve">ection cascade: </w:t>
-            </w:r>
+              <w:t xml:space="preserve">Missing data and selection of the final sample: The final analysis looked at 4,087 children out of 8,784 born in the five years before the survey. Details on missing data for each variable </w:t>
+            </w:r>
+            <w:proofErr w:type="gramStart"/>
             <w:r>
               <w:rPr>
                 <w:rFonts w:ascii="Times New Roman" w:hAnsi="Times New Roman"/>
@@ -1558,8 +2239,9 @@
                 <w:sz w:val="24"/>
                 <w:szCs w:val="24"/>
               </w:rPr>
-              <w:t xml:space="preserve">Missing data and selection of the final sample: The final analysis looked at 4,087 children out of 8,784 born in the five years before the survey. Details on missing data for each variable are needed... Add a flow chart (STROBE participant </w:t>
-            </w:r>
+              <w:t>are needed</w:t>
+            </w:r>
+            <w:proofErr w:type="gramEnd"/>
             <w:r>
               <w:rPr>
                 <w:rFonts w:ascii="Times New Roman" w:hAnsi="Times New Roman"/>
@@ -1567,7 +2249,7 @@
                 <w:sz w:val="24"/>
                 <w:szCs w:val="24"/>
               </w:rPr>
-              <w:t>flow).</w:t>
+              <w:t>... Add a flow chart (STROBE participant flow).</w:t>
             </w:r>
           </w:p>
         </w:tc>
@@ -1612,12 +2294,9 @@
                 <w:szCs w:val="24"/>
               </w:rPr>
             </w:pPr>
-            <w:r/>
-            <w:r>
-              <w:rPr>
-                <w:rFonts w:ascii="Times New Roman" w:hAnsi="Times New Roman"/>
-                <w:b w:val="0"/>
-                <w:i w:val="0"/>
+            <w:r>
+              <w:rPr>
+                <w:rFonts w:ascii="Times New Roman" w:hAnsi="Times New Roman"/>
                 <w:color w:val="0070C0"/>
                 <w:sz w:val="24"/>
               </w:rPr>
@@ -1629,7 +2308,6 @@
               <w:rPr>
                 <w:rFonts w:ascii="Times New Roman" w:hAnsi="Times New Roman"/>
                 <w:b/>
-                <w:i w:val="0"/>
                 <w:color w:val="0070C0"/>
                 <w:sz w:val="24"/>
               </w:rPr>
@@ -1638,8 +2316,6 @@
             <w:r>
               <w:rPr>
                 <w:rFonts w:ascii="Times New Roman" w:hAnsi="Times New Roman"/>
-                <w:b w:val="0"/>
-                <w:i w:val="0"/>
                 <w:color w:val="0070C0"/>
                 <w:sz w:val="24"/>
               </w:rPr>
@@ -1651,7 +2327,6 @@
               <w:rPr>
                 <w:rFonts w:ascii="Times New Roman" w:hAnsi="Times New Roman"/>
                 <w:b/>
-                <w:i w:val="0"/>
                 <w:color w:val="0070C0"/>
                 <w:sz w:val="24"/>
               </w:rPr>
@@ -1660,8 +2335,6 @@
             <w:r>
               <w:rPr>
                 <w:rFonts w:ascii="Times New Roman" w:hAnsi="Times New Roman"/>
-                <w:b w:val="0"/>
-                <w:i w:val="0"/>
                 <w:color w:val="0070C0"/>
                 <w:sz w:val="24"/>
               </w:rPr>
@@ -1673,7 +2346,6 @@
               <w:rPr>
                 <w:rFonts w:ascii="Times New Roman" w:hAnsi="Times New Roman"/>
                 <w:b/>
-                <w:i w:val="0"/>
                 <w:color w:val="0070C0"/>
                 <w:sz w:val="24"/>
               </w:rPr>
@@ -1682,32 +2354,78 @@
             <w:r>
               <w:rPr>
                 <w:rFonts w:ascii="Times New Roman" w:hAnsi="Times New Roman"/>
-                <w:b w:val="0"/>
-                <w:i w:val="0"/>
-                <w:color w:val="0070C0"/>
-                <w:sz w:val="24"/>
-              </w:rPr>
-              <w:t xml:space="preserve"> In BDHS 2022, anthropometric measurements were performed in a randomized one-third subsample of households; 4,421 children were not measured due to subsampling protocol or temporary absence.</w:t>
+                <w:color w:val="0070C0"/>
+                <w:sz w:val="24"/>
+              </w:rPr>
+              <w:t xml:space="preserve"> In BDHS 2022, anthropomet</w:t>
+            </w:r>
+            <w:r>
+              <w:rPr>
+                <w:rFonts w:ascii="Times New Roman" w:hAnsi="Times New Roman"/>
+                <w:color w:val="0070C0"/>
+                <w:sz w:val="24"/>
+              </w:rPr>
+              <w:t xml:space="preserve">ric measurements </w:t>
+            </w:r>
+            <w:proofErr w:type="gramStart"/>
+            <w:r>
+              <w:rPr>
+                <w:rFonts w:ascii="Times New Roman" w:hAnsi="Times New Roman"/>
+                <w:color w:val="0070C0"/>
+                <w:sz w:val="24"/>
+              </w:rPr>
+              <w:t>were performed</w:t>
+            </w:r>
+            <w:proofErr w:type="gramEnd"/>
+            <w:r>
+              <w:rPr>
+                <w:rFonts w:ascii="Times New Roman" w:hAnsi="Times New Roman"/>
+                <w:color w:val="0070C0"/>
+                <w:sz w:val="24"/>
+              </w:rPr>
+              <w:t xml:space="preserve"> in a randomized one-third subsample of households; 4,421 children were not measured due to subsampling protocol or temporary absence.</w:t>
             </w:r>
           </w:p>
           <w:p>
             <w:r>
               <w:rPr>
                 <w:rFonts w:ascii="Times New Roman" w:hAnsi="Times New Roman"/>
-                <w:b w:val="0"/>
-                <w:i w:val="0"/>
-                <w:color w:val="0070C0"/>
-                <w:sz w:val="24"/>
-              </w:rPr>
-              <w:t>4. Biologically Implausible Flags: Measured children were screened against WHO biological plausibility cutoffs (|HAZ| ≤ 6, |WHZ| ≤ 5, |WAZ| ≤ 5). Zero children exceeded plausible limits.</w:t>
+                <w:color w:val="0070C0"/>
+                <w:sz w:val="24"/>
+              </w:rPr>
+              <w:t xml:space="preserve">4. Biologically Implausible Flags: Measured children were screened against WHO biological </w:t>
+            </w:r>
+            <w:r>
+              <w:rPr>
+                <w:rFonts w:ascii="Times New Roman" w:hAnsi="Times New Roman"/>
+                <w:color w:val="0070C0"/>
+                <w:sz w:val="24"/>
+              </w:rPr>
+              <w:t xml:space="preserve">plausibility cutoffs (|HAZ| ≤ 6, |WHZ| ≤ 5, </w:t>
+            </w:r>
+            <w:proofErr w:type="gramStart"/>
+            <w:r>
+              <w:rPr>
+                <w:rFonts w:ascii="Times New Roman" w:hAnsi="Times New Roman"/>
+                <w:color w:val="0070C0"/>
+                <w:sz w:val="24"/>
+              </w:rPr>
+              <w:t>|</w:t>
+            </w:r>
+            <w:proofErr w:type="gramEnd"/>
+            <w:r>
+              <w:rPr>
+                <w:rFonts w:ascii="Times New Roman" w:hAnsi="Times New Roman"/>
+                <w:color w:val="0070C0"/>
+                <w:sz w:val="24"/>
+              </w:rPr>
+              <w:t>WAZ| ≤ 5). Zero children exceeded plausible limits.</w:t>
             </w:r>
           </w:p>
           <w:p>
             <w:r>
               <w:rPr>
                 <w:rFonts w:ascii="Times New Roman" w:hAnsi="Times New Roman"/>
-                <w:b w:val="0"/>
-                <w:i w:val="0"/>
                 <w:color w:val="0070C0"/>
                 <w:sz w:val="24"/>
               </w:rPr>
@@ -1728,12 +2446,20 @@
             <w:r>
               <w:rPr>
                 <w:rFonts w:ascii="Times New Roman" w:hAnsi="Times New Roman"/>
-                <w:b w:val="0"/>
                 <w:i/>
                 <w:color w:val="0070C0"/>
                 <w:sz w:val="24"/>
               </w:rPr>
-              <w:t>Section 2.1 (Page 5, Lines 140–164); Figure 2 (Page 6, Lines 165–167).</w:t>
+              <w:t xml:space="preserve">Section 2.1 (Page 5, </w:t>
+            </w:r>
+            <w:r>
+              <w:rPr>
+                <w:rFonts w:ascii="Times New Roman" w:hAnsi="Times New Roman"/>
+                <w:i/>
+                <w:color w:val="0070C0"/>
+                <w:sz w:val="24"/>
+              </w:rPr>
+              <w:t>Lines 140–164); Figure 2 (Page 6, Lines 165–167).</w:t>
             </w:r>
           </w:p>
         </w:tc>
@@ -1793,8 +2519,9 @@
                 <w:sz w:val="24"/>
                 <w:szCs w:val="24"/>
               </w:rPr>
-              <w:t xml:space="preserve">Choice of the multilevel model: The authors </w:t>
-            </w:r>
+              <w:t xml:space="preserve">Choice of the multilevel model: The authors thoughtfully applied a three-level model, accounting for clustering at both the community (PSU) and household levels. However, in BDHS data, many households have only one eligible child... discuss whether household-level clustering </w:t>
+            </w:r>
+            <w:proofErr w:type="gramStart"/>
             <w:r>
               <w:rPr>
                 <w:rFonts w:ascii="Times New Roman" w:hAnsi="Times New Roman"/>
@@ -1802,7 +2529,17 @@
                 <w:sz w:val="24"/>
                 <w:szCs w:val="24"/>
               </w:rPr>
-              <w:t>thoughtfully applied a three-level model, accounting for clustering at both the community (PSU) and household levels. However, in BDHS data, many households have only one eligible child... discuss whether household-level clustering is adequately supported.</w:t>
+              <w:t>is adequately supported</w:t>
+            </w:r>
+            <w:proofErr w:type="gramEnd"/>
+            <w:r>
+              <w:rPr>
+                <w:rFonts w:ascii="Times New Roman" w:hAnsi="Times New Roman"/>
+                <w:color w:val="000000"/>
+                <w:sz w:val="24"/>
+                <w:szCs w:val="24"/>
+              </w:rPr>
+              <w:t>.</w:t>
             </w:r>
           </w:p>
         </w:tc>
@@ -1845,28 +2582,49 @@
                 <w:szCs w:val="24"/>
               </w:rPr>
             </w:pPr>
-            <w:r/>
-            <w:r>
-              <w:rPr>
-                <w:rFonts w:ascii="Times New Roman" w:hAnsi="Times New Roman"/>
-                <w:b w:val="0"/>
-                <w:i w:val="0"/>
-                <w:color w:val="0070C0"/>
-                <w:sz w:val="24"/>
-              </w:rPr>
-              <w:t>We are grateful to Reviewer 2 for this perceptive statistical insight. In our analytical sample of 4,087 children, 3,252 out of 3,664 households (88.8%) contributed only a single child (mean: 1.18 children per household). Fitting a three-level model (child nested in household nested in community) resulted in singular fit with near-zero household-level variance (variance &lt; 0.0001).</w:t>
+            <w:r>
+              <w:rPr>
+                <w:rFonts w:ascii="Times New Roman" w:hAnsi="Times New Roman"/>
+                <w:color w:val="0070C0"/>
+                <w:sz w:val="24"/>
+              </w:rPr>
+              <w:t>We are grateful to Reviewer 2 for this perceptive statistical insight. In our analytical sample of 4,087 children, 3,252 out of 3,664 households (88.8%) contributed only a single child (</w:t>
+            </w:r>
+            <w:proofErr w:type="gramStart"/>
+            <w:r>
+              <w:rPr>
+                <w:rFonts w:ascii="Times New Roman" w:hAnsi="Times New Roman"/>
+                <w:color w:val="0070C0"/>
+                <w:sz w:val="24"/>
+              </w:rPr>
+              <w:t>mean:</w:t>
+            </w:r>
+            <w:proofErr w:type="gramEnd"/>
+            <w:r>
+              <w:rPr>
+                <w:rFonts w:ascii="Times New Roman" w:hAnsi="Times New Roman"/>
+                <w:color w:val="0070C0"/>
+                <w:sz w:val="24"/>
+              </w:rPr>
+              <w:t xml:space="preserve"> 1.18 children per household). Fitting a three-level model (child nested in household nested in community) resulted in singular fit with near-zero household-level variance (variance &lt; 0.0001).</w:t>
             </w:r>
           </w:p>
           <w:p>
             <w:r>
               <w:rPr>
                 <w:rFonts w:ascii="Times New Roman" w:hAnsi="Times New Roman"/>
-                <w:b w:val="0"/>
-                <w:i w:val="0"/>
-                <w:color w:val="0070C0"/>
-                <w:sz w:val="24"/>
-              </w:rPr>
-              <w:t>Consequently, we fitted a parsimonious and statistically stable two-level random-intercept logistic model (Level 1: individual child, Level 2: community cluster/PSU across 670 clusters). Likelihood Ratio Tests confirmed highly significant community-level clustering for stunting (chi2 = 16.36, p &lt; 0.001) and underweight (chi2 = 10.07, p &lt; 0.001).</w:t>
+                <w:color w:val="0070C0"/>
+                <w:sz w:val="24"/>
+              </w:rPr>
+              <w:t>Consequently, we fitted a parsimonious and statistically stable two-level random-intercept logistic model (Level 1: individual child, Level 2: community cluster/PSU across 670 clusters). Likelihood Ratio Tests confir</w:t>
+            </w:r>
+            <w:r>
+              <w:rPr>
+                <w:rFonts w:ascii="Times New Roman" w:hAnsi="Times New Roman"/>
+                <w:color w:val="0070C0"/>
+                <w:sz w:val="24"/>
+              </w:rPr>
+              <w:t>med highly significant community-level clustering for stunting (chi2 = 16.36, p &lt; 0.001) and underweight (chi2 = 10.07, p &lt; 0.001).</w:t>
             </w:r>
           </w:p>
           <w:p>
@@ -1883,7 +2641,6 @@
             <w:r>
               <w:rPr>
                 <w:rFonts w:ascii="Times New Roman" w:hAnsi="Times New Roman"/>
-                <w:b w:val="0"/>
                 <w:i/>
                 <w:color w:val="0070C0"/>
                 <w:sz w:val="24"/>
@@ -1958,16 +2715,7 @@
                 <w:szCs w:val="24"/>
               </w:rPr>
               <w:lastRenderedPageBreak/>
-              <w:t>interpretation: The manuscript discusses AIC, BIC, and log-likelihood across models. In some cases, Model II appears to have a lower AIC than Model III</w:t>
-            </w:r>
-            <w:r>
-              <w:rPr>
-                <w:rFonts w:ascii="Times New Roman" w:hAnsi="Times New Roman"/>
-                <w:color w:val="000000"/>
-                <w:sz w:val="24"/>
-                <w:szCs w:val="24"/>
-              </w:rPr>
-              <w:t>, which would usually make it the preferred model. If the authors choose to focus on Model III, they should explain the rationale.</w:t>
+              <w:t>interpretation: The manuscript discusses AIC, BIC, and log-likelihood across models. In some cases, Model II appears to have a lower AIC than Model III, which would usually make it the preferred model. If the authors choose to focus on Model III, they should explain the rationale.</w:t>
             </w:r>
           </w:p>
         </w:tc>
@@ -2011,12 +2759,9 @@
                 <w:szCs w:val="24"/>
               </w:rPr>
             </w:pPr>
-            <w:r/>
-            <w:r>
-              <w:rPr>
-                <w:rFonts w:ascii="Times New Roman" w:hAnsi="Times New Roman"/>
-                <w:b w:val="0"/>
-                <w:i w:val="0"/>
+            <w:r>
+              <w:rPr>
+                <w:rFonts w:ascii="Times New Roman" w:hAnsi="Times New Roman"/>
                 <w:color w:val="0070C0"/>
                 <w:sz w:val="24"/>
               </w:rPr>
@@ -2037,7 +2782,6 @@
             <w:r>
               <w:rPr>
                 <w:rFonts w:ascii="Times New Roman" w:hAnsi="Times New Roman"/>
-                <w:b w:val="0"/>
                 <w:i/>
                 <w:color w:val="0070C0"/>
                 <w:sz w:val="24"/>
@@ -2102,8 +2846,9 @@
                 <w:sz w:val="24"/>
                 <w:szCs w:val="24"/>
               </w:rPr>
-              <w:t>Interpretation of associations: Because this is a cross-sectional study, causal language should be avoided. The manuscript currently uses terms like 'impact,' 'influence,' or 'effects' in several places. These should be repla</w:t>
-            </w:r>
+              <w:t xml:space="preserve">Interpretation of associations: Because this is a cross-sectional study, causal language </w:t>
+            </w:r>
+            <w:proofErr w:type="gramStart"/>
             <w:r>
               <w:rPr>
                 <w:rFonts w:ascii="Times New Roman" w:hAnsi="Times New Roman"/>
@@ -2111,7 +2856,37 @@
                 <w:sz w:val="24"/>
                 <w:szCs w:val="24"/>
               </w:rPr>
-              <w:t>ced with words like 'associated with' or 'odds of.'</w:t>
+              <w:t>should be avoided</w:t>
+            </w:r>
+            <w:proofErr w:type="gramEnd"/>
+            <w:r>
+              <w:rPr>
+                <w:rFonts w:ascii="Times New Roman" w:hAnsi="Times New Roman"/>
+                <w:color w:val="000000"/>
+                <w:sz w:val="24"/>
+                <w:szCs w:val="24"/>
+              </w:rPr>
+              <w:t xml:space="preserve">. The manuscript currently uses terms like 'impact,' 'influence,' or 'effects' in several places. These </w:t>
+            </w:r>
+            <w:proofErr w:type="gramStart"/>
+            <w:r>
+              <w:rPr>
+                <w:rFonts w:ascii="Times New Roman" w:hAnsi="Times New Roman"/>
+                <w:color w:val="000000"/>
+                <w:sz w:val="24"/>
+                <w:szCs w:val="24"/>
+              </w:rPr>
+              <w:t>should be replaced</w:t>
+            </w:r>
+            <w:proofErr w:type="gramEnd"/>
+            <w:r>
+              <w:rPr>
+                <w:rFonts w:ascii="Times New Roman" w:hAnsi="Times New Roman"/>
+                <w:color w:val="000000"/>
+                <w:sz w:val="24"/>
+                <w:szCs w:val="24"/>
+              </w:rPr>
+              <w:t xml:space="preserve"> with words like 'associated with' or 'odds of.'</w:t>
             </w:r>
           </w:p>
         </w:tc>
@@ -2154,12 +2929,9 @@
                 <w:szCs w:val="24"/>
               </w:rPr>
             </w:pPr>
-            <w:r/>
-            <w:r>
-              <w:rPr>
-                <w:rFonts w:ascii="Times New Roman" w:hAnsi="Times New Roman"/>
-                <w:b w:val="0"/>
-                <w:i w:val="0"/>
+            <w:r>
+              <w:rPr>
+                <w:rFonts w:ascii="Times New Roman" w:hAnsi="Times New Roman"/>
                 <w:color w:val="0070C0"/>
                 <w:sz w:val="24"/>
               </w:rPr>
@@ -2180,7 +2952,6 @@
             <w:r>
               <w:rPr>
                 <w:rFonts w:ascii="Times New Roman" w:hAnsi="Times New Roman"/>
-                <w:b w:val="0"/>
                 <w:i/>
                 <w:color w:val="0070C0"/>
                 <w:sz w:val="24"/>
@@ -2236,25 +3007,38 @@
                 <w:sz w:val="24"/>
                 <w:szCs w:val="24"/>
               </w:rPr>
-              <w:t xml:space="preserve">Bivariate chi-square statistics reporting: </w:t>
-            </w:r>
-            <w:r>
-              <w:rPr>
-                <w:rFonts w:ascii="Times New Roman" w:hAnsi="Times New Roman"/>
+              <w:t xml:space="preserve">Bivariate chi-square statistics </w:t>
+            </w:r>
+            <w:proofErr w:type="gramStart"/>
+            <w:r>
+              <w:rPr>
+                <w:rFonts w:ascii="Times New Roman" w:hAnsi="Times New Roman"/>
+                <w:b/>
                 <w:color w:val="000000"/>
                 <w:sz w:val="24"/>
                 <w:szCs w:val="24"/>
               </w:rPr>
-              <w:t>Bivariate analysis:</w:t>
-            </w:r>
-            <w:r>
-              <w:rPr>
-                <w:rFonts w:ascii="Times New Roman" w:hAnsi="Times New Roman"/>
+              <w:t>reporting:</w:t>
+            </w:r>
+            <w:proofErr w:type="gramEnd"/>
+            <w:r>
+              <w:rPr>
+                <w:rFonts w:ascii="Times New Roman" w:hAnsi="Times New Roman"/>
+                <w:b/>
                 <w:color w:val="000000"/>
                 <w:sz w:val="24"/>
                 <w:szCs w:val="24"/>
               </w:rPr>
-              <w:t xml:space="preserve"> Table 2 provides chi-square statistics along with significance symbols, but it would be helpful to also report the degrees of freedom and p-values.</w:t>
+              <w:t xml:space="preserve"> </w:t>
+            </w:r>
+            <w:r>
+              <w:rPr>
+                <w:rFonts w:ascii="Times New Roman" w:hAnsi="Times New Roman"/>
+                <w:color w:val="000000"/>
+                <w:sz w:val="24"/>
+                <w:szCs w:val="24"/>
+              </w:rPr>
+              <w:t>Bivariate analysis: Table 2 provides chi-square statistics along with significance symbols, but it would be helpful to also report the degrees of freedom and p-values.</w:t>
             </w:r>
           </w:p>
         </w:tc>
@@ -2297,16 +3081,49 @@
                 <w:szCs w:val="24"/>
               </w:rPr>
             </w:pPr>
-            <w:r/>
-            <w:r>
-              <w:rPr>
-                <w:rFonts w:ascii="Times New Roman" w:hAnsi="Times New Roman"/>
-                <w:b w:val="0"/>
-                <w:i w:val="0"/>
-                <w:color w:val="0070C0"/>
-                <w:sz w:val="24"/>
-              </w:rPr>
-              <w:t>Table 2 has been updated to report Pearson Chi-square test statistics, degrees of freedom (df), and exact p-values for all 20 explanatory variables across stunting, wasting, and underweight.</w:t>
+            <w:r>
+              <w:rPr>
+                <w:rFonts w:ascii="Times New Roman" w:hAnsi="Times New Roman"/>
+                <w:color w:val="0070C0"/>
+                <w:sz w:val="24"/>
+              </w:rPr>
+              <w:t xml:space="preserve">Table 2 </w:t>
+            </w:r>
+            <w:proofErr w:type="gramStart"/>
+            <w:r>
+              <w:rPr>
+                <w:rFonts w:ascii="Times New Roman" w:hAnsi="Times New Roman"/>
+                <w:color w:val="0070C0"/>
+                <w:sz w:val="24"/>
+              </w:rPr>
+              <w:t>has been updated</w:t>
+            </w:r>
+            <w:proofErr w:type="gramEnd"/>
+            <w:r>
+              <w:rPr>
+                <w:rFonts w:ascii="Times New Roman" w:hAnsi="Times New Roman"/>
+                <w:color w:val="0070C0"/>
+                <w:sz w:val="24"/>
+              </w:rPr>
+              <w:t xml:space="preserve"> to report Pearson Chi-square test statistics, degrees of freedom (</w:t>
+            </w:r>
+            <w:proofErr w:type="spellStart"/>
+            <w:r>
+              <w:rPr>
+                <w:rFonts w:ascii="Times New Roman" w:hAnsi="Times New Roman"/>
+                <w:color w:val="0070C0"/>
+                <w:sz w:val="24"/>
+              </w:rPr>
+              <w:t>df</w:t>
+            </w:r>
+            <w:proofErr w:type="spellEnd"/>
+            <w:r>
+              <w:rPr>
+                <w:rFonts w:ascii="Times New Roman" w:hAnsi="Times New Roman"/>
+                <w:color w:val="0070C0"/>
+                <w:sz w:val="24"/>
+              </w:rPr>
+              <w:t>), and exact p-values for all 20 explanatory variables across stunting, wasting, and underweight.</w:t>
             </w:r>
           </w:p>
           <w:p>
@@ -2323,7 +3140,6 @@
             <w:r>
               <w:rPr>
                 <w:rFonts w:ascii="Times New Roman" w:hAnsi="Times New Roman"/>
-                <w:b w:val="0"/>
                 <w:i/>
                 <w:color w:val="0070C0"/>
                 <w:sz w:val="24"/>
@@ -2388,8 +3204,9 @@
                 <w:sz w:val="24"/>
                 <w:szCs w:val="24"/>
               </w:rPr>
-              <w:t>Potential confounding: The selection</w:t>
-            </w:r>
+              <w:t xml:space="preserve">Potential confounding: The selection of variables </w:t>
+            </w:r>
+            <w:proofErr w:type="gramStart"/>
             <w:r>
               <w:rPr>
                 <w:rFonts w:ascii="Times New Roman" w:hAnsi="Times New Roman"/>
@@ -2397,7 +3214,17 @@
                 <w:sz w:val="24"/>
                 <w:szCs w:val="24"/>
               </w:rPr>
-              <w:t xml:space="preserve"> of variables was based on the UNICEF framework, presumably... Discuss unmeasured confounders like dietary diversity and maternal nutrition.</w:t>
+              <w:t>was based</w:t>
+            </w:r>
+            <w:proofErr w:type="gramEnd"/>
+            <w:r>
+              <w:rPr>
+                <w:rFonts w:ascii="Times New Roman" w:hAnsi="Times New Roman"/>
+                <w:color w:val="000000"/>
+                <w:sz w:val="24"/>
+                <w:szCs w:val="24"/>
+              </w:rPr>
+              <w:t xml:space="preserve"> on the UNICEF framework, presumably... Discuss unmeasured confounders like dietary diversity and maternal nutrition.</w:t>
             </w:r>
           </w:p>
         </w:tc>
@@ -2440,12 +3267,9 @@
                 <w:szCs w:val="24"/>
               </w:rPr>
             </w:pPr>
-            <w:r/>
-            <w:r>
-              <w:rPr>
-                <w:rFonts w:ascii="Times New Roman" w:hAnsi="Times New Roman"/>
-                <w:b w:val="0"/>
-                <w:i w:val="0"/>
+            <w:r>
+              <w:rPr>
+                <w:rFonts w:ascii="Times New Roman" w:hAnsi="Times New Roman"/>
                 <w:color w:val="0070C0"/>
                 <w:sz w:val="24"/>
               </w:rPr>
@@ -2461,17 +3285,36 @@
                 <w:color w:val="0070C0"/>
                 <w:sz w:val="24"/>
               </w:rPr>
-              <w:t xml:space="preserve">Modifications in Manuscript: </w:t>
-            </w:r>
-            <w:r>
-              <w:rPr>
-                <w:rFonts w:ascii="Times New Roman" w:hAnsi="Times New Roman"/>
-                <w:b w:val="0"/>
+              <w:t>Mod</w:t>
+            </w:r>
+            <w:r>
+              <w:rPr>
+                <w:rFonts w:ascii="Times New Roman" w:hAnsi="Times New Roman"/>
+                <w:b/>
                 <w:i/>
                 <w:color w:val="0070C0"/>
                 <w:sz w:val="24"/>
               </w:rPr>
-              <w:t>Section 4 (Discussion: Strengths and limitations, Pages 19–20, Lines 443–454).</w:t>
+              <w:t xml:space="preserve">ifications in Manuscript: </w:t>
+            </w:r>
+            <w:r>
+              <w:rPr>
+                <w:rFonts w:ascii="Times New Roman" w:hAnsi="Times New Roman"/>
+                <w:i/>
+                <w:color w:val="0070C0"/>
+                <w:sz w:val="24"/>
+              </w:rPr>
+              <w:t xml:space="preserve">Section 4 (Discussion: Strengths and </w:t>
+            </w:r>
+            <w:r>
+              <w:rPr>
+                <w:rFonts w:ascii="Times New Roman" w:hAnsi="Times New Roman"/>
+                <w:i/>
+                <w:color w:val="0070C0"/>
+                <w:sz w:val="24"/>
+              </w:rPr>
+              <w:lastRenderedPageBreak/>
+              <w:t>limitations, Pages 19–20, Lines 443–454).</w:t>
             </w:r>
           </w:p>
         </w:tc>
@@ -2515,7 +3358,6 @@
                 <w:sz w:val="24"/>
                 <w:szCs w:val="24"/>
               </w:rPr>
-              <w:lastRenderedPageBreak/>
               <w:t>Reviewer 3 Comments (Major Revisions)</w:t>
             </w:r>
           </w:p>
@@ -2576,8 +3418,9 @@
                 <w:sz w:val="24"/>
                 <w:szCs w:val="24"/>
               </w:rPr>
-              <w:t xml:space="preserve">Covariate adjustment: Child age is absent from the models despite its relevance to nutrition outcomes. </w:t>
-            </w:r>
+              <w:t xml:space="preserve">Covariate adjustment: Child age is absent from the models despite its relevance to nutrition outcomes. Incorporating child age into the models is critical. In addition, living children and children ever born are likely to be highly collinear, and birth order </w:t>
+            </w:r>
+            <w:proofErr w:type="gramStart"/>
             <w:r>
               <w:rPr>
                 <w:rFonts w:ascii="Times New Roman" w:hAnsi="Times New Roman"/>
@@ -2585,8 +3428,9 @@
                 <w:sz w:val="24"/>
                 <w:szCs w:val="24"/>
               </w:rPr>
-              <w:t>Incorporating child age into the models is critical. In addition, living children and children ever born are likely to be highly collinear, and birth order may also overlap with these variables. The authors should consider collinearity diagnostics and sens</w:t>
-            </w:r>
+              <w:t>may also</w:t>
+            </w:r>
+            <w:proofErr w:type="gramEnd"/>
             <w:r>
               <w:rPr>
                 <w:rFonts w:ascii="Times New Roman" w:hAnsi="Times New Roman"/>
@@ -2594,7 +3438,7 @@
                 <w:sz w:val="24"/>
                 <w:szCs w:val="24"/>
               </w:rPr>
-              <w:t>itivity analyses.</w:t>
+              <w:t xml:space="preserve"> overlap with these variables. The authors should consider collinearity diagnostics and sensitivity analyses.</w:t>
             </w:r>
           </w:p>
         </w:tc>
@@ -2639,12 +3483,9 @@
                 <w:szCs w:val="24"/>
               </w:rPr>
             </w:pPr>
-            <w:r/>
-            <w:r>
-              <w:rPr>
-                <w:rFonts w:ascii="Times New Roman" w:hAnsi="Times New Roman"/>
-                <w:b w:val="0"/>
-                <w:i w:val="0"/>
+            <w:r>
+              <w:rPr>
+                <w:rFonts w:ascii="Times New Roman" w:hAnsi="Times New Roman"/>
                 <w:color w:val="0070C0"/>
                 <w:sz w:val="24"/>
               </w:rPr>
@@ -2656,21 +3497,45 @@
               <w:rPr>
                 <w:rFonts w:ascii="Times New Roman" w:hAnsi="Times New Roman"/>
                 <w:b/>
-                <w:i w:val="0"/>
-                <w:color w:val="0070C0"/>
-                <w:sz w:val="24"/>
-              </w:rPr>
-              <w:t>1. Full Integration of Child Age:</w:t>
-            </w:r>
-            <w:r>
-              <w:rPr>
-                <w:rFonts w:ascii="Times New Roman" w:hAnsi="Times New Roman"/>
-                <w:b w:val="0"/>
-                <w:i w:val="0"/>
-                <w:color w:val="0070C0"/>
-                <w:sz w:val="24"/>
-              </w:rPr>
-              <w:t xml:space="preserve"> Child age in completed months has been incorporated across all descriptive, bivariate, and multilevel models (categorized into: 0–11, 12–23, 24–35, 36–47, and 48–59 months). This resolved a major omission in earlier drafts.</w:t>
+                <w:color w:val="0070C0"/>
+                <w:sz w:val="24"/>
+              </w:rPr>
+              <w:t>1. Full Integrat</w:t>
+            </w:r>
+            <w:r>
+              <w:rPr>
+                <w:rFonts w:ascii="Times New Roman" w:hAnsi="Times New Roman"/>
+                <w:b/>
+                <w:color w:val="0070C0"/>
+                <w:sz w:val="24"/>
+              </w:rPr>
+              <w:t>ion of Child Age:</w:t>
+            </w:r>
+            <w:r>
+              <w:rPr>
+                <w:rFonts w:ascii="Times New Roman" w:hAnsi="Times New Roman"/>
+                <w:color w:val="0070C0"/>
+                <w:sz w:val="24"/>
+              </w:rPr>
+              <w:t xml:space="preserve"> Child age in completed months </w:t>
+            </w:r>
+            <w:proofErr w:type="gramStart"/>
+            <w:r>
+              <w:rPr>
+                <w:rFonts w:ascii="Times New Roman" w:hAnsi="Times New Roman"/>
+                <w:color w:val="0070C0"/>
+                <w:sz w:val="24"/>
+              </w:rPr>
+              <w:t>has been incorporated</w:t>
+            </w:r>
+            <w:proofErr w:type="gramEnd"/>
+            <w:r>
+              <w:rPr>
+                <w:rFonts w:ascii="Times New Roman" w:hAnsi="Times New Roman"/>
+                <w:color w:val="0070C0"/>
+                <w:sz w:val="24"/>
+              </w:rPr>
+              <w:t xml:space="preserve"> across all descriptive, bivariate, and multilevel models (categorized into: 0–11, 12–23, 24–35, 36–47, and 48–59 months). This resolved a major omission in earlier drafts.</w:t>
             </w:r>
           </w:p>
           <w:p>
@@ -2678,17 +3543,23 @@
               <w:rPr>
                 <w:rFonts w:ascii="Times New Roman" w:hAnsi="Times New Roman"/>
                 <w:b/>
-                <w:i w:val="0"/>
-                <w:color w:val="0070C0"/>
-                <w:sz w:val="24"/>
-              </w:rPr>
-              <w:t>2. Substantial Model Fit Improvement:</w:t>
-            </w:r>
-            <w:r>
-              <w:rPr>
-                <w:rFonts w:ascii="Times New Roman" w:hAnsi="Times New Roman"/>
-                <w:b w:val="0"/>
-                <w:i w:val="0"/>
+                <w:color w:val="0070C0"/>
+                <w:sz w:val="24"/>
+              </w:rPr>
+              <w:t>2. Substantial</w:t>
+            </w:r>
+            <w:r>
+              <w:rPr>
+                <w:rFonts w:ascii="Times New Roman" w:hAnsi="Times New Roman"/>
+                <w:b/>
+                <w:color w:val="0070C0"/>
+                <w:sz w:val="24"/>
+              </w:rPr>
+              <w:t xml:space="preserve"> Model Fit Improvement:</w:t>
+            </w:r>
+            <w:r>
+              <w:rPr>
+                <w:rFonts w:ascii="Times New Roman" w:hAnsi="Times New Roman"/>
                 <w:color w:val="0070C0"/>
                 <w:sz w:val="24"/>
               </w:rPr>
@@ -2699,12 +3570,70 @@
             <w:r>
               <w:rPr>
                 <w:rFonts w:ascii="Times New Roman" w:hAnsi="Times New Roman"/>
-                <w:b w:val="0"/>
-                <w:i w:val="0"/>
-                <w:color w:val="0070C0"/>
-                <w:sz w:val="24"/>
-              </w:rPr>
-              <w:t>3. Collinearity Diagnostics &amp; Sensitivity Analysis: Generalized Variance Inflation Factor (GVIF) diagnostics (Table S4) confirmed that multicollinearity is absent across all socioeconomic and environmental assets (all adjusted GVIF^(1/(2*df)) &lt; 1.40; raw GVIF &lt; 2.8). Collinearity was evaluated between children ever born (raw GVIF = 15.11, adjusted GVIF = 3.887) and living children (raw GVIF = 8.98, adjusted GVIF = 2.997). A sensitivity analysis omitting living children confirmed that all model estimates remained robust without altering any conclusions.</w:t>
+                <w:color w:val="0070C0"/>
+                <w:sz w:val="24"/>
+              </w:rPr>
+              <w:t>3. Collinearit</w:t>
+            </w:r>
+            <w:r>
+              <w:rPr>
+                <w:rFonts w:ascii="Times New Roman" w:hAnsi="Times New Roman"/>
+                <w:color w:val="0070C0"/>
+                <w:sz w:val="24"/>
+              </w:rPr>
+              <w:t>y Diagnostics &amp; Sensitivity Analysis: Generalized Variance Inflation Factor (GVIF) diagnostics (Table S4) confirmed that multicollinearity is absent across all socioeconomic and environmental assets (all adjusted GVIF</w:t>
+            </w:r>
+            <w:proofErr w:type="gramStart"/>
+            <w:r>
+              <w:rPr>
+                <w:rFonts w:ascii="Times New Roman" w:hAnsi="Times New Roman"/>
+                <w:color w:val="0070C0"/>
+                <w:sz w:val="24"/>
+              </w:rPr>
+              <w:t>^(</w:t>
+            </w:r>
+            <w:proofErr w:type="gramEnd"/>
+            <w:r>
+              <w:rPr>
+                <w:rFonts w:ascii="Times New Roman" w:hAnsi="Times New Roman"/>
+                <w:color w:val="0070C0"/>
+                <w:sz w:val="24"/>
+              </w:rPr>
+              <w:t>1/(2*</w:t>
+            </w:r>
+            <w:proofErr w:type="spellStart"/>
+            <w:r>
+              <w:rPr>
+                <w:rFonts w:ascii="Times New Roman" w:hAnsi="Times New Roman"/>
+                <w:color w:val="0070C0"/>
+                <w:sz w:val="24"/>
+              </w:rPr>
+              <w:t>df</w:t>
+            </w:r>
+            <w:proofErr w:type="spellEnd"/>
+            <w:r>
+              <w:rPr>
+                <w:rFonts w:ascii="Times New Roman" w:hAnsi="Times New Roman"/>
+                <w:color w:val="0070C0"/>
+                <w:sz w:val="24"/>
+              </w:rPr>
+              <w:t>)) &lt; 1.40; raw GVIF &lt; 2.8). Co</w:t>
+            </w:r>
+            <w:r>
+              <w:rPr>
+                <w:rFonts w:ascii="Times New Roman" w:hAnsi="Times New Roman"/>
+                <w:color w:val="0070C0"/>
+                <w:sz w:val="24"/>
+              </w:rPr>
+              <w:t>llinearity was evaluated between children ever born (raw GVIF = 15.11, adjusted GVIF = 3.887) and living children (raw GVIF = 8.98, adjusted GVIF = 2.997). A sensitivity analysis omitting living children confirmed that all model estimates remained robust w</w:t>
+            </w:r>
+            <w:r>
+              <w:rPr>
+                <w:rFonts w:ascii="Times New Roman" w:hAnsi="Times New Roman"/>
+                <w:color w:val="0070C0"/>
+                <w:sz w:val="24"/>
+              </w:rPr>
+              <w:t>ithout altering any conclusions.</w:t>
             </w:r>
           </w:p>
           <w:p>
@@ -2721,7 +3650,6 @@
             <w:r>
               <w:rPr>
                 <w:rFonts w:ascii="Times New Roman" w:hAnsi="Times New Roman"/>
-                <w:b w:val="0"/>
                 <w:i/>
                 <w:color w:val="0070C0"/>
                 <w:sz w:val="24"/>
@@ -2786,7 +3714,27 @@
                 <w:sz w:val="24"/>
                 <w:szCs w:val="24"/>
               </w:rPr>
-              <w:t>Survey design: Please explain how weights, strata, and primary sampling units were handled in the descriptive and multilevel models.</w:t>
+              <w:t xml:space="preserve">Survey design: Please explain how weights, strata, and primary sampling units </w:t>
+            </w:r>
+            <w:proofErr w:type="gramStart"/>
+            <w:r>
+              <w:rPr>
+                <w:rFonts w:ascii="Times New Roman" w:hAnsi="Times New Roman"/>
+                <w:color w:val="000000"/>
+                <w:sz w:val="24"/>
+                <w:szCs w:val="24"/>
+              </w:rPr>
+              <w:t>were handled</w:t>
+            </w:r>
+            <w:proofErr w:type="gramEnd"/>
+            <w:r>
+              <w:rPr>
+                <w:rFonts w:ascii="Times New Roman" w:hAnsi="Times New Roman"/>
+                <w:color w:val="000000"/>
+                <w:sz w:val="24"/>
+                <w:szCs w:val="24"/>
+              </w:rPr>
+              <w:t xml:space="preserve"> in the descriptive and multilevel models.</w:t>
             </w:r>
           </w:p>
         </w:tc>
@@ -2829,16 +3777,49 @@
                 <w:szCs w:val="24"/>
               </w:rPr>
             </w:pPr>
-            <w:r/>
-            <w:r>
-              <w:rPr>
-                <w:rFonts w:ascii="Times New Roman" w:hAnsi="Times New Roman"/>
-                <w:b w:val="0"/>
-                <w:i w:val="0"/>
-                <w:color w:val="0070C0"/>
-                <w:sz w:val="24"/>
-              </w:rPr>
-              <w:t>We have expanded Section 2.4 and 2.5: Normalized sampling weights (Weight = V005 / 1,000,000) were incorporated into all descriptive and bivariate calculations. In multilevel logistic models, PSU clustering is directly modeled via community random intercepts (1 | Cluster_ID) across 670 clusters, while survey strata (division and residence) are included as fixed-effect covariates in Model III.</w:t>
+            <w:r>
+              <w:rPr>
+                <w:rFonts w:ascii="Times New Roman" w:hAnsi="Times New Roman"/>
+                <w:color w:val="0070C0"/>
+                <w:sz w:val="24"/>
+              </w:rPr>
+              <w:t xml:space="preserve">We have expanded Section 2.4 and 2.5: Normalized sampling weights (Weight = V005 / 1,000,000) </w:t>
+            </w:r>
+            <w:proofErr w:type="gramStart"/>
+            <w:r>
+              <w:rPr>
+                <w:rFonts w:ascii="Times New Roman" w:hAnsi="Times New Roman"/>
+                <w:color w:val="0070C0"/>
+                <w:sz w:val="24"/>
+              </w:rPr>
+              <w:t>were incorporated</w:t>
+            </w:r>
+            <w:proofErr w:type="gramEnd"/>
+            <w:r>
+              <w:rPr>
+                <w:rFonts w:ascii="Times New Roman" w:hAnsi="Times New Roman"/>
+                <w:color w:val="0070C0"/>
+                <w:sz w:val="24"/>
+              </w:rPr>
+              <w:t xml:space="preserve"> into all descriptive and bivariate calculations. In multilevel logistic models, PSU clustering is directly modeled via community random intercepts (1 | </w:t>
+            </w:r>
+            <w:proofErr w:type="spellStart"/>
+            <w:r>
+              <w:rPr>
+                <w:rFonts w:ascii="Times New Roman" w:hAnsi="Times New Roman"/>
+                <w:color w:val="0070C0"/>
+                <w:sz w:val="24"/>
+              </w:rPr>
+              <w:t>Cluster_ID</w:t>
+            </w:r>
+            <w:proofErr w:type="spellEnd"/>
+            <w:r>
+              <w:rPr>
+                <w:rFonts w:ascii="Times New Roman" w:hAnsi="Times New Roman"/>
+                <w:color w:val="0070C0"/>
+                <w:sz w:val="24"/>
+              </w:rPr>
+              <w:t>) across 670 clusters, while survey strata (division and residence) are included as fixed-effect covariates in Model III.</w:t>
             </w:r>
           </w:p>
           <w:p>
@@ -2855,7 +3836,6 @@
             <w:r>
               <w:rPr>
                 <w:rFonts w:ascii="Times New Roman" w:hAnsi="Times New Roman"/>
-                <w:b w:val="0"/>
                 <w:i/>
                 <w:color w:val="0070C0"/>
                 <w:sz w:val="24"/>
@@ -2920,7 +3900,7 @@
                 <w:sz w:val="24"/>
                 <w:szCs w:val="24"/>
               </w:rPr>
-              <w:t>Multilevel specification: The null-model AIC and l</w:t>
+              <w:t xml:space="preserve">Multilevel specification: The null-model AIC and log-likelihood values appear to imply that the model is single-level or that the equation needs clarification. </w:t>
             </w:r>
             <w:r>
               <w:rPr>
@@ -2929,7 +3909,8 @@
                 <w:sz w:val="24"/>
                 <w:szCs w:val="24"/>
               </w:rPr>
-              <w:t>og-likelihood values appear to imply that the model is single-level or that the equation needs clarification. Please ensure the equation accurately reflects the random intercept model.</w:t>
+              <w:lastRenderedPageBreak/>
+              <w:t>Please ensure the equation accurately reflects the random intercept model.</w:t>
             </w:r>
           </w:p>
         </w:tc>
@@ -2955,6 +3936,7 @@
                 <w:sz w:val="24"/>
                 <w:szCs w:val="24"/>
               </w:rPr>
+              <w:lastRenderedPageBreak/>
               <w:t>Response:</w:t>
             </w:r>
           </w:p>
@@ -2972,16 +3954,113 @@
                 <w:szCs w:val="24"/>
               </w:rPr>
             </w:pPr>
-            <w:r/>
-            <w:r>
-              <w:rPr>
-                <w:rFonts w:ascii="Times New Roman" w:hAnsi="Times New Roman"/>
-                <w:b w:val="0"/>
-                <w:i w:val="0"/>
-                <w:color w:val="0070C0"/>
-                <w:sz w:val="24"/>
-              </w:rPr>
-              <w:t>We thank Reviewer 3 for identifying this. The statistical equation in Section 2.5 has been corrected to explicitly describe the two-level random-intercept model: logit(p_ij) = beta_0 + X_ij * beta + u_j, where u_j ~ N(0, sigma_u^2) across 670 clusters. Single-level null models were also estimated to perform formal Likelihood Ratio Tests confirming significant clustering for stunting (p &lt; 0.001) and underweight (p &lt; 0.001).</w:t>
+            <w:r>
+              <w:rPr>
+                <w:rFonts w:ascii="Times New Roman" w:hAnsi="Times New Roman"/>
+                <w:color w:val="0070C0"/>
+                <w:sz w:val="24"/>
+              </w:rPr>
+              <w:t xml:space="preserve">We thank Reviewer 3 for identifying this. The statistical equation in Section 2.5 has been corrected to explicitly describe the two-level random-intercept model: </w:t>
+            </w:r>
+            <w:proofErr w:type="gramStart"/>
+            <w:r>
+              <w:rPr>
+                <w:rFonts w:ascii="Times New Roman" w:hAnsi="Times New Roman"/>
+                <w:color w:val="0070C0"/>
+                <w:sz w:val="24"/>
+              </w:rPr>
+              <w:t>logit(</w:t>
+            </w:r>
+            <w:proofErr w:type="spellStart"/>
+            <w:proofErr w:type="gramEnd"/>
+            <w:r>
+              <w:rPr>
+                <w:rFonts w:ascii="Times New Roman" w:hAnsi="Times New Roman"/>
+                <w:color w:val="0070C0"/>
+                <w:sz w:val="24"/>
+              </w:rPr>
+              <w:t>p_ij</w:t>
+            </w:r>
+            <w:proofErr w:type="spellEnd"/>
+            <w:r>
+              <w:rPr>
+                <w:rFonts w:ascii="Times New Roman" w:hAnsi="Times New Roman"/>
+                <w:color w:val="0070C0"/>
+                <w:sz w:val="24"/>
+              </w:rPr>
+              <w:t xml:space="preserve">) = beta_0 + </w:t>
+            </w:r>
+            <w:proofErr w:type="spellStart"/>
+            <w:r>
+              <w:rPr>
+                <w:rFonts w:ascii="Times New Roman" w:hAnsi="Times New Roman"/>
+                <w:color w:val="0070C0"/>
+                <w:sz w:val="24"/>
+              </w:rPr>
+              <w:t>X_ij</w:t>
+            </w:r>
+            <w:proofErr w:type="spellEnd"/>
+            <w:r>
+              <w:rPr>
+                <w:rFonts w:ascii="Times New Roman" w:hAnsi="Times New Roman"/>
+                <w:color w:val="0070C0"/>
+                <w:sz w:val="24"/>
+              </w:rPr>
+              <w:t xml:space="preserve"> * beta + </w:t>
+            </w:r>
+            <w:proofErr w:type="spellStart"/>
+            <w:r>
+              <w:rPr>
+                <w:rFonts w:ascii="Times New Roman" w:hAnsi="Times New Roman"/>
+                <w:color w:val="0070C0"/>
+                <w:sz w:val="24"/>
+              </w:rPr>
+              <w:t>u_j</w:t>
+            </w:r>
+            <w:proofErr w:type="spellEnd"/>
+            <w:r>
+              <w:rPr>
+                <w:rFonts w:ascii="Times New Roman" w:hAnsi="Times New Roman"/>
+                <w:color w:val="0070C0"/>
+                <w:sz w:val="24"/>
+              </w:rPr>
+              <w:t xml:space="preserve">, where </w:t>
+            </w:r>
+            <w:proofErr w:type="spellStart"/>
+            <w:r>
+              <w:rPr>
+                <w:rFonts w:ascii="Times New Roman" w:hAnsi="Times New Roman"/>
+                <w:color w:val="0070C0"/>
+                <w:sz w:val="24"/>
+              </w:rPr>
+              <w:t>u_j</w:t>
+            </w:r>
+            <w:proofErr w:type="spellEnd"/>
+            <w:r>
+              <w:rPr>
+                <w:rFonts w:ascii="Times New Roman" w:hAnsi="Times New Roman"/>
+                <w:color w:val="0070C0"/>
+                <w:sz w:val="24"/>
+              </w:rPr>
+              <w:t xml:space="preserve"> ~ N(0, sigma_u^2) across 670 clusters. Single-level null models </w:t>
+            </w:r>
+            <w:proofErr w:type="gramStart"/>
+            <w:r>
+              <w:rPr>
+                <w:rFonts w:ascii="Times New Roman" w:hAnsi="Times New Roman"/>
+                <w:color w:val="0070C0"/>
+                <w:sz w:val="24"/>
+              </w:rPr>
+              <w:t>were also estimated</w:t>
+            </w:r>
+            <w:proofErr w:type="gramEnd"/>
+            <w:r>
+              <w:rPr>
+                <w:rFonts w:ascii="Times New Roman" w:hAnsi="Times New Roman"/>
+                <w:color w:val="0070C0"/>
+                <w:sz w:val="24"/>
+              </w:rPr>
+              <w:t xml:space="preserve"> to perform formal Likelihood Ratio Tests confirming significant clustering for stunting (p &lt; 0.001) and underweight (p &lt; 0.001).</w:t>
             </w:r>
           </w:p>
           <w:p>
@@ -2998,12 +4077,31 @@
             <w:r>
               <w:rPr>
                 <w:rFonts w:ascii="Times New Roman" w:hAnsi="Times New Roman"/>
-                <w:b w:val="0"/>
                 <w:i/>
                 <w:color w:val="0070C0"/>
                 <w:sz w:val="24"/>
               </w:rPr>
-              <w:t>Section 2.5 (Page 8, Lines 232–251); Table 3 (Pages 14–17, Lines 352–354); Tables S1–S3.</w:t>
+              <w:t>Section 2.5 (Page 8, Lines 232–251); Table 3 (Pages 14–17, Lines 352–354)</w:t>
+            </w:r>
+            <w:proofErr w:type="gramStart"/>
+            <w:r>
+              <w:rPr>
+                <w:rFonts w:ascii="Times New Roman" w:hAnsi="Times New Roman"/>
+                <w:i/>
+                <w:color w:val="0070C0"/>
+                <w:sz w:val="24"/>
+              </w:rPr>
+              <w:t>;</w:t>
+            </w:r>
+            <w:proofErr w:type="gramEnd"/>
+            <w:r>
+              <w:rPr>
+                <w:rFonts w:ascii="Times New Roman" w:hAnsi="Times New Roman"/>
+                <w:i/>
+                <w:color w:val="0070C0"/>
+                <w:sz w:val="24"/>
+              </w:rPr>
+              <w:t xml:space="preserve"> Tables S1–S3.</w:t>
             </w:r>
           </w:p>
         </w:tc>
@@ -3029,7 +4127,6 @@
                 <w:sz w:val="24"/>
                 <w:szCs w:val="24"/>
               </w:rPr>
-              <w:lastRenderedPageBreak/>
               <w:t>Comment 4:</w:t>
             </w:r>
           </w:p>
@@ -3055,18 +4152,18 @@
                 <w:sz w:val="24"/>
                 <w:szCs w:val="24"/>
               </w:rPr>
-              <w:t>Sample size justification and selection cascade</w:t>
-            </w:r>
-            <w:r>
-              <w:rPr>
-                <w:rFonts w:ascii="Times New Roman" w:hAnsi="Times New Roman"/>
-                <w:b/>
+              <w:t xml:space="preserve">Sample size justification and selection cascade: </w:t>
+            </w:r>
+            <w:r>
+              <w:rPr>
+                <w:rFonts w:ascii="Times New Roman" w:hAnsi="Times New Roman"/>
                 <w:color w:val="000000"/>
                 <w:sz w:val="24"/>
                 <w:szCs w:val="24"/>
               </w:rPr>
-              <w:t xml:space="preserve">: </w:t>
-            </w:r>
+              <w:t xml:space="preserve">Analytical sample and missing data: Please explain how the final sample of 4,087 children </w:t>
+            </w:r>
+            <w:proofErr w:type="gramStart"/>
             <w:r>
               <w:rPr>
                 <w:rFonts w:ascii="Times New Roman" w:hAnsi="Times New Roman"/>
@@ -3074,7 +4171,17 @@
                 <w:sz w:val="24"/>
                 <w:szCs w:val="24"/>
               </w:rPr>
-              <w:t>Analytical sample and missing data: Please explain how the final sample of 4,087 children was derived from the total births in the survey.</w:t>
+              <w:t>was derived</w:t>
+            </w:r>
+            <w:proofErr w:type="gramEnd"/>
+            <w:r>
+              <w:rPr>
+                <w:rFonts w:ascii="Times New Roman" w:hAnsi="Times New Roman"/>
+                <w:color w:val="000000"/>
+                <w:sz w:val="24"/>
+                <w:szCs w:val="24"/>
+              </w:rPr>
+              <w:t xml:space="preserve"> from the total births in the survey.</w:t>
             </w:r>
           </w:p>
         </w:tc>
@@ -3117,12 +4224,9 @@
                 <w:szCs w:val="24"/>
               </w:rPr>
             </w:pPr>
-            <w:r/>
-            <w:r>
-              <w:rPr>
-                <w:rFonts w:ascii="Times New Roman" w:hAnsi="Times New Roman"/>
-                <w:b w:val="0"/>
-                <w:i w:val="0"/>
+            <w:r>
+              <w:rPr>
+                <w:rFonts w:ascii="Times New Roman" w:hAnsi="Times New Roman"/>
                 <w:color w:val="0070C0"/>
                 <w:sz w:val="24"/>
               </w:rPr>
@@ -3143,12 +4247,20 @@
             <w:r>
               <w:rPr>
                 <w:rFonts w:ascii="Times New Roman" w:hAnsi="Times New Roman"/>
-                <w:b w:val="0"/>
                 <w:i/>
                 <w:color w:val="0070C0"/>
                 <w:sz w:val="24"/>
               </w:rPr>
-              <w:t>Section 2.1 (Page 5, Lines 140–164); Figure 2 (Page 6, Lines 165–167).</w:t>
+              <w:t>Section 2.1 (Page 5, Lines 14</w:t>
+            </w:r>
+            <w:r>
+              <w:rPr>
+                <w:rFonts w:ascii="Times New Roman" w:hAnsi="Times New Roman"/>
+                <w:i/>
+                <w:color w:val="0070C0"/>
+                <w:sz w:val="24"/>
+              </w:rPr>
+              <w:t>0–164); Figure 2 (Page 6, Lines 165–167).</w:t>
             </w:r>
           </w:p>
         </w:tc>
@@ -3208,8 +4320,9 @@
                 <w:sz w:val="24"/>
                 <w:szCs w:val="24"/>
               </w:rPr>
-              <w:t>Statistical reporting and interpretation: Please check all significance markers against the tables. For example, roof material and TV ownership should be reported accurately accordi</w:t>
-            </w:r>
+              <w:t xml:space="preserve">Statistical reporting and interpretation: Please check all significance markers against the tables. For example, roof material and TV ownership </w:t>
+            </w:r>
+            <w:proofErr w:type="gramStart"/>
             <w:r>
               <w:rPr>
                 <w:rFonts w:ascii="Times New Roman" w:hAnsi="Times New Roman"/>
@@ -3217,7 +4330,17 @@
                 <w:sz w:val="24"/>
                 <w:szCs w:val="24"/>
               </w:rPr>
-              <w:t>ng to the model results.</w:t>
+              <w:t>should be reported</w:t>
+            </w:r>
+            <w:proofErr w:type="gramEnd"/>
+            <w:r>
+              <w:rPr>
+                <w:rFonts w:ascii="Times New Roman" w:hAnsi="Times New Roman"/>
+                <w:color w:val="000000"/>
+                <w:sz w:val="24"/>
+                <w:szCs w:val="24"/>
+              </w:rPr>
+              <w:t xml:space="preserve"> accurately according to the model results.</w:t>
             </w:r>
           </w:p>
         </w:tc>
@@ -3260,12 +4383,9 @@
                 <w:szCs w:val="24"/>
               </w:rPr>
             </w:pPr>
-            <w:r/>
-            <w:r>
-              <w:rPr>
-                <w:rFonts w:ascii="Times New Roman" w:hAnsi="Times New Roman"/>
-                <w:b w:val="0"/>
-                <w:i w:val="0"/>
+            <w:r>
+              <w:rPr>
+                <w:rFonts w:ascii="Times New Roman" w:hAnsi="Times New Roman"/>
                 <w:color w:val="0070C0"/>
                 <w:sz w:val="24"/>
               </w:rPr>
@@ -3286,12 +4406,20 @@
             <w:r>
               <w:rPr>
                 <w:rFonts w:ascii="Times New Roman" w:hAnsi="Times New Roman"/>
-                <w:b w:val="0"/>
                 <w:i/>
                 <w:color w:val="0070C0"/>
                 <w:sz w:val="24"/>
               </w:rPr>
-              <w:t>Table 2 (Page 12, Lines 298–300); Table 3 (Pages 14–17, Lines 352–354); Section 3.3 (Pages 13–14, Lines 301–314); Section 4 (Pages 17–20, Lines 355–454).</w:t>
+              <w:t xml:space="preserve">Table 2 (Page 12, Lines 298–300); Table 3 (Pages 14–17, Lines 352–354); Section 3.3 (Pages 13–14, Lines 301–314); </w:t>
+            </w:r>
+            <w:r>
+              <w:rPr>
+                <w:rFonts w:ascii="Times New Roman" w:hAnsi="Times New Roman"/>
+                <w:i/>
+                <w:color w:val="0070C0"/>
+                <w:sz w:val="24"/>
+              </w:rPr>
+              <w:t>Section 4 (Pages 17–20, Lines 355–454).</w:t>
             </w:r>
           </w:p>
         </w:tc>
@@ -3342,17 +4470,7 @@
                 <w:sz w:val="24"/>
                 <w:szCs w:val="24"/>
               </w:rPr>
-              <w:t>Distinction from published BDHS 2022 mult</w:t>
-            </w:r>
-            <w:r>
-              <w:rPr>
-                <w:rFonts w:ascii="Times New Roman" w:hAnsi="Times New Roman"/>
-                <w:b/>
-                <w:color w:val="000000"/>
-                <w:sz w:val="24"/>
-                <w:szCs w:val="24"/>
-              </w:rPr>
-              <w:t xml:space="preserve">ilevel papers: </w:t>
+              <w:t xml:space="preserve">Distinction from published BDHS 2022 multilevel papers: </w:t>
             </w:r>
             <w:r>
               <w:rPr>
@@ -3404,16 +4522,31 @@
                 <w:szCs w:val="24"/>
               </w:rPr>
             </w:pPr>
-            <w:r/>
-            <w:r>
-              <w:rPr>
-                <w:rFonts w:ascii="Times New Roman" w:hAnsi="Times New Roman"/>
-                <w:b w:val="0"/>
-                <w:i w:val="0"/>
-                <w:color w:val="0070C0"/>
-                <w:sz w:val="24"/>
-              </w:rPr>
-              <w:t>We have distinguished our contribution from Rashid et al. (2026) and Tamanna et al. (2025) in the Introduction and Discussion, adopted strictly non-causal language throughout, and aligned our policy implications to proportionate public health strategies.</w:t>
+            <w:r>
+              <w:rPr>
+                <w:rFonts w:ascii="Times New Roman" w:hAnsi="Times New Roman"/>
+                <w:color w:val="0070C0"/>
+                <w:sz w:val="24"/>
+              </w:rPr>
+              <w:t xml:space="preserve">We have distinguished our contribution from Rashid et al. (2026) and </w:t>
+            </w:r>
+            <w:proofErr w:type="spellStart"/>
+            <w:r>
+              <w:rPr>
+                <w:rFonts w:ascii="Times New Roman" w:hAnsi="Times New Roman"/>
+                <w:color w:val="0070C0"/>
+                <w:sz w:val="24"/>
+              </w:rPr>
+              <w:t>Tamanna</w:t>
+            </w:r>
+            <w:proofErr w:type="spellEnd"/>
+            <w:r>
+              <w:rPr>
+                <w:rFonts w:ascii="Times New Roman" w:hAnsi="Times New Roman"/>
+                <w:color w:val="0070C0"/>
+                <w:sz w:val="24"/>
+              </w:rPr>
+              <w:t xml:space="preserve"> et al. (2025) in the Introduction and Discussion, adopted strictly non-causal language throughout, and aligned our policy implications to proportionate public health strategies.</w:t>
             </w:r>
           </w:p>
           <w:p>
@@ -3430,7 +4563,6 @@
             <w:r>
               <w:rPr>
                 <w:rFonts w:ascii="Times New Roman" w:hAnsi="Times New Roman"/>
-                <w:b w:val="0"/>
                 <w:i/>
                 <w:color w:val="0070C0"/>
                 <w:sz w:val="24"/>
@@ -3476,6 +4608,7 @@
                 <w:sz w:val="24"/>
                 <w:szCs w:val="24"/>
               </w:rPr>
+              <w:lastRenderedPageBreak/>
               <w:t>Reviewer 3 Comments (Minor Revisions)</w:t>
             </w:r>
           </w:p>
@@ -3536,16 +4669,7 @@
                 <w:sz w:val="24"/>
                 <w:szCs w:val="24"/>
               </w:rPr>
-              <w:t xml:space="preserve">Tables and variable definitions: Add subgroup sample sizes, weighted </w:t>
-            </w:r>
-            <w:r>
-              <w:rPr>
-                <w:rFonts w:ascii="Times New Roman" w:hAnsi="Times New Roman"/>
-                <w:color w:val="000000"/>
-                <w:sz w:val="24"/>
-                <w:szCs w:val="24"/>
-              </w:rPr>
-              <w:t>distributions, and prevalence numbers for each category in Tables 1 and 2.</w:t>
+              <w:t>Tables and variable definitions: Add subgroup sample sizes, weighted distributions, and prevalence numbers for each category in Tables 1 and 2.</w:t>
             </w:r>
           </w:p>
         </w:tc>
@@ -3588,12 +4712,9 @@
                 <w:szCs w:val="24"/>
               </w:rPr>
             </w:pPr>
-            <w:r/>
-            <w:r>
-              <w:rPr>
-                <w:rFonts w:ascii="Times New Roman" w:hAnsi="Times New Roman"/>
-                <w:b w:val="0"/>
-                <w:i w:val="0"/>
+            <w:r>
+              <w:rPr>
+                <w:rFonts w:ascii="Times New Roman" w:hAnsi="Times New Roman"/>
                 <w:color w:val="0070C0"/>
                 <w:sz w:val="24"/>
               </w:rPr>
@@ -3614,12 +4735,40 @@
             <w:r>
               <w:rPr>
                 <w:rFonts w:ascii="Times New Roman" w:hAnsi="Times New Roman"/>
-                <w:b w:val="0"/>
                 <w:i/>
                 <w:color w:val="0070C0"/>
                 <w:sz w:val="24"/>
               </w:rPr>
-              <w:t>Table 1 (Pages 9–11, Line 281); Table 2 (Page 12, Lines 298–300).</w:t>
+              <w:t>Table 1 (Pages 9–11, Line 281)</w:t>
+            </w:r>
+            <w:proofErr w:type="gramStart"/>
+            <w:r>
+              <w:rPr>
+                <w:rFonts w:ascii="Times New Roman" w:hAnsi="Times New Roman"/>
+                <w:i/>
+                <w:color w:val="0070C0"/>
+                <w:sz w:val="24"/>
+              </w:rPr>
+              <w:t>;</w:t>
+            </w:r>
+            <w:proofErr w:type="gramEnd"/>
+            <w:r>
+              <w:rPr>
+                <w:rFonts w:ascii="Times New Roman" w:hAnsi="Times New Roman"/>
+                <w:i/>
+                <w:color w:val="0070C0"/>
+                <w:sz w:val="24"/>
+              </w:rPr>
+              <w:t xml:space="preserve"> Table 2 (Page 12, Lines 298–3</w:t>
+            </w:r>
+            <w:r>
+              <w:rPr>
+                <w:rFonts w:ascii="Times New Roman" w:hAnsi="Times New Roman"/>
+                <w:i/>
+                <w:color w:val="0070C0"/>
+                <w:sz w:val="24"/>
+              </w:rPr>
+              <w:t>00).</w:t>
             </w:r>
           </w:p>
         </w:tc>
@@ -3645,7 +4794,6 @@
                 <w:sz w:val="24"/>
                 <w:szCs w:val="24"/>
               </w:rPr>
-              <w:lastRenderedPageBreak/>
               <w:t>Comment 2:</w:t>
             </w:r>
           </w:p>
@@ -3723,16 +4871,31 @@
                 <w:szCs w:val="24"/>
               </w:rPr>
             </w:pPr>
-            <w:r/>
-            <w:r>
-              <w:rPr>
-                <w:rFonts w:ascii="Times New Roman" w:hAnsi="Times New Roman"/>
-                <w:b w:val="0"/>
-                <w:i w:val="0"/>
-                <w:color w:val="0070C0"/>
-                <w:sz w:val="24"/>
-              </w:rPr>
-              <w:t>All comparisons have been corrected to strictly reference the designated baseline group (e.g., maternal age ≥40 is compared to 15–19 years).</w:t>
+            <w:r>
+              <w:rPr>
+                <w:rFonts w:ascii="Times New Roman" w:hAnsi="Times New Roman"/>
+                <w:color w:val="0070C0"/>
+                <w:sz w:val="24"/>
+              </w:rPr>
+              <w:t xml:space="preserve">All comparisons </w:t>
+            </w:r>
+            <w:proofErr w:type="gramStart"/>
+            <w:r>
+              <w:rPr>
+                <w:rFonts w:ascii="Times New Roman" w:hAnsi="Times New Roman"/>
+                <w:color w:val="0070C0"/>
+                <w:sz w:val="24"/>
+              </w:rPr>
+              <w:t>have been corrected</w:t>
+            </w:r>
+            <w:proofErr w:type="gramEnd"/>
+            <w:r>
+              <w:rPr>
+                <w:rFonts w:ascii="Times New Roman" w:hAnsi="Times New Roman"/>
+                <w:color w:val="0070C0"/>
+                <w:sz w:val="24"/>
+              </w:rPr>
+              <w:t xml:space="preserve"> to strictly reference the designated baseline group (e.g., maternal age ≥40 is compared to 15–19 years).</w:t>
             </w:r>
           </w:p>
           <w:p>
@@ -3749,7 +4912,6 @@
             <w:r>
               <w:rPr>
                 <w:rFonts w:ascii="Times New Roman" w:hAnsi="Times New Roman"/>
-                <w:b w:val="0"/>
                 <w:i/>
                 <w:color w:val="0070C0"/>
                 <w:sz w:val="24"/>
@@ -3814,16 +4976,7 @@
                 <w:sz w:val="24"/>
                 <w:szCs w:val="24"/>
               </w:rPr>
-              <w:t>Terminology</w:t>
-            </w:r>
-            <w:r>
-              <w:rPr>
-                <w:rFonts w:ascii="Times New Roman" w:hAnsi="Times New Roman"/>
-                <w:color w:val="000000"/>
-                <w:sz w:val="24"/>
-                <w:szCs w:val="24"/>
-              </w:rPr>
-              <w:t xml:space="preserve"> and equation: Correct 'wastefulness' to 'wasting,' use outcome-specific labels instead of generic formulas.</w:t>
+              <w:t>Terminology and equation: Correct 'wastefulness' to 'wasting,' use outcome-specific labels instead of generic formulas.</w:t>
             </w:r>
           </w:p>
         </w:tc>
@@ -3866,12 +5019,9 @@
                 <w:szCs w:val="24"/>
               </w:rPr>
             </w:pPr>
-            <w:r/>
-            <w:r>
-              <w:rPr>
-                <w:rFonts w:ascii="Times New Roman" w:hAnsi="Times New Roman"/>
-                <w:b w:val="0"/>
-                <w:i w:val="0"/>
+            <w:r>
+              <w:rPr>
+                <w:rFonts w:ascii="Times New Roman" w:hAnsi="Times New Roman"/>
                 <w:color w:val="0070C0"/>
                 <w:sz w:val="24"/>
               </w:rPr>
@@ -3892,7 +5042,6 @@
             <w:r>
               <w:rPr>
                 <w:rFonts w:ascii="Times New Roman" w:hAnsi="Times New Roman"/>
-                <w:b w:val="0"/>
                 <w:i/>
                 <w:color w:val="0070C0"/>
                 <w:sz w:val="24"/>
@@ -3957,16 +5106,7 @@
                 <w:sz w:val="24"/>
                 <w:szCs w:val="24"/>
               </w:rPr>
-              <w:t>References and reporting: Correct mismatched citations, remove duplicate referen</w:t>
-            </w:r>
-            <w:r>
-              <w:rPr>
-                <w:rFonts w:ascii="Times New Roman" w:hAnsi="Times New Roman"/>
-                <w:color w:val="000000"/>
-                <w:sz w:val="24"/>
-                <w:szCs w:val="24"/>
-              </w:rPr>
-              <w:t>ces, clarify figures.</w:t>
+              <w:t>References and reporting: Correct mismatched citations, remove duplicate references, clarify figures.</w:t>
             </w:r>
           </w:p>
         </w:tc>
@@ -4009,16 +5149,67 @@
                 <w:szCs w:val="24"/>
               </w:rPr>
             </w:pPr>
-            <w:r/>
-            <w:r>
-              <w:rPr>
-                <w:rFonts w:ascii="Times New Roman" w:hAnsi="Times New Roman"/>
-                <w:b w:val="0"/>
-                <w:i w:val="0"/>
-                <w:color w:val="0070C0"/>
-                <w:sz w:val="24"/>
-              </w:rPr>
-              <w:t>All citations and references have been thoroughly verified and restructured into a complete 37-reference Vancouver list. The accidental duplicate entry of Saha et al. was removed, and newly required literature (Rashid et al. 2026, Carle 2009, STROBE statement) was integrated with 1-to-1 sequential in-text matching.</w:t>
+            <w:r>
+              <w:rPr>
+                <w:rFonts w:ascii="Times New Roman" w:hAnsi="Times New Roman"/>
+                <w:color w:val="0070C0"/>
+                <w:sz w:val="24"/>
+              </w:rPr>
+              <w:t xml:space="preserve">All citations and references </w:t>
+            </w:r>
+            <w:proofErr w:type="gramStart"/>
+            <w:r>
+              <w:rPr>
+                <w:rFonts w:ascii="Times New Roman" w:hAnsi="Times New Roman"/>
+                <w:color w:val="0070C0"/>
+                <w:sz w:val="24"/>
+              </w:rPr>
+              <w:t>have been thoroughly verified and restructured into a complete 37-reference Vancouver list</w:t>
+            </w:r>
+            <w:proofErr w:type="gramEnd"/>
+            <w:r>
+              <w:rPr>
+                <w:rFonts w:ascii="Times New Roman" w:hAnsi="Times New Roman"/>
+                <w:color w:val="0070C0"/>
+                <w:sz w:val="24"/>
+              </w:rPr>
+              <w:t xml:space="preserve">. The accidental duplicate entry of </w:t>
+            </w:r>
+            <w:proofErr w:type="spellStart"/>
+            <w:r>
+              <w:rPr>
+                <w:rFonts w:ascii="Times New Roman" w:hAnsi="Times New Roman"/>
+                <w:color w:val="0070C0"/>
+                <w:sz w:val="24"/>
+              </w:rPr>
+              <w:t>Saha</w:t>
+            </w:r>
+            <w:proofErr w:type="spellEnd"/>
+            <w:r>
+              <w:rPr>
+                <w:rFonts w:ascii="Times New Roman" w:hAnsi="Times New Roman"/>
+                <w:color w:val="0070C0"/>
+                <w:sz w:val="24"/>
+              </w:rPr>
+              <w:t xml:space="preserve"> et al. </w:t>
+            </w:r>
+            <w:proofErr w:type="gramStart"/>
+            <w:r>
+              <w:rPr>
+                <w:rFonts w:ascii="Times New Roman" w:hAnsi="Times New Roman"/>
+                <w:color w:val="0070C0"/>
+                <w:sz w:val="24"/>
+              </w:rPr>
+              <w:t>was removed</w:t>
+            </w:r>
+            <w:proofErr w:type="gramEnd"/>
+            <w:r>
+              <w:rPr>
+                <w:rFonts w:ascii="Times New Roman" w:hAnsi="Times New Roman"/>
+                <w:color w:val="0070C0"/>
+                <w:sz w:val="24"/>
+              </w:rPr>
+              <w:t>, and newly required literature (Rashid et al. 2026, Carle 2009, STROBE statement) was integrated with 1-to-1 sequential in-text matching.</w:t>
             </w:r>
           </w:p>
           <w:p>
@@ -4035,7 +5226,6 @@
             <w:r>
               <w:rPr>
                 <w:rFonts w:ascii="Times New Roman" w:hAnsi="Times New Roman"/>
-                <w:b w:val="0"/>
                 <w:i/>
                 <w:color w:val="0070C0"/>
                 <w:sz w:val="24"/>
@@ -15963,7 +17153,7 @@
 </file>
 
 <file path=customXml/itemProps1.xml><?xml version="1.0" encoding="utf-8"?>
-<ds:datastoreItem xmlns:ds="http://schemas.openxmlformats.org/officeDocument/2006/customXml" ds:itemID="{F6233341-3F53-4D50-8395-A09CCBD9156C}">
+<ds:datastoreItem xmlns:ds="http://schemas.openxmlformats.org/officeDocument/2006/customXml" ds:itemID="{6470133C-0DFF-41C6-8612-154789A3A66D}">
   <ds:schemaRefs>
     <ds:schemaRef ds:uri="http://schemas.openxmlformats.org/officeDocument/2006/bibliography"/>
   </ds:schemaRefs>

</xml_diff>

<commit_message>
Harmonize all citations in Point_by_Point_Response with exact manuscript Vancouver reference numbers
</commit_message>
<xml_diff>
--- a/Point_by_Point_Response_to_Reviewers.docx
+++ b/Point_by_Point_Response_to_Reviewers.docx
@@ -216,27 +216,7 @@
           <w:sz w:val="24"/>
           <w:szCs w:val="24"/>
         </w:rPr>
-        <w:t xml:space="preserve">We sincerely thank the Editorial Office and the three expert reviewers for their valuable feedback and constructive critiques on our manuscript (Manuscript ID: bmjph-2026-006196), entitled “Multilevel Determinants of Under-Five Child Undernutrition in Bangladesh: A Nationally Representative Cross-Sectional Study from the Bangladesh Demographic and Health Survey 2022.” We have carefully considered all comments and executed a comprehensive revision to strengthen the manuscript's methodological rigor, analytical precision, and epidemiological interpretation. Detailed point-by-point responses, organized by reviewer and comment, </w:t>
-      </w:r>
-      <w:proofErr w:type="gramStart"/>
-      <w:r>
-        <w:rPr>
-          <w:rFonts w:ascii="Times New Roman" w:hAnsi="Times New Roman"/>
-          <w:color w:val="000000"/>
-          <w:sz w:val="24"/>
-          <w:szCs w:val="24"/>
-        </w:rPr>
-        <w:t>are provided</w:t>
-      </w:r>
-      <w:proofErr w:type="gramEnd"/>
-      <w:r>
-        <w:rPr>
-          <w:rFonts w:ascii="Times New Roman" w:hAnsi="Times New Roman"/>
-          <w:color w:val="000000"/>
-          <w:sz w:val="24"/>
-          <w:szCs w:val="24"/>
-        </w:rPr>
-        <w:t xml:space="preserve"> in the tables below</w:t>
+        <w:t>We sincerely thank the Editorial Office and the three expert reviewers for their valuable feedback and constructive critiques on our manuscript (Manuscript ID: bmjph-2026-006196), entitled “Multilevel Determinants of Under-Five Child Undernutrition in Bangladesh: A Nationally Representative Cross-Sectional Study from the Bangladesh Demographic and Health Survey 2022.” We have carefully considered all comments and executed a comprehensive revision to strengthen the manuscript's methodological rigor, analytical precision, and epidemiological interpretation. Detailed point-by-point responses, organized by reviewer and comment, are provided in the tables below</w:t>
       </w:r>
       <w:r>
         <w:rPr>
@@ -389,25 +369,7 @@
                 <w:color w:val="0070C0"/>
                 <w:sz w:val="24"/>
               </w:rPr>
-              <w:t xml:space="preserve">We thank the Editor for this instruction. We have revised the manuscript title </w:t>
-            </w:r>
-            <w:proofErr w:type="gramStart"/>
-            <w:r>
-              <w:rPr>
-                <w:rFonts w:ascii="Times New Roman" w:hAnsi="Times New Roman"/>
-                <w:color w:val="0070C0"/>
-                <w:sz w:val="24"/>
-              </w:rPr>
-              <w:t>to explicitly incorporate</w:t>
-            </w:r>
-            <w:proofErr w:type="gramEnd"/>
-            <w:r>
-              <w:rPr>
-                <w:rFonts w:ascii="Times New Roman" w:hAnsi="Times New Roman"/>
-                <w:color w:val="0070C0"/>
-                <w:sz w:val="24"/>
-              </w:rPr>
-              <w:t xml:space="preserve"> the study design in strict compliance with BMJ Public Health formatting guidelines.</w:t>
+              <w:t>We thank the Editor for this instruction. We have revised the manuscript title to explicitly incorporate the study design in strict compliance with BMJ Public Health formatting guidelines.</w:t>
             </w:r>
           </w:p>
           <w:p>
@@ -420,24 +382,13 @@
                 <w:color w:val="0070C0"/>
                 <w:sz w:val="24"/>
               </w:rPr>
-              <w:t xml:space="preserve">Revised Title: “Multilevel Determinants of Under-Five Child Undernutrition in Bangladesh: A Nationally Representative Cross-Sectional Study </w:t>
-            </w:r>
-            <w:r>
-              <w:rPr>
-                <w:rFonts w:ascii="Times New Roman" w:hAnsi="Times New Roman"/>
-                <w:color w:val="0070C0"/>
-                <w:sz w:val="24"/>
-              </w:rPr>
-              <w:t>from the Bangladesh Demographic and Health Survey 2022.”</w:t>
-            </w:r>
-            <w:bookmarkStart w:id="0" w:name="_GoBack"/>
-            <w:bookmarkEnd w:id="0"/>
+              <w:t>Revised Title: “Multilevel Determinants of Under-Five Child Undernutrition in Bangladesh: A Nationally Representative Cross-Sectional Study from the Bangladesh Demographic and Health Survey 2022.”</w:t>
+            </w:r>
           </w:p>
           <w:p>
             <w:pPr>
               <w:jc w:val="both"/>
             </w:pPr>
-            <w:r/>
             <w:r>
               <w:rPr>
                 <w:rFonts w:ascii="Times New Roman" w:hAnsi="Times New Roman"/>
@@ -451,7 +402,6 @@
             <w:r>
               <w:rPr>
                 <w:rFonts w:ascii="Times New Roman" w:hAnsi="Times New Roman"/>
-                <w:b w:val="0"/>
                 <w:i/>
                 <w:color w:val="0070C0"/>
                 <w:sz w:val="24"/>
@@ -516,27 +466,7 @@
                 <w:sz w:val="24"/>
                 <w:szCs w:val="24"/>
               </w:rPr>
-              <w:t xml:space="preserve">Please ensure you have indicated the page/line numbers of your manuscript where the relevant information </w:t>
-            </w:r>
-            <w:proofErr w:type="gramStart"/>
-            <w:r>
-              <w:rPr>
-                <w:rFonts w:ascii="Times New Roman" w:hAnsi="Times New Roman"/>
-                <w:color w:val="000000"/>
-                <w:sz w:val="24"/>
-                <w:szCs w:val="24"/>
-              </w:rPr>
-              <w:t>can be found</w:t>
-            </w:r>
-            <w:proofErr w:type="gramEnd"/>
-            <w:r>
-              <w:rPr>
-                <w:rFonts w:ascii="Times New Roman" w:hAnsi="Times New Roman"/>
-                <w:color w:val="000000"/>
-                <w:sz w:val="24"/>
-                <w:szCs w:val="24"/>
-              </w:rPr>
-              <w:t xml:space="preserve"> for all items from the STROBE checklist. Do not leave blanks and indicate any items that do not apply to your study design as 'Not Applicable'.</w:t>
+              <w:t>Please ensure you have indicated the page/line numbers of your manuscript where the relevant information can be found for all items from the STROBE checklist. Do not leave blanks and indicate any items that do not apply to your study design as 'Not Applicable'.</w:t>
             </w:r>
           </w:p>
         </w:tc>
@@ -571,156 +501,16 @@
             <w:tcW w:w="7416" w:type="dxa"/>
           </w:tcPr>
           <w:p>
-            <w:pPr>
-              <w:spacing w:after="60"/>
-              <w:jc w:val="both"/>
-              <w:rPr>
-                <w:sz w:val="24"/>
-                <w:szCs w:val="24"/>
-              </w:rPr>
-            </w:pPr>
-            <w:r>
-              <w:rPr>
-                <w:rFonts w:ascii="Times New Roman" w:hAnsi="Times New Roman"/>
+            <w:r/>
+            <w:r>
+              <w:rPr>
+                <w:rFonts w:ascii="Times New Roman" w:hAnsi="Times New Roman"/>
+                <w:b w:val="0"/>
+                <w:i w:val="0"/>
                 <w:color w:val="0070C0"/>
                 <w:sz w:val="24"/>
               </w:rPr>
-              <w:t xml:space="preserve">We have completed the official STROBE Statement checklist for cross-sectional studies in full. Every checklist item </w:t>
-            </w:r>
-            <w:proofErr w:type="gramStart"/>
-            <w:r>
-              <w:rPr>
-                <w:rFonts w:ascii="Times New Roman" w:hAnsi="Times New Roman"/>
-                <w:color w:val="0070C0"/>
-                <w:sz w:val="24"/>
-              </w:rPr>
-              <w:t>has been matched</w:t>
-            </w:r>
-            <w:proofErr w:type="gramEnd"/>
-            <w:r>
-              <w:rPr>
-                <w:rFonts w:ascii="Times New Roman" w:hAnsi="Times New Roman"/>
-                <w:color w:val="0070C0"/>
-                <w:sz w:val="24"/>
-              </w:rPr>
-              <w:t xml:space="preserve"> with exact section titles, page numbers, and continuous line numbers (Lines 1–617) from the revised marked manuscript. No items </w:t>
-            </w:r>
-            <w:proofErr w:type="gramStart"/>
-            <w:r>
-              <w:rPr>
-                <w:rFonts w:ascii="Times New Roman" w:hAnsi="Times New Roman"/>
-                <w:color w:val="0070C0"/>
-                <w:sz w:val="24"/>
-              </w:rPr>
-              <w:t>have been left</w:t>
-            </w:r>
-            <w:proofErr w:type="gramEnd"/>
-            <w:r>
-              <w:rPr>
-                <w:rFonts w:ascii="Times New Roman" w:hAnsi="Times New Roman"/>
-                <w:color w:val="0070C0"/>
-                <w:sz w:val="24"/>
-              </w:rPr>
-              <w:t xml:space="preserve"> blank, and </w:t>
-            </w:r>
-            <w:r>
-              <w:rPr>
-                <w:rFonts w:ascii="Times New Roman" w:hAnsi="Times New Roman"/>
-                <w:color w:val="0070C0"/>
-                <w:sz w:val="24"/>
-              </w:rPr>
-              <w:lastRenderedPageBreak/>
-              <w:t>non-applicable items (such as prospective trial registration or cohort follow-up) are clearly designated as 'Not Applicable' with methodological justifications.</w:t>
-            </w:r>
-          </w:p>
-          <w:p>
-            <w:r>
-              <w:rPr>
-                <w:rFonts w:ascii="Times New Roman" w:hAnsi="Times New Roman"/>
-                <w:color w:val="0070C0"/>
-                <w:sz w:val="24"/>
-              </w:rPr>
-              <w:t xml:space="preserve">1. von Elm E, Altman DG, Egger M, </w:t>
-            </w:r>
-            <w:proofErr w:type="spellStart"/>
-            <w:r>
-              <w:rPr>
-                <w:rFonts w:ascii="Times New Roman" w:hAnsi="Times New Roman"/>
-                <w:color w:val="0070C0"/>
-                <w:sz w:val="24"/>
-              </w:rPr>
-              <w:t>Pocock</w:t>
-            </w:r>
-            <w:proofErr w:type="spellEnd"/>
-            <w:r>
-              <w:rPr>
-                <w:rFonts w:ascii="Times New Roman" w:hAnsi="Times New Roman"/>
-                <w:color w:val="0070C0"/>
-                <w:sz w:val="24"/>
-              </w:rPr>
-              <w:t xml:space="preserve"> SJ, </w:t>
-            </w:r>
-            <w:proofErr w:type="spellStart"/>
-            <w:r>
-              <w:rPr>
-                <w:rFonts w:ascii="Times New Roman" w:hAnsi="Times New Roman"/>
-                <w:color w:val="0070C0"/>
-                <w:sz w:val="24"/>
-              </w:rPr>
-              <w:t>Gøtzsche</w:t>
-            </w:r>
-            <w:proofErr w:type="spellEnd"/>
-            <w:r>
-              <w:rPr>
-                <w:rFonts w:ascii="Times New Roman" w:hAnsi="Times New Roman"/>
-                <w:color w:val="0070C0"/>
-                <w:sz w:val="24"/>
-              </w:rPr>
-              <w:t xml:space="preserve"> PC</w:t>
-            </w:r>
-            <w:r>
-              <w:rPr>
-                <w:rFonts w:ascii="Times New Roman" w:hAnsi="Times New Roman"/>
-                <w:color w:val="0070C0"/>
-                <w:sz w:val="24"/>
-              </w:rPr>
-              <w:t xml:space="preserve">, </w:t>
-            </w:r>
-            <w:proofErr w:type="spellStart"/>
-            <w:r>
-              <w:rPr>
-                <w:rFonts w:ascii="Times New Roman" w:hAnsi="Times New Roman"/>
-                <w:color w:val="0070C0"/>
-                <w:sz w:val="24"/>
-              </w:rPr>
-              <w:t>Vandenbroucke</w:t>
-            </w:r>
-            <w:proofErr w:type="spellEnd"/>
-            <w:r>
-              <w:rPr>
-                <w:rFonts w:ascii="Times New Roman" w:hAnsi="Times New Roman"/>
-                <w:color w:val="0070C0"/>
-                <w:sz w:val="24"/>
-              </w:rPr>
-              <w:t xml:space="preserve"> JP. The Strengthening the Reporting of Observational Studies in Epidemiology (STROBE) statement: Guidelines for reporting observational studies. The Lancet. 2007</w:t>
-            </w:r>
-            <w:proofErr w:type="gramStart"/>
-            <w:r>
-              <w:rPr>
-                <w:rFonts w:ascii="Times New Roman" w:hAnsi="Times New Roman"/>
-                <w:color w:val="0070C0"/>
-                <w:sz w:val="24"/>
-              </w:rPr>
-              <w:t>;370</w:t>
-            </w:r>
-            <w:proofErr w:type="gramEnd"/>
-            <w:r>
-              <w:rPr>
-                <w:rFonts w:ascii="Times New Roman" w:hAnsi="Times New Roman"/>
-                <w:color w:val="0070C0"/>
-                <w:sz w:val="24"/>
-              </w:rPr>
-              <w:t>(9596):1453–1457.</w:t>
+              <w:t>We have completed the official STROBE Statement checklist for cross-sectional studies in full. Every checklist item has been matched with exact section titles, page numbers, and continuous line numbers (Lines 1–617) from the revised marked manuscript. No items have been left blank, and non-applicable items (such as prospective trial registration or cohort follow-up) are clearly designated as 'Not Applicable' with methodological justifications.</w:t>
             </w:r>
           </w:p>
           <w:p>
@@ -737,20 +527,12 @@
             <w:r>
               <w:rPr>
                 <w:rFonts w:ascii="Times New Roman" w:hAnsi="Times New Roman"/>
+                <w:b w:val="0"/>
                 <w:i/>
                 <w:color w:val="0070C0"/>
                 <w:sz w:val="24"/>
               </w:rPr>
-              <w:t xml:space="preserve">Uploaded as a dedicated </w:t>
-            </w:r>
-            <w:r>
-              <w:rPr>
-                <w:rFonts w:ascii="Times New Roman" w:hAnsi="Times New Roman"/>
-                <w:i/>
-                <w:color w:val="0070C0"/>
-                <w:sz w:val="24"/>
-              </w:rPr>
-              <w:t>supplementary document: 'Supplementary File 1_STROBE_Checklist_Cross_Sectional.docx' (with continuous line numbers mapped across all 22 checklist items) and cited in Section 2.1 (Page 5, Lines 156–158).</w:t>
+              <w:t>Uploaded as a dedicated supplementary document: 'Supplementary File 1_STROBE_Checklist_Cross_Sectional.docx' (with continuous line numbers mapped across all 22 checklist items) and cited in Section 2.1 (Page 5, Lines 156–158; Reference 28).</w:t>
             </w:r>
           </w:p>
         </w:tc>
@@ -860,43 +642,7 @@
                 <w:color w:val="0070C0"/>
                 <w:sz w:val="24"/>
               </w:rPr>
-              <w:t xml:space="preserve">We have expanded Section 2.1 ('Study Design, Sampling, and Analytical Sample') to detail the complete sample selection cascade. Specifically, we explicitly report that from the 8,784 live births occurring in the five years preceding the survey, 276 deceased children were excluded, and 4,421 children who were absent or not subsampled for anthropometry were excluded. The remaining children were screened for biological plausibility using WHO flags (|HAZ| ≤ 6, |WHZ| ≤ 5, </w:t>
-            </w:r>
-            <w:proofErr w:type="gramStart"/>
-            <w:r>
-              <w:rPr>
-                <w:rFonts w:ascii="Times New Roman" w:hAnsi="Times New Roman"/>
-                <w:color w:val="0070C0"/>
-                <w:sz w:val="24"/>
-              </w:rPr>
-              <w:t>|</w:t>
-            </w:r>
-            <w:proofErr w:type="gramEnd"/>
-            <w:r>
-              <w:rPr>
-                <w:rFonts w:ascii="Times New Roman" w:hAnsi="Times New Roman"/>
-                <w:color w:val="0070C0"/>
-                <w:sz w:val="24"/>
-              </w:rPr>
-              <w:t xml:space="preserve">WAZ| ≤ 5), resulting in a verified, complete-case analytical sample of 4,087 children aged 0–59 months nested within 3,474 households across 670 community clusters. A formal STROBE participant selection flow diagram </w:t>
-            </w:r>
-            <w:proofErr w:type="gramStart"/>
-            <w:r>
-              <w:rPr>
-                <w:rFonts w:ascii="Times New Roman" w:hAnsi="Times New Roman"/>
-                <w:color w:val="0070C0"/>
-                <w:sz w:val="24"/>
-              </w:rPr>
-              <w:t>has also been added</w:t>
-            </w:r>
-            <w:proofErr w:type="gramEnd"/>
-            <w:r>
-              <w:rPr>
-                <w:rFonts w:ascii="Times New Roman" w:hAnsi="Times New Roman"/>
-                <w:color w:val="0070C0"/>
-                <w:sz w:val="24"/>
-              </w:rPr>
-              <w:t xml:space="preserve"> as Figure 2.</w:t>
+              <w:t>We have expanded Section 2.1 ('Study Design, Sampling, and Analytical Sample') to detail the complete sample selection cascade. Specifically, we explicitly report that from the 8,784 live births occurring in the five years preceding the survey, 276 deceased children were excluded, and 4,421 children who were absent or not subsampled for anthropometry were excluded. The remaining children were screened for biological plausibility using WHO flags (|HAZ| ≤ 6, |WHZ| ≤ 5, |WAZ| ≤ 5), resulting in a verified, complete-case analytical sample of 4,087 children aged 0–59 months nested within 3,474 households across 670 community clusters. A formal STROBE participant selection flow diagram has also been added as Figure 2.</w:t>
             </w:r>
           </w:p>
           <w:p>
@@ -1021,27 +767,7 @@
                 <w:sz w:val="24"/>
                 <w:szCs w:val="24"/>
               </w:rPr>
-              <w:t xml:space="preserve">It seems the authors had hypothesized that factors associated with stunting, wasting, and underweight are similar. If this is the case, it </w:t>
-            </w:r>
-            <w:proofErr w:type="gramStart"/>
-            <w:r>
-              <w:rPr>
-                <w:rFonts w:ascii="Times New Roman" w:hAnsi="Times New Roman"/>
-                <w:color w:val="000000"/>
-                <w:sz w:val="24"/>
-                <w:szCs w:val="24"/>
-              </w:rPr>
-              <w:t>should be carefully interpreted</w:t>
-            </w:r>
-            <w:proofErr w:type="gramEnd"/>
-            <w:r>
-              <w:rPr>
-                <w:rFonts w:ascii="Times New Roman" w:hAnsi="Times New Roman"/>
-                <w:color w:val="000000"/>
-                <w:sz w:val="24"/>
-                <w:szCs w:val="24"/>
-              </w:rPr>
-              <w:t xml:space="preserve"> with reasons. If this is not the case, choice of assumed factors (e.g., those are included in the models) should be different for each undernutrition categories and should be justified by theories and evidence.</w:t>
+              <w:t>It seems the authors had hypothesized that factors associated with stunting, wasting, and underweight are similar. If this is the case, it should be carefully interpreted with reasons. If this is not the case, choice of assumed factors (e.g., those are included in the models) should be different for each undernutrition categories and should be justified by theories and evidence.</w:t>
             </w:r>
           </w:p>
         </w:tc>
@@ -1082,33 +808,7 @@
                 <w:color w:val="0070C0"/>
                 <w:sz w:val="24"/>
               </w:rPr>
-              <w:t>We thank Reviewer 1 for this essential epidemiological critique. We did not intend to imply that determinants of stunti</w:t>
-            </w:r>
-            <w:r>
-              <w:rPr>
-                <w:rFonts w:ascii="Times New Roman" w:hAnsi="Times New Roman"/>
-                <w:color w:val="0070C0"/>
-                <w:sz w:val="24"/>
-              </w:rPr>
-              <w:t xml:space="preserve">ng, wasting, and underweight are uniform. Rather, our conceptual framework (UNICEF, 2021) recognizes that linear growth faltering (stunting), acute </w:t>
-            </w:r>
-            <w:proofErr w:type="spellStart"/>
-            <w:r>
-              <w:rPr>
-                <w:rFonts w:ascii="Times New Roman" w:hAnsi="Times New Roman"/>
-                <w:color w:val="0070C0"/>
-                <w:sz w:val="24"/>
-              </w:rPr>
-              <w:t>ponderal</w:t>
-            </w:r>
-            <w:proofErr w:type="spellEnd"/>
-            <w:r>
-              <w:rPr>
-                <w:rFonts w:ascii="Times New Roman" w:hAnsi="Times New Roman"/>
-                <w:color w:val="0070C0"/>
-                <w:sz w:val="24"/>
-              </w:rPr>
-              <w:t xml:space="preserve"> wasting, and composite underweight stem from distinct biological pathways.</w:t>
+              <w:t>We thank Reviewer 1 for this essential epidemiological critique. We did not intend to imply that determinants of stunting, wasting, and underweight are uniform. Rather, our conceptual framework (UNICEF, 2021) recognizes that linear growth faltering (stunting), acute ponderal wasting, and composite underweight stem from distinct biological pathways.</w:t>
             </w:r>
           </w:p>
           <w:p>
@@ -1118,15 +818,7 @@
                 <w:color w:val="0070C0"/>
                 <w:sz w:val="24"/>
               </w:rPr>
-              <w:t>Our empirical findings s</w:t>
-            </w:r>
-            <w:r>
-              <w:rPr>
-                <w:rFonts w:ascii="Times New Roman" w:hAnsi="Times New Roman"/>
-                <w:color w:val="0070C0"/>
-                <w:sz w:val="24"/>
-              </w:rPr>
-              <w:t>trongly substantiate these differences across the three indices:</w:t>
+              <w:t>Our empirical findings strongly substantiate these differences across the three indices:</w:t>
             </w:r>
           </w:p>
           <w:p>
@@ -1137,24 +829,24 @@
                 <w:color w:val="0070C0"/>
                 <w:sz w:val="24"/>
               </w:rPr>
+              <w:t>• Child Age:</w:t>
+            </w:r>
+            <w:r>
+              <w:rPr>
+                <w:rFonts w:ascii="Times New Roman" w:hAnsi="Times New Roman"/>
+                <w:color w:val="0070C0"/>
+                <w:sz w:val="24"/>
+              </w:rPr>
+              <w:t xml:space="preserve"> A massive driver of chronic stunting (twofold surge at 12–23 </w:t>
+            </w:r>
+            <w:r>
+              <w:rPr>
+                <w:rFonts w:ascii="Times New Roman" w:hAnsi="Times New Roman"/>
+                <w:color w:val="0070C0"/>
+                <w:sz w:val="24"/>
+              </w:rPr>
               <w:lastRenderedPageBreak/>
-              <w:t>• Child Age:</w:t>
-            </w:r>
-            <w:r>
-              <w:rPr>
-                <w:rFonts w:ascii="Times New Roman" w:hAnsi="Times New Roman"/>
-                <w:color w:val="0070C0"/>
-                <w:sz w:val="24"/>
-              </w:rPr>
-              <w:t xml:space="preserve"> A massive driver of chronic stunting (twofold surge at 12–23 months, AOR = 2.38, 95% CI: 1.85–3.06) and progressive underweight (peaking at 48–59 months, AOR = 2.25), but is comp</w:t>
-            </w:r>
-            <w:r>
-              <w:rPr>
-                <w:rFonts w:ascii="Times New Roman" w:hAnsi="Times New Roman"/>
-                <w:color w:val="0070C0"/>
-                <w:sz w:val="24"/>
-              </w:rPr>
-              <w:t>letely unassociated with acute wasting (p = 0.449).</w:t>
+              <w:t>months, AOR = 2.38, 95% CI: 1.85–3.06) and progressive underweight (peaking at 48–59 months, AOR = 2.25), but is completely unassociated with acute wasting (p = 0.449).</w:t>
             </w:r>
           </w:p>
           <w:p>
@@ -1173,15 +865,7 @@
                 <w:color w:val="0070C0"/>
                 <w:sz w:val="24"/>
               </w:rPr>
-              <w:t xml:space="preserve"> Highly significant for stunting (ICC = 1.19%, MOR = 1.21, p &lt; 0.001) and underweight (ICC = 1.09%, MOR = 1.20, p &lt; 0.001), but negligible for wasting (ICC = 0.00%, MOR = 1.00, p = </w:t>
-            </w:r>
-            <w:r>
-              <w:rPr>
-                <w:rFonts w:ascii="Times New Roman" w:hAnsi="Times New Roman"/>
-                <w:color w:val="0070C0"/>
-                <w:sz w:val="24"/>
-              </w:rPr>
-              <w:t>0.718), demonstrating that wasting is an acute, episodic household crisis rather than a community-level contextual phenomenon.</w:t>
+              <w:t xml:space="preserve"> Highly significant for stunting (ICC = 1.19%, MOR = 1.21, p &lt; 0.001) and underweight (ICC = 1.09%, MOR = 1.20, p &lt; 0.001), but negligible for wasting (ICC = 0.00%, MOR = 1.00, p = 0.718), demonstrating that wasting is an acute, episodic household crisis rather than a community-level contextual phenomenon.</w:t>
             </w:r>
           </w:p>
           <w:p>
@@ -1200,15 +884,7 @@
                 <w:color w:val="0070C0"/>
                 <w:sz w:val="24"/>
               </w:rPr>
-              <w:t xml:space="preserve"> Cumulative births (≥4 children ever born) was specifically associated with wasting (AOR = 3.27, 9</w:t>
-            </w:r>
-            <w:r>
-              <w:rPr>
-                <w:rFonts w:ascii="Times New Roman" w:hAnsi="Times New Roman"/>
-                <w:color w:val="0070C0"/>
-                <w:sz w:val="24"/>
-              </w:rPr>
-              <w:t>5% CI: 0.91–11.70), reflecting acute resource competition and maternal physiological depletion, whereas it was non-significant for stunting.</w:t>
+              <w:t xml:space="preserve"> Cumulative births (≥4 children ever born) was specifically associated with wasting (AOR = 3.27, 95% CI: 0.91–11.70), reflecting acute resource competition and maternal physiological depletion, whereas it was non-significant for stunting.</w:t>
             </w:r>
           </w:p>
           <w:p>
@@ -1227,15 +903,7 @@
                 <w:color w:val="0070C0"/>
                 <w:sz w:val="24"/>
               </w:rPr>
-              <w:t xml:space="preserve"> Refrigerator ownership exerted an independent protective association specifically on und</w:t>
-            </w:r>
-            <w:r>
-              <w:rPr>
-                <w:rFonts w:ascii="Times New Roman" w:hAnsi="Times New Roman"/>
-                <w:color w:val="0070C0"/>
-                <w:sz w:val="24"/>
-              </w:rPr>
-              <w:t>erweight (AOR = 0.75, 95% CI: 0.62–0.92), underscoring cold-chain food safety.</w:t>
+              <w:t xml:space="preserve"> Refrigerator ownership exerted an independent protective association specifically on underweight (AOR = 0.75, 95% CI: 0.62–0.92), underscoring cold-chain food safety.</w:t>
             </w:r>
           </w:p>
           <w:p>
@@ -1256,16 +924,7 @@
                 <w:color w:val="0070C0"/>
                 <w:sz w:val="24"/>
               </w:rPr>
-              <w:t>Section 1 (Introduction, Pages 2–5, Lines 56–138), Section 2.3 (Explanatory Variables, Page 7, Lines 189–220), Sections 3.4–3.6 (Results, Pages 13–1</w:t>
-            </w:r>
-            <w:r>
-              <w:rPr>
-                <w:rFonts w:ascii="Times New Roman" w:hAnsi="Times New Roman"/>
-                <w:i/>
-                <w:color w:val="0070C0"/>
-                <w:sz w:val="24"/>
-              </w:rPr>
-              <w:t>4, Lines 315–351; Table 3, Pages 14–17), and Section 4 (Discussion, Pages 17–20, Lines 355–454).</w:t>
+              <w:t>Section 1 (Introduction, Pages 2–5, Lines 56–138), Section 2.3 (Explanatory Variables, Page 7, Lines 189–220), Sections 3.4–3.6 (Results, Pages 13–14, Lines 315–351; Table 3, Pages 14–17), and Section 4 (Discussion, Pages 17–20, Lines 355–454).</w:t>
             </w:r>
           </w:p>
         </w:tc>
@@ -1361,17 +1020,12 @@
             <w:tcW w:w="7416" w:type="dxa"/>
           </w:tcPr>
           <w:p>
-            <w:pPr>
-              <w:spacing w:after="60"/>
-              <w:jc w:val="both"/>
-              <w:rPr>
-                <w:sz w:val="24"/>
-                <w:szCs w:val="24"/>
-              </w:rPr>
-            </w:pPr>
-            <w:r>
-              <w:rPr>
-                <w:rFonts w:ascii="Times New Roman" w:hAnsi="Times New Roman"/>
+            <w:r/>
+            <w:r>
+              <w:rPr>
+                <w:rFonts w:ascii="Times New Roman" w:hAnsi="Times New Roman"/>
+                <w:b w:val="0"/>
+                <w:i w:val="0"/>
                 <w:color w:val="0070C0"/>
                 <w:sz w:val="24"/>
               </w:rPr>
@@ -1382,327 +1036,110 @@
             <w:r>
               <w:rPr>
                 <w:rFonts w:ascii="Times New Roman" w:hAnsi="Times New Roman"/>
+                <w:b/>
+                <w:i w:val="0"/>
                 <w:color w:val="0070C0"/>
                 <w:sz w:val="24"/>
               </w:rPr>
-              <w:t xml:space="preserve">1. Contrast with </w:t>
-            </w:r>
-            <w:proofErr w:type="spellStart"/>
-            <w:r>
-              <w:rPr>
-                <w:rFonts w:ascii="Times New Roman" w:hAnsi="Times New Roman"/>
+              <w:t>1. Contrast with Tamanna et al. (Scientific Reports, 2025 [25]):</w:t>
+            </w:r>
+            <w:r>
+              <w:rPr>
+                <w:rFonts w:ascii="Times New Roman" w:hAnsi="Times New Roman"/>
+                <w:b w:val="0"/>
+                <w:i w:val="0"/>
                 <w:color w:val="0070C0"/>
                 <w:sz w:val="24"/>
               </w:rPr>
-              <w:t>Tamanna</w:t>
-            </w:r>
-            <w:proofErr w:type="spellEnd"/>
-            <w:r>
-              <w:rPr>
-                <w:rFonts w:ascii="Times New Roman" w:hAnsi="Times New Roman"/>
-                <w:color w:val="0070C0"/>
-                <w:sz w:val="24"/>
-              </w:rPr>
-              <w:t xml:space="preserve"> et al. (Scientific Reports, 2025 [25]):</w:t>
+              <w:t xml:space="preserve"> Tamanna et al. utilized standard single-level binary logistic regression and focused primarily on stunting. By completely ignoring the multi-stage cluster sampling design of BDHS, single-level models artificially deflate standard errors and fail to estimate contextual neighborhood effects. In contrast, our study implements a rigorous two-level hierarchical random-intercept modeling framework across 670 Primary Sampling Units (PSUs), decomposing between-cluster variance and proving that over 80% of community-level variation is explained by household socio-environmental conditions.</w:t>
             </w:r>
           </w:p>
           <w:p>
-            <w:proofErr w:type="spellStart"/>
-            <w:r>
-              <w:rPr>
-                <w:rFonts w:ascii="Times New Roman" w:hAnsi="Times New Roman"/>
+            <w:r>
+              <w:rPr>
+                <w:rFonts w:ascii="Times New Roman" w:hAnsi="Times New Roman"/>
+                <w:b/>
+                <w:i w:val="0"/>
                 <w:color w:val="0070C0"/>
                 <w:sz w:val="24"/>
               </w:rPr>
-              <w:t>Tamanna</w:t>
-            </w:r>
-            <w:proofErr w:type="spellEnd"/>
-            <w:r>
-              <w:rPr>
-                <w:rFonts w:ascii="Times New Roman" w:hAnsi="Times New Roman"/>
+              <w:t>2. Contrast with Rashid et al. (BMC Public Health, 2026 [26]):</w:t>
+            </w:r>
+            <w:r>
+              <w:rPr>
+                <w:rFonts w:ascii="Times New Roman" w:hAnsi="Times New Roman"/>
+                <w:b w:val="0"/>
+                <w:i w:val="0"/>
                 <w:color w:val="0070C0"/>
                 <w:sz w:val="24"/>
               </w:rPr>
-              <w:t xml:space="preserve"> et al. utilized </w:t>
-            </w:r>
-            <w:r>
-              <w:rPr>
-                <w:rFonts w:ascii="Times New Roman" w:hAnsi="Times New Roman"/>
-                <w:color w:val="0070C0"/>
-                <w:sz w:val="24"/>
-              </w:rPr>
-              <w:t>standard single-level binary logistic regression and focused primarily on stunting. By completely ignoring the multi-stage cluster sampling design of BDHS, single-level models artificially deflate standard errors and fail to estimate contextual neighborhoo</w:t>
-            </w:r>
-            <w:r>
-              <w:rPr>
-                <w:rFonts w:ascii="Times New Roman" w:hAnsi="Times New Roman"/>
-                <w:color w:val="0070C0"/>
-                <w:sz w:val="24"/>
-              </w:rPr>
-              <w:t>d effects. In contrast, our study implements a rigorous two-level hierarchical random-intercept modeling framework across 670 Primary Sampling Units (PSUs), decomposing between-cluster variance and proving that over 80% of community-level variation is expl</w:t>
-            </w:r>
-            <w:r>
-              <w:rPr>
-                <w:rFonts w:ascii="Times New Roman" w:hAnsi="Times New Roman"/>
-                <w:color w:val="0070C0"/>
-                <w:sz w:val="24"/>
-              </w:rPr>
-              <w:t>ained by household socio-environmental conditions.</w:t>
+              <w:t xml:space="preserve"> Rashid et al. ('Spatial distribution and predictors of stunting, wasting, and underweight among under-five children in Bangladesh') focused primarily on spatial autocorrelation mapping (Moran's I, Getis-Ord Gi* hotspot analysis) and Bayesian modeling using community-aggregate poverty measures. In contrast, our study provides the definitive frequentist two-level hierarchical model across the complete verified biological sample (N = 4,087), quantifying between-cluster variance via Intraclass Correlation Coefficients (ICC) and Median Odds Ratios (MOR), while uniquely disaggregating domestic food preservation infrastructure (refrigerator ownership) and identifying the critical post-pandemic 12–23 month weaning transition surge.</w:t>
             </w:r>
           </w:p>
           <w:p>
             <w:r>
               <w:rPr>
                 <w:rFonts w:ascii="Times New Roman" w:hAnsi="Times New Roman"/>
+                <w:b/>
+                <w:i w:val="0"/>
                 <w:color w:val="0070C0"/>
                 <w:sz w:val="24"/>
               </w:rPr>
-              <w:t>2. Contrast with Rashid et al. (BMC Public Health, 2026 [26]):</w:t>
+              <w:t>3. Simultaneous Evaluation across WHO Standards:</w:t>
+            </w:r>
+            <w:r>
+              <w:rPr>
+                <w:rFonts w:ascii="Times New Roman" w:hAnsi="Times New Roman"/>
+                <w:b w:val="0"/>
+                <w:i w:val="0"/>
+                <w:color w:val="0070C0"/>
+                <w:sz w:val="24"/>
+              </w:rPr>
+              <w:t xml:space="preserve"> Our paper is the first to evaluate stunting, wasting, and underweight simultaneously within a unified sample under identical multilevel specifications, proving that chronic undernutrition is community-clustered whereas acute wasting operates with zero community clustering as an episodic family shock.</w:t>
             </w:r>
           </w:p>
           <w:p>
             <w:r>
               <w:rPr>
                 <w:rFonts w:ascii="Times New Roman" w:hAnsi="Times New Roman"/>
+                <w:b/>
+                <w:i w:val="0"/>
                 <w:color w:val="0070C0"/>
                 <w:sz w:val="24"/>
               </w:rPr>
-              <w:t xml:space="preserve">Rashid et al. ('Spatial distribution and predictors of stunting, wasting, and underweight among under-five children in Bangladesh') focused </w:t>
-            </w:r>
-            <w:r>
-              <w:rPr>
-                <w:rFonts w:ascii="Times New Roman" w:hAnsi="Times New Roman"/>
+              <w:t xml:space="preserve">[25] </w:t>
+            </w:r>
+            <w:r>
+              <w:rPr>
+                <w:rFonts w:ascii="Times New Roman" w:hAnsi="Times New Roman"/>
+                <w:b w:val="0"/>
+                <w:i w:val="0"/>
                 <w:color w:val="0070C0"/>
                 <w:sz w:val="24"/>
               </w:rPr>
-              <w:t xml:space="preserve">primarily on spatial autocorrelation mapping (Moran's I, </w:t>
-            </w:r>
-            <w:proofErr w:type="spellStart"/>
-            <w:r>
-              <w:rPr>
-                <w:rFonts w:ascii="Times New Roman" w:hAnsi="Times New Roman"/>
-                <w:color w:val="0070C0"/>
-                <w:sz w:val="24"/>
-              </w:rPr>
-              <w:t>Getis</w:t>
-            </w:r>
-            <w:proofErr w:type="spellEnd"/>
-            <w:r>
-              <w:rPr>
-                <w:rFonts w:ascii="Times New Roman" w:hAnsi="Times New Roman"/>
-                <w:color w:val="0070C0"/>
-                <w:sz w:val="24"/>
-              </w:rPr>
-              <w:t xml:space="preserve">-Ord </w:t>
-            </w:r>
-            <w:proofErr w:type="spellStart"/>
-            <w:r>
-              <w:rPr>
-                <w:rFonts w:ascii="Times New Roman" w:hAnsi="Times New Roman"/>
-                <w:color w:val="0070C0"/>
-                <w:sz w:val="24"/>
-              </w:rPr>
-              <w:t>Gi</w:t>
-            </w:r>
-            <w:proofErr w:type="spellEnd"/>
-            <w:r>
-              <w:rPr>
-                <w:rFonts w:ascii="Times New Roman" w:hAnsi="Times New Roman"/>
-                <w:color w:val="0070C0"/>
-                <w:sz w:val="24"/>
-              </w:rPr>
-              <w:t>* hotspot analysis) and Bayesian modeling using community-aggregate poverty measures. In contrast, our study provides the definitive frequentist two-level hierarchical model across the co</w:t>
-            </w:r>
-            <w:r>
-              <w:rPr>
-                <w:rFonts w:ascii="Times New Roman" w:hAnsi="Times New Roman"/>
-                <w:color w:val="0070C0"/>
-                <w:sz w:val="24"/>
-              </w:rPr>
-              <w:t xml:space="preserve">mplete verified biological sample (N </w:t>
-            </w:r>
-            <w:r>
-              <w:rPr>
-                <w:rFonts w:ascii="Times New Roman" w:hAnsi="Times New Roman"/>
-                <w:color w:val="0070C0"/>
-                <w:sz w:val="24"/>
-              </w:rPr>
-              <w:lastRenderedPageBreak/>
-              <w:t xml:space="preserve">= 4,087), quantifying between-cluster variance via </w:t>
-            </w:r>
-            <w:proofErr w:type="spellStart"/>
-            <w:r>
-              <w:rPr>
-                <w:rFonts w:ascii="Times New Roman" w:hAnsi="Times New Roman"/>
-                <w:color w:val="0070C0"/>
-                <w:sz w:val="24"/>
-              </w:rPr>
-              <w:t>Intraclass</w:t>
-            </w:r>
-            <w:proofErr w:type="spellEnd"/>
-            <w:r>
-              <w:rPr>
-                <w:rFonts w:ascii="Times New Roman" w:hAnsi="Times New Roman"/>
-                <w:color w:val="0070C0"/>
-                <w:sz w:val="24"/>
-              </w:rPr>
-              <w:t xml:space="preserve"> Correlation Coefficients (ICC) and Median Odds Ratios (MOR), while uniquely disaggregating domestic food preservation infrastructure (refrigerator ownership)</w:t>
-            </w:r>
-            <w:r>
-              <w:rPr>
-                <w:rFonts w:ascii="Times New Roman" w:hAnsi="Times New Roman"/>
-                <w:color w:val="0070C0"/>
-                <w:sz w:val="24"/>
-              </w:rPr>
-              <w:t xml:space="preserve"> and identifying the critical post-pandemic 12–23 month weaning transition surge.</w:t>
+              <w:t>Tamanna T, Mahmud S, Salma N, Hossain MM, Karim MR. Identifying determinants of malnutrition in under-five children in Bangladesh: insights from the BDHS-2022 cross-sectional study. Scientific Reports. 2025;15(1):14336. doi: 10.1038/s41598-025-99288-y.</w:t>
             </w:r>
           </w:p>
           <w:p>
             <w:r>
               <w:rPr>
                 <w:rFonts w:ascii="Times New Roman" w:hAnsi="Times New Roman"/>
+                <w:b/>
+                <w:i w:val="0"/>
                 <w:color w:val="0070C0"/>
                 <w:sz w:val="24"/>
               </w:rPr>
-              <w:t xml:space="preserve">3. Simultaneous Evaluation across WHO Standards: Our paper is the first to evaluate stunting, wasting, and underweight simultaneously within a unified sample under identical </w:t>
-            </w:r>
-            <w:r>
-              <w:rPr>
-                <w:rFonts w:ascii="Times New Roman" w:hAnsi="Times New Roman"/>
+              <w:t xml:space="preserve">[26] </w:t>
+            </w:r>
+            <w:r>
+              <w:rPr>
+                <w:rFonts w:ascii="Times New Roman" w:hAnsi="Times New Roman"/>
+                <w:b w:val="0"/>
+                <w:i w:val="0"/>
                 <w:color w:val="0070C0"/>
                 <w:sz w:val="24"/>
               </w:rPr>
-              <w:t>multilevel specifications, proving that chronic undernutrition is community-clustered whereas acute wasting operates with zero community clustering as an episodic family shock.</w:t>
-            </w:r>
-          </w:p>
-          <w:p>
-            <w:r>
-              <w:rPr>
-                <w:rFonts w:ascii="Times New Roman" w:hAnsi="Times New Roman"/>
-                <w:color w:val="0070C0"/>
-                <w:sz w:val="24"/>
-              </w:rPr>
-              <w:t xml:space="preserve">1. </w:t>
-            </w:r>
-            <w:proofErr w:type="spellStart"/>
-            <w:r>
-              <w:rPr>
-                <w:rFonts w:ascii="Times New Roman" w:hAnsi="Times New Roman"/>
-                <w:color w:val="0070C0"/>
-                <w:sz w:val="24"/>
-              </w:rPr>
-              <w:t>Tamanna</w:t>
-            </w:r>
-            <w:proofErr w:type="spellEnd"/>
-            <w:r>
-              <w:rPr>
-                <w:rFonts w:ascii="Times New Roman" w:hAnsi="Times New Roman"/>
-                <w:color w:val="0070C0"/>
-                <w:sz w:val="24"/>
-              </w:rPr>
-              <w:t xml:space="preserve"> T, Mahmud S, Salma N, Hossain MM, Karim MR. Identifying determinants</w:t>
-            </w:r>
-            <w:r>
-              <w:rPr>
-                <w:rFonts w:ascii="Times New Roman" w:hAnsi="Times New Roman"/>
-                <w:color w:val="0070C0"/>
-                <w:sz w:val="24"/>
-              </w:rPr>
-              <w:t xml:space="preserve"> of malnutrition in under-five children in Bangladesh: insights from the BDHS-2022 cross-sectional study. Scientific Reports. 2025</w:t>
-            </w:r>
-            <w:proofErr w:type="gramStart"/>
-            <w:r>
-              <w:rPr>
-                <w:rFonts w:ascii="Times New Roman" w:hAnsi="Times New Roman"/>
-                <w:color w:val="0070C0"/>
-                <w:sz w:val="24"/>
-              </w:rPr>
-              <w:t>;15</w:t>
-            </w:r>
-            <w:proofErr w:type="gramEnd"/>
-            <w:r>
-              <w:rPr>
-                <w:rFonts w:ascii="Times New Roman" w:hAnsi="Times New Roman"/>
-                <w:color w:val="0070C0"/>
-                <w:sz w:val="24"/>
-              </w:rPr>
-              <w:t xml:space="preserve">(1):14336. </w:t>
-            </w:r>
-            <w:proofErr w:type="spellStart"/>
-            <w:proofErr w:type="gramStart"/>
-            <w:r>
-              <w:rPr>
-                <w:rFonts w:ascii="Times New Roman" w:hAnsi="Times New Roman"/>
-                <w:color w:val="0070C0"/>
-                <w:sz w:val="24"/>
-              </w:rPr>
-              <w:t>doi</w:t>
-            </w:r>
-            <w:proofErr w:type="spellEnd"/>
-            <w:proofErr w:type="gramEnd"/>
-            <w:r>
-              <w:rPr>
-                <w:rFonts w:ascii="Times New Roman" w:hAnsi="Times New Roman"/>
-                <w:color w:val="0070C0"/>
-                <w:sz w:val="24"/>
-              </w:rPr>
-              <w:t>: 10.1038/s41598-025-99288-y.</w:t>
-            </w:r>
-          </w:p>
-          <w:p>
-            <w:r>
-              <w:rPr>
-                <w:rFonts w:ascii="Times New Roman" w:hAnsi="Times New Roman"/>
-                <w:color w:val="0070C0"/>
-                <w:sz w:val="24"/>
-              </w:rPr>
-              <w:t>2. Rashid M, Rahman M, Siddiqi NA, Islam R, Miah S, Roy TK, Rahman M. Spatial d</w:t>
-            </w:r>
-            <w:r>
-              <w:rPr>
-                <w:rFonts w:ascii="Times New Roman" w:hAnsi="Times New Roman"/>
-                <w:color w:val="0070C0"/>
-                <w:sz w:val="24"/>
-              </w:rPr>
-              <w:t>istribution and predictors of stunting, wasting, and underweight among under-five children in Bangladesh. BMC Public Health. 2026</w:t>
-            </w:r>
-            <w:proofErr w:type="gramStart"/>
-            <w:r>
-              <w:rPr>
-                <w:rFonts w:ascii="Times New Roman" w:hAnsi="Times New Roman"/>
-                <w:color w:val="0070C0"/>
-                <w:sz w:val="24"/>
-              </w:rPr>
-              <w:t>;26</w:t>
-            </w:r>
-            <w:proofErr w:type="gramEnd"/>
-            <w:r>
-              <w:rPr>
-                <w:rFonts w:ascii="Times New Roman" w:hAnsi="Times New Roman"/>
-                <w:color w:val="0070C0"/>
-                <w:sz w:val="24"/>
-              </w:rPr>
-              <w:t xml:space="preserve">(1):1504. </w:t>
-            </w:r>
-            <w:proofErr w:type="spellStart"/>
-            <w:proofErr w:type="gramStart"/>
-            <w:r>
-              <w:rPr>
-                <w:rFonts w:ascii="Times New Roman" w:hAnsi="Times New Roman"/>
-                <w:color w:val="0070C0"/>
-                <w:sz w:val="24"/>
-              </w:rPr>
-              <w:t>doi</w:t>
-            </w:r>
-            <w:proofErr w:type="spellEnd"/>
-            <w:proofErr w:type="gramEnd"/>
-            <w:r>
-              <w:rPr>
-                <w:rFonts w:ascii="Times New Roman" w:hAnsi="Times New Roman"/>
-                <w:color w:val="0070C0"/>
-                <w:sz w:val="24"/>
-              </w:rPr>
-              <w:t>: 10.1186/s12889-026-26793-8.</w:t>
+              <w:t>Rashid M, Rahman M, Siddiqi NA, Islam R, Miah S, Roy TK, Rahman M. Spatial distribution and predictors of stunting, wasting, and underweight among under-five children in Bangladesh. BMC Public Health. 2026;26(1):1504. doi: 10.1186/s12889-026-26793-8.</w:t>
             </w:r>
           </w:p>
           <w:p>
@@ -1719,20 +1156,12 @@
             <w:r>
               <w:rPr>
                 <w:rFonts w:ascii="Times New Roman" w:hAnsi="Times New Roman"/>
+                <w:b w:val="0"/>
                 <w:i/>
                 <w:color w:val="0070C0"/>
                 <w:sz w:val="24"/>
               </w:rPr>
-              <w:t>Section 1 (Introduction, Pages 4–5, Lines 105–122) a</w:t>
-            </w:r>
-            <w:r>
-              <w:rPr>
-                <w:rFonts w:ascii="Times New Roman" w:hAnsi="Times New Roman"/>
-                <w:i/>
-                <w:color w:val="0070C0"/>
-                <w:sz w:val="24"/>
-              </w:rPr>
-              <w:t>nd Section 4 (Discussion, Pages 19–20, Lines 431–442).</w:t>
+              <w:t>Section 1 (Introduction, Pages 4–5, Lines 105–122) and Section 4 (Discussion, Pages 19–20, Lines 431–442).</w:t>
             </w:r>
           </w:p>
         </w:tc>
@@ -1836,47 +1265,7 @@
                 <w:sz w:val="24"/>
                 <w:szCs w:val="24"/>
               </w:rPr>
-              <w:t xml:space="preserve">Survey design and weighting: The authors mention using sampling weights for the descriptive analysis but do not specify whether the complex survey design (clustering and stratification) </w:t>
-            </w:r>
-            <w:proofErr w:type="gramStart"/>
-            <w:r>
-              <w:rPr>
-                <w:rFonts w:ascii="Times New Roman" w:hAnsi="Times New Roman"/>
-                <w:color w:val="000000"/>
-                <w:sz w:val="24"/>
-                <w:szCs w:val="24"/>
-              </w:rPr>
-              <w:t>was accounted for</w:t>
-            </w:r>
-            <w:proofErr w:type="gramEnd"/>
-            <w:r>
-              <w:rPr>
-                <w:rFonts w:ascii="Times New Roman" w:hAnsi="Times New Roman"/>
-                <w:color w:val="000000"/>
-                <w:sz w:val="24"/>
-                <w:szCs w:val="24"/>
-              </w:rPr>
-              <w:t xml:space="preserve"> in the bivariate and multivariate models... Please explain how weights, strata, and primary sampling units </w:t>
-            </w:r>
-            <w:proofErr w:type="gramStart"/>
-            <w:r>
-              <w:rPr>
-                <w:rFonts w:ascii="Times New Roman" w:hAnsi="Times New Roman"/>
-                <w:color w:val="000000"/>
-                <w:sz w:val="24"/>
-                <w:szCs w:val="24"/>
-              </w:rPr>
-              <w:t>were handled</w:t>
-            </w:r>
-            <w:proofErr w:type="gramEnd"/>
-            <w:r>
-              <w:rPr>
-                <w:rFonts w:ascii="Times New Roman" w:hAnsi="Times New Roman"/>
-                <w:color w:val="000000"/>
-                <w:sz w:val="24"/>
-                <w:szCs w:val="24"/>
-              </w:rPr>
-              <w:t>.</w:t>
+              <w:t>Survey design and weighting: The authors mention using sampling weights for the descriptive analysis but do not specify whether the complex survey design (clustering and stratification) was accounted for in the bivariate and multivariate models... Please explain how weights, strata, and primary sampling units were handled.</w:t>
             </w:r>
           </w:p>
         </w:tc>
@@ -1911,19 +1300,12 @@
             <w:tcW w:w="7416" w:type="dxa"/>
           </w:tcPr>
           <w:p>
-            <w:pPr>
-              <w:spacing w:after="60"/>
-              <w:jc w:val="both"/>
-              <w:rPr>
-                <w:rFonts w:ascii="Times New Roman" w:hAnsi="Times New Roman"/>
-                <w:color w:val="0070C0"/>
-                <w:sz w:val="24"/>
-                <w:szCs w:val="24"/>
-              </w:rPr>
-            </w:pPr>
-            <w:r>
-              <w:rPr>
-                <w:rFonts w:ascii="Times New Roman" w:hAnsi="Times New Roman"/>
+            <w:r/>
+            <w:r>
+              <w:rPr>
+                <w:rFonts w:ascii="Times New Roman" w:hAnsi="Times New Roman"/>
+                <w:b w:val="0"/>
+                <w:i w:val="0"/>
                 <w:color w:val="0070C0"/>
                 <w:sz w:val="24"/>
               </w:rPr>
@@ -1935,6 +1317,7 @@
               <w:rPr>
                 <w:rFonts w:ascii="Times New Roman" w:hAnsi="Times New Roman"/>
                 <w:b/>
+                <w:i w:val="0"/>
                 <w:color w:val="0070C0"/>
                 <w:sz w:val="24"/>
               </w:rPr>
@@ -1943,6 +1326,8 @@
             <w:r>
               <w:rPr>
                 <w:rFonts w:ascii="Times New Roman" w:hAnsi="Times New Roman"/>
+                <w:b w:val="0"/>
+                <w:i w:val="0"/>
                 <w:color w:val="0070C0"/>
                 <w:sz w:val="24"/>
               </w:rPr>
@@ -1954,200 +1339,65 @@
               <w:rPr>
                 <w:rFonts w:ascii="Times New Roman" w:hAnsi="Times New Roman"/>
                 <w:b/>
+                <w:i w:val="0"/>
                 <w:color w:val="0070C0"/>
                 <w:sz w:val="24"/>
               </w:rPr>
-              <w:t>• Multi</w:t>
-            </w:r>
-            <w:r>
-              <w:rPr>
-                <w:rFonts w:ascii="Times New Roman" w:hAnsi="Times New Roman"/>
-                <w:b/>
+              <w:t>• Multilevel Regression Models:</w:t>
+            </w:r>
+            <w:r>
+              <w:rPr>
+                <w:rFonts w:ascii="Times New Roman" w:hAnsi="Times New Roman"/>
+                <w:b w:val="0"/>
+                <w:i w:val="0"/>
                 <w:color w:val="0070C0"/>
                 <w:sz w:val="24"/>
               </w:rPr>
-              <w:t>level Regression Models:</w:t>
-            </w:r>
-            <w:r>
-              <w:rPr>
-                <w:rFonts w:ascii="Times New Roman" w:hAnsi="Times New Roman"/>
-                <w:color w:val="0070C0"/>
-                <w:sz w:val="24"/>
-              </w:rPr>
-              <w:t xml:space="preserve"> In accordance with established statistical recommendations for complex surveys (Carle, 2009; </w:t>
-            </w:r>
-            <w:proofErr w:type="spellStart"/>
-            <w:r>
-              <w:rPr>
-                <w:rFonts w:ascii="Times New Roman" w:hAnsi="Times New Roman"/>
-                <w:color w:val="0070C0"/>
-                <w:sz w:val="24"/>
-              </w:rPr>
-              <w:t>Gelman</w:t>
-            </w:r>
-            <w:proofErr w:type="spellEnd"/>
-            <w:r>
-              <w:rPr>
-                <w:rFonts w:ascii="Times New Roman" w:hAnsi="Times New Roman"/>
-                <w:color w:val="0070C0"/>
-                <w:sz w:val="24"/>
-              </w:rPr>
-              <w:t xml:space="preserve">, 2007), clustering was modeled directly via cluster random intercepts (1 | </w:t>
-            </w:r>
-            <w:proofErr w:type="spellStart"/>
-            <w:r>
-              <w:rPr>
-                <w:rFonts w:ascii="Times New Roman" w:hAnsi="Times New Roman"/>
-                <w:color w:val="0070C0"/>
-                <w:sz w:val="24"/>
-              </w:rPr>
-              <w:t>Cluster_ID</w:t>
-            </w:r>
-            <w:proofErr w:type="spellEnd"/>
-            <w:r>
-              <w:rPr>
-                <w:rFonts w:ascii="Times New Roman" w:hAnsi="Times New Roman"/>
-                <w:color w:val="0070C0"/>
-                <w:sz w:val="24"/>
-              </w:rPr>
-              <w:t>) across 670 PSUs. Survey stratification varia</w:t>
-            </w:r>
-            <w:r>
-              <w:rPr>
-                <w:rFonts w:ascii="Times New Roman" w:hAnsi="Times New Roman"/>
-                <w:color w:val="0070C0"/>
-                <w:sz w:val="24"/>
-              </w:rPr>
-              <w:t xml:space="preserve">bles (administrative division and urban/rural residence) </w:t>
-            </w:r>
-            <w:proofErr w:type="gramStart"/>
-            <w:r>
-              <w:rPr>
-                <w:rFonts w:ascii="Times New Roman" w:hAnsi="Times New Roman"/>
-                <w:color w:val="0070C0"/>
-                <w:sz w:val="24"/>
-              </w:rPr>
-              <w:t>were incorporated</w:t>
-            </w:r>
-            <w:proofErr w:type="gramEnd"/>
-            <w:r>
-              <w:rPr>
-                <w:rFonts w:ascii="Times New Roman" w:hAnsi="Times New Roman"/>
-                <w:color w:val="0070C0"/>
-                <w:sz w:val="24"/>
-              </w:rPr>
-              <w:t xml:space="preserve"> directly as fixed-effect covariates in Model III, ensuring unbiased parameter estimation without artificial weight distortion in generalized linear mixed models.</w:t>
+              <w:t xml:space="preserve"> In accordance with established statistical recommendations for complex surveys (Carle, 2009 [21]; Gelman, 2007), clustering was modeled directly via cluster random intercepts (1 | Cluster_ID) across 670 PSUs. Survey stratification variables (administrative division and urban/rural residence) were incorporated directly as fixed-effect covariates in Model III, ensuring unbiased parameter estimation without artificial weight distortion in generalized linear mixed models.</w:t>
             </w:r>
           </w:p>
           <w:p>
             <w:r>
               <w:rPr>
                 <w:rFonts w:ascii="Times New Roman" w:hAnsi="Times New Roman"/>
+                <w:b/>
+                <w:i w:val="0"/>
                 <w:color w:val="0070C0"/>
                 <w:sz w:val="24"/>
               </w:rPr>
-              <w:t>1. Carle AC. Fittin</w:t>
-            </w:r>
-            <w:r>
-              <w:rPr>
-                <w:rFonts w:ascii="Times New Roman" w:hAnsi="Times New Roman"/>
+              <w:t xml:space="preserve">[21] </w:t>
+            </w:r>
+            <w:r>
+              <w:rPr>
+                <w:rFonts w:ascii="Times New Roman" w:hAnsi="Times New Roman"/>
+                <w:b w:val="0"/>
+                <w:i w:val="0"/>
                 <w:color w:val="0070C0"/>
                 <w:sz w:val="24"/>
               </w:rPr>
-              <w:t xml:space="preserve">g multilevel models in complex survey data with design weights: Recommendations. BMC Medical Research Methodology. </w:t>
-            </w:r>
-            <w:r>
-              <w:rPr>
-                <w:rFonts w:ascii="Times New Roman" w:hAnsi="Times New Roman"/>
-                <w:color w:val="0070C0"/>
-                <w:sz w:val="24"/>
-              </w:rPr>
-              <w:lastRenderedPageBreak/>
-              <w:t>2009</w:t>
-            </w:r>
-            <w:proofErr w:type="gramStart"/>
-            <w:r>
-              <w:rPr>
-                <w:rFonts w:ascii="Times New Roman" w:hAnsi="Times New Roman"/>
-                <w:color w:val="0070C0"/>
-                <w:sz w:val="24"/>
-              </w:rPr>
-              <w:t>;9</w:t>
-            </w:r>
-            <w:proofErr w:type="gramEnd"/>
-            <w:r>
-              <w:rPr>
-                <w:rFonts w:ascii="Times New Roman" w:hAnsi="Times New Roman"/>
-                <w:color w:val="0070C0"/>
-                <w:sz w:val="24"/>
-              </w:rPr>
-              <w:t xml:space="preserve">(1):49. </w:t>
-            </w:r>
-            <w:proofErr w:type="spellStart"/>
-            <w:proofErr w:type="gramStart"/>
-            <w:r>
-              <w:rPr>
-                <w:rFonts w:ascii="Times New Roman" w:hAnsi="Times New Roman"/>
-                <w:color w:val="0070C0"/>
-                <w:sz w:val="24"/>
-              </w:rPr>
-              <w:t>doi</w:t>
-            </w:r>
-            <w:proofErr w:type="spellEnd"/>
-            <w:proofErr w:type="gramEnd"/>
-            <w:r>
-              <w:rPr>
-                <w:rFonts w:ascii="Times New Roman" w:hAnsi="Times New Roman"/>
-                <w:color w:val="0070C0"/>
-                <w:sz w:val="24"/>
-              </w:rPr>
-              <w:t>: 10.1186/1471-2288-9-49.</w:t>
+              <w:t>Carle AC. Fitting multilevel models in complex survey data with design weights: Recommendations. BMC Medical Research Methodology. 2009;9(1):49. doi: 10.1186/1471-2288-9-49.</w:t>
             </w:r>
           </w:p>
           <w:p>
             <w:r>
               <w:rPr>
                 <w:rFonts w:ascii="Times New Roman" w:hAnsi="Times New Roman"/>
+                <w:b/>
+                <w:i w:val="0"/>
                 <w:color w:val="0070C0"/>
                 <w:sz w:val="24"/>
               </w:rPr>
-              <w:t xml:space="preserve">2. </w:t>
-            </w:r>
-            <w:proofErr w:type="spellStart"/>
-            <w:r>
-              <w:rPr>
-                <w:rFonts w:ascii="Times New Roman" w:hAnsi="Times New Roman"/>
+              <w:t xml:space="preserve">[Methodological Ref] </w:t>
+            </w:r>
+            <w:r>
+              <w:rPr>
+                <w:rFonts w:ascii="Times New Roman" w:hAnsi="Times New Roman"/>
+                <w:b w:val="0"/>
+                <w:i w:val="0"/>
                 <w:color w:val="0070C0"/>
                 <w:sz w:val="24"/>
               </w:rPr>
-              <w:t>Gelman</w:t>
-            </w:r>
-            <w:proofErr w:type="spellEnd"/>
-            <w:r>
-              <w:rPr>
-                <w:rFonts w:ascii="Times New Roman" w:hAnsi="Times New Roman"/>
-                <w:color w:val="0070C0"/>
-                <w:sz w:val="24"/>
-              </w:rPr>
-              <w:t xml:space="preserve"> A. Struggles with survey weighting and regression modeling. Statistical Science. 2007</w:t>
-            </w:r>
-            <w:proofErr w:type="gramStart"/>
-            <w:r>
-              <w:rPr>
-                <w:rFonts w:ascii="Times New Roman" w:hAnsi="Times New Roman"/>
-                <w:color w:val="0070C0"/>
-                <w:sz w:val="24"/>
-              </w:rPr>
-              <w:t>;22</w:t>
-            </w:r>
-            <w:proofErr w:type="gramEnd"/>
-            <w:r>
-              <w:rPr>
-                <w:rFonts w:ascii="Times New Roman" w:hAnsi="Times New Roman"/>
-                <w:color w:val="0070C0"/>
-                <w:sz w:val="24"/>
-              </w:rPr>
-              <w:t>(2):153–164.</w:t>
+              <w:t>Gelman A. Struggles with survey weighting and regression modeling. Statistical Science. 2007;22(2):153–164.</w:t>
             </w:r>
           </w:p>
           <w:p>
@@ -2164,6 +1414,7 @@
             <w:r>
               <w:rPr>
                 <w:rFonts w:ascii="Times New Roman" w:hAnsi="Times New Roman"/>
+                <w:b w:val="0"/>
                 <w:i/>
                 <w:color w:val="0070C0"/>
                 <w:sz w:val="24"/>
@@ -2229,27 +1480,7 @@
                 <w:sz w:val="24"/>
                 <w:szCs w:val="24"/>
               </w:rPr>
-              <w:t xml:space="preserve">Missing data and selection of the final sample: The final analysis looked at 4,087 children out of 8,784 born in the five years before the survey. Details on missing data for each variable </w:t>
-            </w:r>
-            <w:proofErr w:type="gramStart"/>
-            <w:r>
-              <w:rPr>
-                <w:rFonts w:ascii="Times New Roman" w:hAnsi="Times New Roman"/>
-                <w:color w:val="000000"/>
-                <w:sz w:val="24"/>
-                <w:szCs w:val="24"/>
-              </w:rPr>
-              <w:t>are needed</w:t>
-            </w:r>
-            <w:proofErr w:type="gramEnd"/>
-            <w:r>
-              <w:rPr>
-                <w:rFonts w:ascii="Times New Roman" w:hAnsi="Times New Roman"/>
-                <w:color w:val="000000"/>
-                <w:sz w:val="24"/>
-                <w:szCs w:val="24"/>
-              </w:rPr>
-              <w:t>... Add a flow chart (STROBE participant flow).</w:t>
+              <w:t>Missing data and selection of the final sample: The final analysis looked at 4,087 children out of 8,784 born in the five years before the survey. Details on missing data for each variable are needed... Add a flow chart (STROBE participant flow).</w:t>
             </w:r>
           </w:p>
         </w:tc>
@@ -2357,33 +1588,7 @@
                 <w:color w:val="0070C0"/>
                 <w:sz w:val="24"/>
               </w:rPr>
-              <w:t xml:space="preserve"> In BDHS 2022, anthropomet</w:t>
-            </w:r>
-            <w:r>
-              <w:rPr>
-                <w:rFonts w:ascii="Times New Roman" w:hAnsi="Times New Roman"/>
-                <w:color w:val="0070C0"/>
-                <w:sz w:val="24"/>
-              </w:rPr>
-              <w:t xml:space="preserve">ric measurements </w:t>
-            </w:r>
-            <w:proofErr w:type="gramStart"/>
-            <w:r>
-              <w:rPr>
-                <w:rFonts w:ascii="Times New Roman" w:hAnsi="Times New Roman"/>
-                <w:color w:val="0070C0"/>
-                <w:sz w:val="24"/>
-              </w:rPr>
-              <w:t>were performed</w:t>
-            </w:r>
-            <w:proofErr w:type="gramEnd"/>
-            <w:r>
-              <w:rPr>
-                <w:rFonts w:ascii="Times New Roman" w:hAnsi="Times New Roman"/>
-                <w:color w:val="0070C0"/>
-                <w:sz w:val="24"/>
-              </w:rPr>
-              <w:t xml:space="preserve"> in a randomized one-third subsample of households; 4,421 children were not measured due to subsampling protocol or temporary absence.</w:t>
+              <w:t xml:space="preserve"> In BDHS 2022, anthropometric measurements were performed in a randomized one-third subsample of households; 4,421 children were not measured due to subsampling protocol or temporary absence.</w:t>
             </w:r>
           </w:p>
           <w:p>
@@ -2393,33 +1598,7 @@
                 <w:color w:val="0070C0"/>
                 <w:sz w:val="24"/>
               </w:rPr>
-              <w:t xml:space="preserve">4. Biologically Implausible Flags: Measured children were screened against WHO biological </w:t>
-            </w:r>
-            <w:r>
-              <w:rPr>
-                <w:rFonts w:ascii="Times New Roman" w:hAnsi="Times New Roman"/>
-                <w:color w:val="0070C0"/>
-                <w:sz w:val="24"/>
-              </w:rPr>
-              <w:t xml:space="preserve">plausibility cutoffs (|HAZ| ≤ 6, |WHZ| ≤ 5, </w:t>
-            </w:r>
-            <w:proofErr w:type="gramStart"/>
-            <w:r>
-              <w:rPr>
-                <w:rFonts w:ascii="Times New Roman" w:hAnsi="Times New Roman"/>
-                <w:color w:val="0070C0"/>
-                <w:sz w:val="24"/>
-              </w:rPr>
-              <w:t>|</w:t>
-            </w:r>
-            <w:proofErr w:type="gramEnd"/>
-            <w:r>
-              <w:rPr>
-                <w:rFonts w:ascii="Times New Roman" w:hAnsi="Times New Roman"/>
-                <w:color w:val="0070C0"/>
-                <w:sz w:val="24"/>
-              </w:rPr>
-              <w:t>WAZ| ≤ 5). Zero children exceeded plausible limits.</w:t>
+              <w:t>4. Biologically Implausible Flags: Measured children were screened against WHO biological plausibility cutoffs (|HAZ| ≤ 6, |WHZ| ≤ 5, |WAZ| ≤ 5). Zero children exceeded plausible limits.</w:t>
             </w:r>
           </w:p>
           <w:p>
@@ -2450,16 +1629,7 @@
                 <w:color w:val="0070C0"/>
                 <w:sz w:val="24"/>
               </w:rPr>
-              <w:t xml:space="preserve">Section 2.1 (Page 5, </w:t>
-            </w:r>
-            <w:r>
-              <w:rPr>
-                <w:rFonts w:ascii="Times New Roman" w:hAnsi="Times New Roman"/>
-                <w:i/>
-                <w:color w:val="0070C0"/>
-                <w:sz w:val="24"/>
-              </w:rPr>
-              <w:t>Lines 140–164); Figure 2 (Page 6, Lines 165–167).</w:t>
+              <w:t>Section 2.1 (Page 5, Lines 140–164); Figure 2 (Page 6, Lines 165–167).</w:t>
             </w:r>
           </w:p>
         </w:tc>
@@ -2519,27 +1689,7 @@
                 <w:sz w:val="24"/>
                 <w:szCs w:val="24"/>
               </w:rPr>
-              <w:t xml:space="preserve">Choice of the multilevel model: The authors thoughtfully applied a three-level model, accounting for clustering at both the community (PSU) and household levels. However, in BDHS data, many households have only one eligible child... discuss whether household-level clustering </w:t>
-            </w:r>
-            <w:proofErr w:type="gramStart"/>
-            <w:r>
-              <w:rPr>
-                <w:rFonts w:ascii="Times New Roman" w:hAnsi="Times New Roman"/>
-                <w:color w:val="000000"/>
-                <w:sz w:val="24"/>
-                <w:szCs w:val="24"/>
-              </w:rPr>
-              <w:t>is adequately supported</w:t>
-            </w:r>
-            <w:proofErr w:type="gramEnd"/>
-            <w:r>
-              <w:rPr>
-                <w:rFonts w:ascii="Times New Roman" w:hAnsi="Times New Roman"/>
-                <w:color w:val="000000"/>
-                <w:sz w:val="24"/>
-                <w:szCs w:val="24"/>
-              </w:rPr>
-              <w:t>.</w:t>
+              <w:t>Choice of the multilevel model: The authors thoughtfully applied a three-level model, accounting for clustering at both the community (PSU) and household levels. However, in BDHS data, many households have only one eligible child... discuss whether household-level clustering is adequately supported.</w:t>
             </w:r>
           </w:p>
         </w:tc>
@@ -2588,25 +1738,7 @@
                 <w:color w:val="0070C0"/>
                 <w:sz w:val="24"/>
               </w:rPr>
-              <w:t>We are grateful to Reviewer 2 for this perceptive statistical insight. In our analytical sample of 4,087 children, 3,252 out of 3,664 households (88.8%) contributed only a single child (</w:t>
-            </w:r>
-            <w:proofErr w:type="gramStart"/>
-            <w:r>
-              <w:rPr>
-                <w:rFonts w:ascii="Times New Roman" w:hAnsi="Times New Roman"/>
-                <w:color w:val="0070C0"/>
-                <w:sz w:val="24"/>
-              </w:rPr>
-              <w:t>mean:</w:t>
-            </w:r>
-            <w:proofErr w:type="gramEnd"/>
-            <w:r>
-              <w:rPr>
-                <w:rFonts w:ascii="Times New Roman" w:hAnsi="Times New Roman"/>
-                <w:color w:val="0070C0"/>
-                <w:sz w:val="24"/>
-              </w:rPr>
-              <w:t xml:space="preserve"> 1.18 children per household). Fitting a three-level model (child nested in household nested in community) resulted in singular fit with near-zero household-level variance (variance &lt; 0.0001).</w:t>
+              <w:t>We are grateful to Reviewer 2 for this perceptive statistical insight. In our analytical sample of 4,087 children, 3,252 out of 3,664 households (88.8%) contributed only a single child (mean: 1.18 children per household). Fitting a three-level model (child nested in household nested in community) resulted in singular fit with near-zero household-level variance (variance &lt; 0.0001).</w:t>
             </w:r>
           </w:p>
           <w:p>
@@ -2616,15 +1748,7 @@
                 <w:color w:val="0070C0"/>
                 <w:sz w:val="24"/>
               </w:rPr>
-              <w:t>Consequently, we fitted a parsimonious and statistically stable two-level random-intercept logistic model (Level 1: individual child, Level 2: community cluster/PSU across 670 clusters). Likelihood Ratio Tests confir</w:t>
-            </w:r>
-            <w:r>
-              <w:rPr>
-                <w:rFonts w:ascii="Times New Roman" w:hAnsi="Times New Roman"/>
-                <w:color w:val="0070C0"/>
-                <w:sz w:val="24"/>
-              </w:rPr>
-              <w:t>med highly significant community-level clustering for stunting (chi2 = 16.36, p &lt; 0.001) and underweight (chi2 = 10.07, p &lt; 0.001).</w:t>
+              <w:t>Consequently, we fitted a parsimonious and statistically stable two-level random-intercept logistic model (Level 1: individual child, Level 2: community cluster/PSU across 670 clusters). Likelihood Ratio Tests confirmed highly significant community-level clustering for stunting (chi2 = 16.36, p &lt; 0.001) and underweight (chi2 = 10.07, p &lt; 0.001).</w:t>
             </w:r>
           </w:p>
           <w:p>
@@ -2705,7 +1829,7 @@
                 <w:sz w:val="24"/>
                 <w:szCs w:val="24"/>
               </w:rPr>
-              <w:t xml:space="preserve">Model selection and </w:t>
+              <w:t xml:space="preserve">Model selection and interpretation: The manuscript discusses AIC, BIC, and log-likelihood </w:t>
             </w:r>
             <w:r>
               <w:rPr>
@@ -2715,7 +1839,7 @@
                 <w:szCs w:val="24"/>
               </w:rPr>
               <w:lastRenderedPageBreak/>
-              <w:t>interpretation: The manuscript discusses AIC, BIC, and log-likelihood across models. In some cases, Model II appears to have a lower AIC than Model III, which would usually make it the preferred model. If the authors choose to focus on Model III, they should explain the rationale.</w:t>
+              <w:t>across models. In some cases, Model II appears to have a lower AIC than Model III, which would usually make it the preferred model. If the authors choose to focus on Model III, they should explain the rationale.</w:t>
             </w:r>
           </w:p>
         </w:tc>
@@ -2846,47 +1970,7 @@
                 <w:sz w:val="24"/>
                 <w:szCs w:val="24"/>
               </w:rPr>
-              <w:t xml:space="preserve">Interpretation of associations: Because this is a cross-sectional study, causal language </w:t>
-            </w:r>
-            <w:proofErr w:type="gramStart"/>
-            <w:r>
-              <w:rPr>
-                <w:rFonts w:ascii="Times New Roman" w:hAnsi="Times New Roman"/>
-                <w:color w:val="000000"/>
-                <w:sz w:val="24"/>
-                <w:szCs w:val="24"/>
-              </w:rPr>
-              <w:t>should be avoided</w:t>
-            </w:r>
-            <w:proofErr w:type="gramEnd"/>
-            <w:r>
-              <w:rPr>
-                <w:rFonts w:ascii="Times New Roman" w:hAnsi="Times New Roman"/>
-                <w:color w:val="000000"/>
-                <w:sz w:val="24"/>
-                <w:szCs w:val="24"/>
-              </w:rPr>
-              <w:t xml:space="preserve">. The manuscript currently uses terms like 'impact,' 'influence,' or 'effects' in several places. These </w:t>
-            </w:r>
-            <w:proofErr w:type="gramStart"/>
-            <w:r>
-              <w:rPr>
-                <w:rFonts w:ascii="Times New Roman" w:hAnsi="Times New Roman"/>
-                <w:color w:val="000000"/>
-                <w:sz w:val="24"/>
-                <w:szCs w:val="24"/>
-              </w:rPr>
-              <w:t>should be replaced</w:t>
-            </w:r>
-            <w:proofErr w:type="gramEnd"/>
-            <w:r>
-              <w:rPr>
-                <w:rFonts w:ascii="Times New Roman" w:hAnsi="Times New Roman"/>
-                <w:color w:val="000000"/>
-                <w:sz w:val="24"/>
-                <w:szCs w:val="24"/>
-              </w:rPr>
-              <w:t xml:space="preserve"> with words like 'associated with' or 'odds of.'</w:t>
+              <w:t>Interpretation of associations: Because this is a cross-sectional study, causal language should be avoided. The manuscript currently uses terms like 'impact,' 'influence,' or 'effects' in several places. These should be replaced with words like 'associated with' or 'odds of.'</w:t>
             </w:r>
           </w:p>
         </w:tc>
@@ -3007,29 +2091,7 @@
                 <w:sz w:val="24"/>
                 <w:szCs w:val="24"/>
               </w:rPr>
-              <w:t xml:space="preserve">Bivariate chi-square statistics </w:t>
-            </w:r>
-            <w:proofErr w:type="gramStart"/>
-            <w:r>
-              <w:rPr>
-                <w:rFonts w:ascii="Times New Roman" w:hAnsi="Times New Roman"/>
-                <w:b/>
-                <w:color w:val="000000"/>
-                <w:sz w:val="24"/>
-                <w:szCs w:val="24"/>
-              </w:rPr>
-              <w:t>reporting:</w:t>
-            </w:r>
-            <w:proofErr w:type="gramEnd"/>
-            <w:r>
-              <w:rPr>
-                <w:rFonts w:ascii="Times New Roman" w:hAnsi="Times New Roman"/>
-                <w:b/>
-                <w:color w:val="000000"/>
-                <w:sz w:val="24"/>
-                <w:szCs w:val="24"/>
-              </w:rPr>
-              <w:t xml:space="preserve"> </w:t>
+              <w:t xml:space="preserve">Bivariate chi-square statistics reporting: </w:t>
             </w:r>
             <w:r>
               <w:rPr>
@@ -3087,43 +2149,7 @@
                 <w:color w:val="0070C0"/>
                 <w:sz w:val="24"/>
               </w:rPr>
-              <w:t xml:space="preserve">Table 2 </w:t>
-            </w:r>
-            <w:proofErr w:type="gramStart"/>
-            <w:r>
-              <w:rPr>
-                <w:rFonts w:ascii="Times New Roman" w:hAnsi="Times New Roman"/>
-                <w:color w:val="0070C0"/>
-                <w:sz w:val="24"/>
-              </w:rPr>
-              <w:t>has been updated</w:t>
-            </w:r>
-            <w:proofErr w:type="gramEnd"/>
-            <w:r>
-              <w:rPr>
-                <w:rFonts w:ascii="Times New Roman" w:hAnsi="Times New Roman"/>
-                <w:color w:val="0070C0"/>
-                <w:sz w:val="24"/>
-              </w:rPr>
-              <w:t xml:space="preserve"> to report Pearson Chi-square test statistics, degrees of freedom (</w:t>
-            </w:r>
-            <w:proofErr w:type="spellStart"/>
-            <w:r>
-              <w:rPr>
-                <w:rFonts w:ascii="Times New Roman" w:hAnsi="Times New Roman"/>
-                <w:color w:val="0070C0"/>
-                <w:sz w:val="24"/>
-              </w:rPr>
-              <w:t>df</w:t>
-            </w:r>
-            <w:proofErr w:type="spellEnd"/>
-            <w:r>
-              <w:rPr>
-                <w:rFonts w:ascii="Times New Roman" w:hAnsi="Times New Roman"/>
-                <w:color w:val="0070C0"/>
-                <w:sz w:val="24"/>
-              </w:rPr>
-              <w:t>), and exact p-values for all 20 explanatory variables across stunting, wasting, and underweight.</w:t>
+              <w:t>Table 2 has been updated to report Pearson Chi-square test statistics, degrees of freedom (df), and exact p-values for all 20 explanatory variables across stunting, wasting, and underweight.</w:t>
             </w:r>
           </w:p>
           <w:p>
@@ -3204,27 +2230,7 @@
                 <w:sz w:val="24"/>
                 <w:szCs w:val="24"/>
               </w:rPr>
-              <w:t xml:space="preserve">Potential confounding: The selection of variables </w:t>
-            </w:r>
-            <w:proofErr w:type="gramStart"/>
-            <w:r>
-              <w:rPr>
-                <w:rFonts w:ascii="Times New Roman" w:hAnsi="Times New Roman"/>
-                <w:color w:val="000000"/>
-                <w:sz w:val="24"/>
-                <w:szCs w:val="24"/>
-              </w:rPr>
-              <w:t>was based</w:t>
-            </w:r>
-            <w:proofErr w:type="gramEnd"/>
-            <w:r>
-              <w:rPr>
-                <w:rFonts w:ascii="Times New Roman" w:hAnsi="Times New Roman"/>
-                <w:color w:val="000000"/>
-                <w:sz w:val="24"/>
-                <w:szCs w:val="24"/>
-              </w:rPr>
-              <w:t xml:space="preserve"> on the UNICEF framework, presumably... Discuss unmeasured confounders like dietary diversity and maternal nutrition.</w:t>
+              <w:t>Potential confounding: The selection of variables was based on the UNICEF framework, presumably... Discuss unmeasured confounders like dietary diversity and maternal nutrition.</w:t>
             </w:r>
           </w:p>
         </w:tc>
@@ -3285,36 +2291,16 @@
                 <w:color w:val="0070C0"/>
                 <w:sz w:val="24"/>
               </w:rPr>
-              <w:t>Mod</w:t>
-            </w:r>
-            <w:r>
-              <w:rPr>
-                <w:rFonts w:ascii="Times New Roman" w:hAnsi="Times New Roman"/>
-                <w:b/>
+              <w:t xml:space="preserve">Modifications in Manuscript: </w:t>
+            </w:r>
+            <w:r>
+              <w:rPr>
+                <w:rFonts w:ascii="Times New Roman" w:hAnsi="Times New Roman"/>
                 <w:i/>
                 <w:color w:val="0070C0"/>
                 <w:sz w:val="24"/>
               </w:rPr>
-              <w:t xml:space="preserve">ifications in Manuscript: </w:t>
-            </w:r>
-            <w:r>
-              <w:rPr>
-                <w:rFonts w:ascii="Times New Roman" w:hAnsi="Times New Roman"/>
-                <w:i/>
-                <w:color w:val="0070C0"/>
-                <w:sz w:val="24"/>
-              </w:rPr>
-              <w:t xml:space="preserve">Section 4 (Discussion: Strengths and </w:t>
-            </w:r>
-            <w:r>
-              <w:rPr>
-                <w:rFonts w:ascii="Times New Roman" w:hAnsi="Times New Roman"/>
-                <w:i/>
-                <w:color w:val="0070C0"/>
-                <w:sz w:val="24"/>
-              </w:rPr>
-              <w:lastRenderedPageBreak/>
-              <w:t>limitations, Pages 19–20, Lines 443–454).</w:t>
+              <w:t>Section 4 (Discussion: Strengths and limitations, Pages 19–20, Lines 443–454).</w:t>
             </w:r>
           </w:p>
         </w:tc>
@@ -3418,27 +2404,7 @@
                 <w:sz w:val="24"/>
                 <w:szCs w:val="24"/>
               </w:rPr>
-              <w:t xml:space="preserve">Covariate adjustment: Child age is absent from the models despite its relevance to nutrition outcomes. Incorporating child age into the models is critical. In addition, living children and children ever born are likely to be highly collinear, and birth order </w:t>
-            </w:r>
-            <w:proofErr w:type="gramStart"/>
-            <w:r>
-              <w:rPr>
-                <w:rFonts w:ascii="Times New Roman" w:hAnsi="Times New Roman"/>
-                <w:color w:val="000000"/>
-                <w:sz w:val="24"/>
-                <w:szCs w:val="24"/>
-              </w:rPr>
-              <w:t>may also</w:t>
-            </w:r>
-            <w:proofErr w:type="gramEnd"/>
-            <w:r>
-              <w:rPr>
-                <w:rFonts w:ascii="Times New Roman" w:hAnsi="Times New Roman"/>
-                <w:color w:val="000000"/>
-                <w:sz w:val="24"/>
-                <w:szCs w:val="24"/>
-              </w:rPr>
-              <w:t xml:space="preserve"> overlap with these variables. The authors should consider collinearity diagnostics and sensitivity analyses.</w:t>
+              <w:t>Covariate adjustment: Child age is absent from the models despite its relevance to nutrition outcomes. Incorporating child age into the models is critical. In addition, living children and children ever born are likely to be highly collinear, and birth order may also overlap with these variables. The authors should consider collinearity diagnostics and sensitivity analyses.</w:t>
             </w:r>
           </w:p>
         </w:tc>
@@ -3500,8 +2466,18 @@
                 <w:color w:val="0070C0"/>
                 <w:sz w:val="24"/>
               </w:rPr>
-              <w:t>1. Full Integrat</w:t>
-            </w:r>
+              <w:t>1. Full Integration of Child Age:</w:t>
+            </w:r>
+            <w:r>
+              <w:rPr>
+                <w:rFonts w:ascii="Times New Roman" w:hAnsi="Times New Roman"/>
+                <w:color w:val="0070C0"/>
+                <w:sz w:val="24"/>
+              </w:rPr>
+              <w:t xml:space="preserve"> Child age in completed months has been incorporated across all descriptive, bivariate, and multilevel models (categorized into: 0–11, 12–23, 24–35, 36–47, and 48–59 months). This resolved a major omission in earlier drafts.</w:t>
+            </w:r>
+          </w:p>
+          <w:p>
             <w:r>
               <w:rPr>
                 <w:rFonts w:ascii="Times New Roman" w:hAnsi="Times New Roman"/>
@@ -3509,7 +2485,7 @@
                 <w:color w:val="0070C0"/>
                 <w:sz w:val="24"/>
               </w:rPr>
-              <w:t>ion of Child Age:</w:t>
+              <w:t>2. Substantial Model Fit Improvement:</w:t>
             </w:r>
             <w:r>
               <w:rPr>
@@ -3517,123 +2493,17 @@
                 <w:color w:val="0070C0"/>
                 <w:sz w:val="24"/>
               </w:rPr>
-              <w:t xml:space="preserve"> Child age in completed months </w:t>
-            </w:r>
-            <w:proofErr w:type="gramStart"/>
-            <w:r>
-              <w:rPr>
-                <w:rFonts w:ascii="Times New Roman" w:hAnsi="Times New Roman"/>
-                <w:color w:val="0070C0"/>
-                <w:sz w:val="24"/>
-              </w:rPr>
-              <w:t>has been incorporated</w:t>
-            </w:r>
-            <w:proofErr w:type="gramEnd"/>
-            <w:r>
-              <w:rPr>
-                <w:rFonts w:ascii="Times New Roman" w:hAnsi="Times New Roman"/>
-                <w:color w:val="0070C0"/>
-                <w:sz w:val="24"/>
-              </w:rPr>
-              <w:t xml:space="preserve"> across all descriptive, bivariate, and multilevel models (categorized into: 0–11, 12–23, 24–35, 36–47, and 48–59 months). This resolved a major omission in earlier drafts.</w:t>
+              <w:t xml:space="preserve"> Adding child age improved model fit dramatically (Delta AIC = 49 points for stunting), confirming that chronic stunting surges during the complementary feeding transition (12–23 months: AOR = 2.38; 95% CI: 1.85–3.06).</w:t>
             </w:r>
           </w:p>
           <w:p>
             <w:r>
               <w:rPr>
                 <w:rFonts w:ascii="Times New Roman" w:hAnsi="Times New Roman"/>
-                <w:b/>
                 <w:color w:val="0070C0"/>
                 <w:sz w:val="24"/>
               </w:rPr>
-              <w:t>2. Substantial</w:t>
-            </w:r>
-            <w:r>
-              <w:rPr>
-                <w:rFonts w:ascii="Times New Roman" w:hAnsi="Times New Roman"/>
-                <w:b/>
-                <w:color w:val="0070C0"/>
-                <w:sz w:val="24"/>
-              </w:rPr>
-              <w:t xml:space="preserve"> Model Fit Improvement:</w:t>
-            </w:r>
-            <w:r>
-              <w:rPr>
-                <w:rFonts w:ascii="Times New Roman" w:hAnsi="Times New Roman"/>
-                <w:color w:val="0070C0"/>
-                <w:sz w:val="24"/>
-              </w:rPr>
-              <w:t xml:space="preserve"> Adding child age improved model fit dramatically (Delta AIC = 49 points for stunting), confirming that chronic stunting surges during the complementary feeding transition (12–23 months: AOR = 2.38; 95% CI: 1.85–3.06).</w:t>
-            </w:r>
-          </w:p>
-          <w:p>
-            <w:r>
-              <w:rPr>
-                <w:rFonts w:ascii="Times New Roman" w:hAnsi="Times New Roman"/>
-                <w:color w:val="0070C0"/>
-                <w:sz w:val="24"/>
-              </w:rPr>
-              <w:t>3. Collinearit</w:t>
-            </w:r>
-            <w:r>
-              <w:rPr>
-                <w:rFonts w:ascii="Times New Roman" w:hAnsi="Times New Roman"/>
-                <w:color w:val="0070C0"/>
-                <w:sz w:val="24"/>
-              </w:rPr>
-              <w:t>y Diagnostics &amp; Sensitivity Analysis: Generalized Variance Inflation Factor (GVIF) diagnostics (Table S4) confirmed that multicollinearity is absent across all socioeconomic and environmental assets (all adjusted GVIF</w:t>
-            </w:r>
-            <w:proofErr w:type="gramStart"/>
-            <w:r>
-              <w:rPr>
-                <w:rFonts w:ascii="Times New Roman" w:hAnsi="Times New Roman"/>
-                <w:color w:val="0070C0"/>
-                <w:sz w:val="24"/>
-              </w:rPr>
-              <w:t>^(</w:t>
-            </w:r>
-            <w:proofErr w:type="gramEnd"/>
-            <w:r>
-              <w:rPr>
-                <w:rFonts w:ascii="Times New Roman" w:hAnsi="Times New Roman"/>
-                <w:color w:val="0070C0"/>
-                <w:sz w:val="24"/>
-              </w:rPr>
-              <w:t>1/(2*</w:t>
-            </w:r>
-            <w:proofErr w:type="spellStart"/>
-            <w:r>
-              <w:rPr>
-                <w:rFonts w:ascii="Times New Roman" w:hAnsi="Times New Roman"/>
-                <w:color w:val="0070C0"/>
-                <w:sz w:val="24"/>
-              </w:rPr>
-              <w:t>df</w:t>
-            </w:r>
-            <w:proofErr w:type="spellEnd"/>
-            <w:r>
-              <w:rPr>
-                <w:rFonts w:ascii="Times New Roman" w:hAnsi="Times New Roman"/>
-                <w:color w:val="0070C0"/>
-                <w:sz w:val="24"/>
-              </w:rPr>
-              <w:t>)) &lt; 1.40; raw GVIF &lt; 2.8). Co</w:t>
-            </w:r>
-            <w:r>
-              <w:rPr>
-                <w:rFonts w:ascii="Times New Roman" w:hAnsi="Times New Roman"/>
-                <w:color w:val="0070C0"/>
-                <w:sz w:val="24"/>
-              </w:rPr>
-              <w:t>llinearity was evaluated between children ever born (raw GVIF = 15.11, adjusted GVIF = 3.887) and living children (raw GVIF = 8.98, adjusted GVIF = 2.997). A sensitivity analysis omitting living children confirmed that all model estimates remained robust w</w:t>
-            </w:r>
-            <w:r>
-              <w:rPr>
-                <w:rFonts w:ascii="Times New Roman" w:hAnsi="Times New Roman"/>
-                <w:color w:val="0070C0"/>
-                <w:sz w:val="24"/>
-              </w:rPr>
-              <w:t>ithout altering any conclusions.</w:t>
+              <w:t>3. Collinearity Diagnostics &amp; Sensitivity Analysis: Generalized Variance Inflation Factor (GVIF) diagnostics (Table S4) confirmed that multicollinearity is absent across all socioeconomic and environmental assets (all adjusted GVIF^(1/(2*df)) &lt; 1.40; raw GVIF &lt; 2.8). Collinearity was evaluated between children ever born (raw GVIF = 15.11, adjusted GVIF = 3.887) and living children (raw GVIF = 8.98, adjusted GVIF = 2.997). A sensitivity analysis omitting living children confirmed that all model estimates remained robust without altering any conclusions.</w:t>
             </w:r>
           </w:p>
           <w:p>
@@ -3714,27 +2584,7 @@
                 <w:sz w:val="24"/>
                 <w:szCs w:val="24"/>
               </w:rPr>
-              <w:t xml:space="preserve">Survey design: Please explain how weights, strata, and primary sampling units </w:t>
-            </w:r>
-            <w:proofErr w:type="gramStart"/>
-            <w:r>
-              <w:rPr>
-                <w:rFonts w:ascii="Times New Roman" w:hAnsi="Times New Roman"/>
-                <w:color w:val="000000"/>
-                <w:sz w:val="24"/>
-                <w:szCs w:val="24"/>
-              </w:rPr>
-              <w:t>were handled</w:t>
-            </w:r>
-            <w:proofErr w:type="gramEnd"/>
-            <w:r>
-              <w:rPr>
-                <w:rFonts w:ascii="Times New Roman" w:hAnsi="Times New Roman"/>
-                <w:color w:val="000000"/>
-                <w:sz w:val="24"/>
-                <w:szCs w:val="24"/>
-              </w:rPr>
-              <w:t xml:space="preserve"> in the descriptive and multilevel models.</w:t>
+              <w:t>Survey design: Please explain how weights, strata, and primary sampling units were handled in the descriptive and multilevel models.</w:t>
             </w:r>
           </w:p>
         </w:tc>
@@ -3783,43 +2633,7 @@
                 <w:color w:val="0070C0"/>
                 <w:sz w:val="24"/>
               </w:rPr>
-              <w:t xml:space="preserve">We have expanded Section 2.4 and 2.5: Normalized sampling weights (Weight = V005 / 1,000,000) </w:t>
-            </w:r>
-            <w:proofErr w:type="gramStart"/>
-            <w:r>
-              <w:rPr>
-                <w:rFonts w:ascii="Times New Roman" w:hAnsi="Times New Roman"/>
-                <w:color w:val="0070C0"/>
-                <w:sz w:val="24"/>
-              </w:rPr>
-              <w:t>were incorporated</w:t>
-            </w:r>
-            <w:proofErr w:type="gramEnd"/>
-            <w:r>
-              <w:rPr>
-                <w:rFonts w:ascii="Times New Roman" w:hAnsi="Times New Roman"/>
-                <w:color w:val="0070C0"/>
-                <w:sz w:val="24"/>
-              </w:rPr>
-              <w:t xml:space="preserve"> into all descriptive and bivariate calculations. In multilevel logistic models, PSU clustering is directly modeled via community random intercepts (1 | </w:t>
-            </w:r>
-            <w:proofErr w:type="spellStart"/>
-            <w:r>
-              <w:rPr>
-                <w:rFonts w:ascii="Times New Roman" w:hAnsi="Times New Roman"/>
-                <w:color w:val="0070C0"/>
-                <w:sz w:val="24"/>
-              </w:rPr>
-              <w:t>Cluster_ID</w:t>
-            </w:r>
-            <w:proofErr w:type="spellEnd"/>
-            <w:r>
-              <w:rPr>
-                <w:rFonts w:ascii="Times New Roman" w:hAnsi="Times New Roman"/>
-                <w:color w:val="0070C0"/>
-                <w:sz w:val="24"/>
-              </w:rPr>
-              <w:t>) across 670 clusters, while survey strata (division and residence) are included as fixed-effect covariates in Model III.</w:t>
+              <w:t>We have expanded Section 2.4 and 2.5: Normalized sampling weights (Weight = V005 / 1,000,000) were incorporated into all descriptive and bivariate calculations. In multilevel logistic models, PSU clustering is directly modeled via community random intercepts (1 | Cluster_ID) across 670 clusters, while survey strata (division and residence) are included as fixed-effect covariates in Model III.</w:t>
             </w:r>
           </w:p>
           <w:p>
@@ -3900,17 +2714,7 @@
                 <w:sz w:val="24"/>
                 <w:szCs w:val="24"/>
               </w:rPr>
-              <w:t xml:space="preserve">Multilevel specification: The null-model AIC and log-likelihood values appear to imply that the model is single-level or that the equation needs clarification. </w:t>
-            </w:r>
-            <w:r>
-              <w:rPr>
-                <w:rFonts w:ascii="Times New Roman" w:hAnsi="Times New Roman"/>
-                <w:color w:val="000000"/>
-                <w:sz w:val="24"/>
-                <w:szCs w:val="24"/>
-              </w:rPr>
-              <w:lastRenderedPageBreak/>
-              <w:t>Please ensure the equation accurately reflects the random intercept model.</w:t>
+              <w:t>Multilevel specification: The null-model AIC and log-likelihood values appear to imply that the model is single-level or that the equation needs clarification. Please ensure the equation accurately reflects the random intercept model.</w:t>
             </w:r>
           </w:p>
         </w:tc>
@@ -3960,107 +2764,7 @@
                 <w:color w:val="0070C0"/>
                 <w:sz w:val="24"/>
               </w:rPr>
-              <w:t xml:space="preserve">We thank Reviewer 3 for identifying this. The statistical equation in Section 2.5 has been corrected to explicitly describe the two-level random-intercept model: </w:t>
-            </w:r>
-            <w:proofErr w:type="gramStart"/>
-            <w:r>
-              <w:rPr>
-                <w:rFonts w:ascii="Times New Roman" w:hAnsi="Times New Roman"/>
-                <w:color w:val="0070C0"/>
-                <w:sz w:val="24"/>
-              </w:rPr>
-              <w:t>logit(</w:t>
-            </w:r>
-            <w:proofErr w:type="spellStart"/>
-            <w:proofErr w:type="gramEnd"/>
-            <w:r>
-              <w:rPr>
-                <w:rFonts w:ascii="Times New Roman" w:hAnsi="Times New Roman"/>
-                <w:color w:val="0070C0"/>
-                <w:sz w:val="24"/>
-              </w:rPr>
-              <w:t>p_ij</w:t>
-            </w:r>
-            <w:proofErr w:type="spellEnd"/>
-            <w:r>
-              <w:rPr>
-                <w:rFonts w:ascii="Times New Roman" w:hAnsi="Times New Roman"/>
-                <w:color w:val="0070C0"/>
-                <w:sz w:val="24"/>
-              </w:rPr>
-              <w:t xml:space="preserve">) = beta_0 + </w:t>
-            </w:r>
-            <w:proofErr w:type="spellStart"/>
-            <w:r>
-              <w:rPr>
-                <w:rFonts w:ascii="Times New Roman" w:hAnsi="Times New Roman"/>
-                <w:color w:val="0070C0"/>
-                <w:sz w:val="24"/>
-              </w:rPr>
-              <w:t>X_ij</w:t>
-            </w:r>
-            <w:proofErr w:type="spellEnd"/>
-            <w:r>
-              <w:rPr>
-                <w:rFonts w:ascii="Times New Roman" w:hAnsi="Times New Roman"/>
-                <w:color w:val="0070C0"/>
-                <w:sz w:val="24"/>
-              </w:rPr>
-              <w:t xml:space="preserve"> * beta + </w:t>
-            </w:r>
-            <w:proofErr w:type="spellStart"/>
-            <w:r>
-              <w:rPr>
-                <w:rFonts w:ascii="Times New Roman" w:hAnsi="Times New Roman"/>
-                <w:color w:val="0070C0"/>
-                <w:sz w:val="24"/>
-              </w:rPr>
-              <w:t>u_j</w:t>
-            </w:r>
-            <w:proofErr w:type="spellEnd"/>
-            <w:r>
-              <w:rPr>
-                <w:rFonts w:ascii="Times New Roman" w:hAnsi="Times New Roman"/>
-                <w:color w:val="0070C0"/>
-                <w:sz w:val="24"/>
-              </w:rPr>
-              <w:t xml:space="preserve">, where </w:t>
-            </w:r>
-            <w:proofErr w:type="spellStart"/>
-            <w:r>
-              <w:rPr>
-                <w:rFonts w:ascii="Times New Roman" w:hAnsi="Times New Roman"/>
-                <w:color w:val="0070C0"/>
-                <w:sz w:val="24"/>
-              </w:rPr>
-              <w:t>u_j</w:t>
-            </w:r>
-            <w:proofErr w:type="spellEnd"/>
-            <w:r>
-              <w:rPr>
-                <w:rFonts w:ascii="Times New Roman" w:hAnsi="Times New Roman"/>
-                <w:color w:val="0070C0"/>
-                <w:sz w:val="24"/>
-              </w:rPr>
-              <w:t xml:space="preserve"> ~ N(0, sigma_u^2) across 670 clusters. Single-level null models </w:t>
-            </w:r>
-            <w:proofErr w:type="gramStart"/>
-            <w:r>
-              <w:rPr>
-                <w:rFonts w:ascii="Times New Roman" w:hAnsi="Times New Roman"/>
-                <w:color w:val="0070C0"/>
-                <w:sz w:val="24"/>
-              </w:rPr>
-              <w:t>were also estimated</w:t>
-            </w:r>
-            <w:proofErr w:type="gramEnd"/>
-            <w:r>
-              <w:rPr>
-                <w:rFonts w:ascii="Times New Roman" w:hAnsi="Times New Roman"/>
-                <w:color w:val="0070C0"/>
-                <w:sz w:val="24"/>
-              </w:rPr>
-              <w:t xml:space="preserve"> to perform formal Likelihood Ratio Tests confirming significant clustering for stunting (p &lt; 0.001) and underweight (p &lt; 0.001).</w:t>
+              <w:t>We thank Reviewer 3 for identifying this. The statistical equation in Section 2.5 has been corrected to explicitly describe the two-level random-intercept model: logit(p_ij) = beta_0 + X_ij * beta + u_j, where u_j ~ N(0, sigma_u^2) across 670 clusters. Single-level null models were also estimated to perform formal Likelihood Ratio Tests confirming significant clustering for stunting (p &lt; 0.001) and underweight (p &lt; 0.001).</w:t>
             </w:r>
           </w:p>
           <w:p>
@@ -4081,27 +2785,7 @@
                 <w:color w:val="0070C0"/>
                 <w:sz w:val="24"/>
               </w:rPr>
-              <w:t>Section 2.5 (Page 8, Lines 232–251); Table 3 (Pages 14–17, Lines 352–354)</w:t>
-            </w:r>
-            <w:proofErr w:type="gramStart"/>
-            <w:r>
-              <w:rPr>
-                <w:rFonts w:ascii="Times New Roman" w:hAnsi="Times New Roman"/>
-                <w:i/>
-                <w:color w:val="0070C0"/>
-                <w:sz w:val="24"/>
-              </w:rPr>
-              <w:t>;</w:t>
-            </w:r>
-            <w:proofErr w:type="gramEnd"/>
-            <w:r>
-              <w:rPr>
-                <w:rFonts w:ascii="Times New Roman" w:hAnsi="Times New Roman"/>
-                <w:i/>
-                <w:color w:val="0070C0"/>
-                <w:sz w:val="24"/>
-              </w:rPr>
-              <w:t xml:space="preserve"> Tables S1–S3.</w:t>
+              <w:t>Section 2.5 (Page 8, Lines 232–251); Table 3 (Pages 14–17, Lines 352–354); Tables S1–S3.</w:t>
             </w:r>
           </w:p>
         </w:tc>
@@ -4161,27 +2845,7 @@
                 <w:sz w:val="24"/>
                 <w:szCs w:val="24"/>
               </w:rPr>
-              <w:t xml:space="preserve">Analytical sample and missing data: Please explain how the final sample of 4,087 children </w:t>
-            </w:r>
-            <w:proofErr w:type="gramStart"/>
-            <w:r>
-              <w:rPr>
-                <w:rFonts w:ascii="Times New Roman" w:hAnsi="Times New Roman"/>
-                <w:color w:val="000000"/>
-                <w:sz w:val="24"/>
-                <w:szCs w:val="24"/>
-              </w:rPr>
-              <w:t>was derived</w:t>
-            </w:r>
-            <w:proofErr w:type="gramEnd"/>
-            <w:r>
-              <w:rPr>
-                <w:rFonts w:ascii="Times New Roman" w:hAnsi="Times New Roman"/>
-                <w:color w:val="000000"/>
-                <w:sz w:val="24"/>
-                <w:szCs w:val="24"/>
-              </w:rPr>
-              <w:t xml:space="preserve"> from the total births in the survey.</w:t>
+              <w:t>Analytical sample and missing data: Please explain how the final sample of 4,087 children was derived from the total births in the survey.</w:t>
             </w:r>
           </w:p>
         </w:tc>
@@ -4251,16 +2915,7 @@
                 <w:color w:val="0070C0"/>
                 <w:sz w:val="24"/>
               </w:rPr>
-              <w:t>Section 2.1 (Page 5, Lines 14</w:t>
-            </w:r>
-            <w:r>
-              <w:rPr>
-                <w:rFonts w:ascii="Times New Roman" w:hAnsi="Times New Roman"/>
-                <w:i/>
-                <w:color w:val="0070C0"/>
-                <w:sz w:val="24"/>
-              </w:rPr>
-              <w:t>0–164); Figure 2 (Page 6, Lines 165–167).</w:t>
+              <w:t>Section 2.1 (Page 5, Lines 140–164); Figure 2 (Page 6, Lines 165–167).</w:t>
             </w:r>
           </w:p>
         </w:tc>
@@ -4320,27 +2975,7 @@
                 <w:sz w:val="24"/>
                 <w:szCs w:val="24"/>
               </w:rPr>
-              <w:t xml:space="preserve">Statistical reporting and interpretation: Please check all significance markers against the tables. For example, roof material and TV ownership </w:t>
-            </w:r>
-            <w:proofErr w:type="gramStart"/>
-            <w:r>
-              <w:rPr>
-                <w:rFonts w:ascii="Times New Roman" w:hAnsi="Times New Roman"/>
-                <w:color w:val="000000"/>
-                <w:sz w:val="24"/>
-                <w:szCs w:val="24"/>
-              </w:rPr>
-              <w:t>should be reported</w:t>
-            </w:r>
-            <w:proofErr w:type="gramEnd"/>
-            <w:r>
-              <w:rPr>
-                <w:rFonts w:ascii="Times New Roman" w:hAnsi="Times New Roman"/>
-                <w:color w:val="000000"/>
-                <w:sz w:val="24"/>
-                <w:szCs w:val="24"/>
-              </w:rPr>
-              <w:t xml:space="preserve"> accurately according to the model results.</w:t>
+              <w:t>Statistical reporting and interpretation: Please check all significance markers against the tables. For example, roof material and TV ownership should be reported accurately according to the model results.</w:t>
             </w:r>
           </w:p>
         </w:tc>
@@ -4410,16 +3045,7 @@
                 <w:color w:val="0070C0"/>
                 <w:sz w:val="24"/>
               </w:rPr>
-              <w:t xml:space="preserve">Table 2 (Page 12, Lines 298–300); Table 3 (Pages 14–17, Lines 352–354); Section 3.3 (Pages 13–14, Lines 301–314); </w:t>
-            </w:r>
-            <w:r>
-              <w:rPr>
-                <w:rFonts w:ascii="Times New Roman" w:hAnsi="Times New Roman"/>
-                <w:i/>
-                <w:color w:val="0070C0"/>
-                <w:sz w:val="24"/>
-              </w:rPr>
-              <w:t>Section 4 (Pages 17–20, Lines 355–454).</w:t>
+              <w:t>Table 2 (Page 12, Lines 298–300); Table 3 (Pages 14–17, Lines 352–354); Section 3.3 (Pages 13–14, Lines 301–314); Section 4 (Pages 17–20, Lines 355–454).</w:t>
             </w:r>
           </w:p>
         </w:tc>
@@ -4514,39 +3140,16 @@
             <w:tcW w:w="7416" w:type="dxa"/>
           </w:tcPr>
           <w:p>
-            <w:pPr>
-              <w:spacing w:after="60"/>
-              <w:jc w:val="both"/>
-              <w:rPr>
-                <w:sz w:val="24"/>
-                <w:szCs w:val="24"/>
-              </w:rPr>
-            </w:pPr>
-            <w:r>
-              <w:rPr>
-                <w:rFonts w:ascii="Times New Roman" w:hAnsi="Times New Roman"/>
+            <w:r/>
+            <w:r>
+              <w:rPr>
+                <w:rFonts w:ascii="Times New Roman" w:hAnsi="Times New Roman"/>
+                <w:b w:val="0"/>
+                <w:i w:val="0"/>
                 <w:color w:val="0070C0"/>
                 <w:sz w:val="24"/>
               </w:rPr>
-              <w:t xml:space="preserve">We have distinguished our contribution from Rashid et al. (2026) and </w:t>
-            </w:r>
-            <w:proofErr w:type="spellStart"/>
-            <w:r>
-              <w:rPr>
-                <w:rFonts w:ascii="Times New Roman" w:hAnsi="Times New Roman"/>
-                <w:color w:val="0070C0"/>
-                <w:sz w:val="24"/>
-              </w:rPr>
-              <w:t>Tamanna</w:t>
-            </w:r>
-            <w:proofErr w:type="spellEnd"/>
-            <w:r>
-              <w:rPr>
-                <w:rFonts w:ascii="Times New Roman" w:hAnsi="Times New Roman"/>
-                <w:color w:val="0070C0"/>
-                <w:sz w:val="24"/>
-              </w:rPr>
-              <w:t xml:space="preserve"> et al. (2025) in the Introduction and Discussion, adopted strictly non-causal language throughout, and aligned our policy implications to proportionate public health strategies.</w:t>
+              <w:t>We have distinguished our contribution from Rashid et al. (2026 [26]) and Tamanna et al. (2025 [25]) in the Introduction and Discussion, adopted strictly non-causal language throughout, and aligned our policy implications to proportionate public health strategies.</w:t>
             </w:r>
           </w:p>
           <w:p>
@@ -4563,6 +3166,7 @@
             <w:r>
               <w:rPr>
                 <w:rFonts w:ascii="Times New Roman" w:hAnsi="Times New Roman"/>
+                <w:b w:val="0"/>
                 <w:i/>
                 <w:color w:val="0070C0"/>
                 <w:sz w:val="24"/>
@@ -4608,7 +3212,6 @@
                 <w:sz w:val="24"/>
                 <w:szCs w:val="24"/>
               </w:rPr>
-              <w:lastRenderedPageBreak/>
               <w:t>Reviewer 3 Comments (Minor Revisions)</w:t>
             </w:r>
           </w:p>
@@ -4635,6 +3238,7 @@
                 <w:sz w:val="24"/>
                 <w:szCs w:val="24"/>
               </w:rPr>
+              <w:lastRenderedPageBreak/>
               <w:t>Comment 1:</w:t>
             </w:r>
           </w:p>
@@ -4739,36 +3343,7 @@
                 <w:color w:val="0070C0"/>
                 <w:sz w:val="24"/>
               </w:rPr>
-              <w:t>Table 1 (Pages 9–11, Line 281)</w:t>
-            </w:r>
-            <w:proofErr w:type="gramStart"/>
-            <w:r>
-              <w:rPr>
-                <w:rFonts w:ascii="Times New Roman" w:hAnsi="Times New Roman"/>
-                <w:i/>
-                <w:color w:val="0070C0"/>
-                <w:sz w:val="24"/>
-              </w:rPr>
-              <w:t>;</w:t>
-            </w:r>
-            <w:proofErr w:type="gramEnd"/>
-            <w:r>
-              <w:rPr>
-                <w:rFonts w:ascii="Times New Roman" w:hAnsi="Times New Roman"/>
-                <w:i/>
-                <w:color w:val="0070C0"/>
-                <w:sz w:val="24"/>
-              </w:rPr>
-              <w:t xml:space="preserve"> Table 2 (Page 12, Lines 298–3</w:t>
-            </w:r>
-            <w:r>
-              <w:rPr>
-                <w:rFonts w:ascii="Times New Roman" w:hAnsi="Times New Roman"/>
-                <w:i/>
-                <w:color w:val="0070C0"/>
-                <w:sz w:val="24"/>
-              </w:rPr>
-              <w:t>00).</w:t>
+              <w:t>Table 1 (Pages 9–11, Line 281); Table 2 (Page 12, Lines 298–300).</w:t>
             </w:r>
           </w:p>
         </w:tc>
@@ -4877,25 +3452,7 @@
                 <w:color w:val="0070C0"/>
                 <w:sz w:val="24"/>
               </w:rPr>
-              <w:t xml:space="preserve">All comparisons </w:t>
-            </w:r>
-            <w:proofErr w:type="gramStart"/>
-            <w:r>
-              <w:rPr>
-                <w:rFonts w:ascii="Times New Roman" w:hAnsi="Times New Roman"/>
-                <w:color w:val="0070C0"/>
-                <w:sz w:val="24"/>
-              </w:rPr>
-              <w:t>have been corrected</w:t>
-            </w:r>
-            <w:proofErr w:type="gramEnd"/>
-            <w:r>
-              <w:rPr>
-                <w:rFonts w:ascii="Times New Roman" w:hAnsi="Times New Roman"/>
-                <w:color w:val="0070C0"/>
-                <w:sz w:val="24"/>
-              </w:rPr>
-              <w:t xml:space="preserve"> to strictly reference the designated baseline group (e.g., maternal age ≥40 is compared to 15–19 years).</w:t>
+              <w:t>All comparisons have been corrected to strictly reference the designated baseline group (e.g., maternal age ≥40 is compared to 15–19 years).</w:t>
             </w:r>
           </w:p>
           <w:p>
@@ -5155,61 +3712,7 @@
                 <w:color w:val="0070C0"/>
                 <w:sz w:val="24"/>
               </w:rPr>
-              <w:t xml:space="preserve">All citations and references </w:t>
-            </w:r>
-            <w:proofErr w:type="gramStart"/>
-            <w:r>
-              <w:rPr>
-                <w:rFonts w:ascii="Times New Roman" w:hAnsi="Times New Roman"/>
-                <w:color w:val="0070C0"/>
-                <w:sz w:val="24"/>
-              </w:rPr>
-              <w:t>have been thoroughly verified and restructured into a complete 37-reference Vancouver list</w:t>
-            </w:r>
-            <w:proofErr w:type="gramEnd"/>
-            <w:r>
-              <w:rPr>
-                <w:rFonts w:ascii="Times New Roman" w:hAnsi="Times New Roman"/>
-                <w:color w:val="0070C0"/>
-                <w:sz w:val="24"/>
-              </w:rPr>
-              <w:t xml:space="preserve">. The accidental duplicate entry of </w:t>
-            </w:r>
-            <w:proofErr w:type="spellStart"/>
-            <w:r>
-              <w:rPr>
-                <w:rFonts w:ascii="Times New Roman" w:hAnsi="Times New Roman"/>
-                <w:color w:val="0070C0"/>
-                <w:sz w:val="24"/>
-              </w:rPr>
-              <w:t>Saha</w:t>
-            </w:r>
-            <w:proofErr w:type="spellEnd"/>
-            <w:r>
-              <w:rPr>
-                <w:rFonts w:ascii="Times New Roman" w:hAnsi="Times New Roman"/>
-                <w:color w:val="0070C0"/>
-                <w:sz w:val="24"/>
-              </w:rPr>
-              <w:t xml:space="preserve"> et al. </w:t>
-            </w:r>
-            <w:proofErr w:type="gramStart"/>
-            <w:r>
-              <w:rPr>
-                <w:rFonts w:ascii="Times New Roman" w:hAnsi="Times New Roman"/>
-                <w:color w:val="0070C0"/>
-                <w:sz w:val="24"/>
-              </w:rPr>
-              <w:t>was removed</w:t>
-            </w:r>
-            <w:proofErr w:type="gramEnd"/>
-            <w:r>
-              <w:rPr>
-                <w:rFonts w:ascii="Times New Roman" w:hAnsi="Times New Roman"/>
-                <w:color w:val="0070C0"/>
-                <w:sz w:val="24"/>
-              </w:rPr>
-              <w:t>, and newly required literature (Rashid et al. 2026, Carle 2009, STROBE statement) was integrated with 1-to-1 sequential in-text matching.</w:t>
+              <w:t>All citations and references have been thoroughly verified and restructured into a complete 37-reference Vancouver list. The accidental duplicate entry of Saha et al. was removed, and newly required literature (Rashid et al. 2026, Carle 2009, STROBE statement) was integrated with 1-to-1 sequential in-text matching.</w:t>
             </w:r>
           </w:p>
           <w:p>
@@ -17153,7 +15656,7 @@
 </file>
 
 <file path=customXml/itemProps1.xml><?xml version="1.0" encoding="utf-8"?>
-<ds:datastoreItem xmlns:ds="http://schemas.openxmlformats.org/officeDocument/2006/customXml" ds:itemID="{6470133C-0DFF-41C6-8612-154789A3A66D}">
+<ds:datastoreItem xmlns:ds="http://schemas.openxmlformats.org/officeDocument/2006/customXml" ds:itemID="{03D1E9EE-93F3-43E1-B61E-6C13F124B63A}">
   <ds:schemaRefs>
     <ds:schemaRef ds:uri="http://schemas.openxmlformats.org/officeDocument/2006/bibliography"/>
   </ds:schemaRefs>

</xml_diff>